<commit_message>
Correct timing resolution floor: 1500-2000us was spike-dominated; true floor is ~75us
The quoted calibration timing floor of 1,500-2,000 µs was dominated by
isolated spike intervals caused by firmware interrupt deferral during I²C
callbacks (~1.4% of all sync intervals). Excluding those spikes, the true
per-Nano RMS is 0.005-0.164 ms and the combined floor is ~75 µs.

Corrections applied to:
- muon_technical_report_v2.docx: Section 4.1 body text, Figure 6 caption
  and image alt-text, body paragraph after Figure 6, Conclusions bullet
- analysis_guide.md: Plot B and C descriptions, Plot D note, key numbers
  table (added spike-excluded RMS row), Limitations note on timing resolution

The 1 ms coincidence window remains well-justified by the corrected figures.
The spike intervals are handled by the jump veto. Firmware v2 eliminates the
interrupt deferral entirely.
</commit_message>
<xml_diff>
--- a/muon_technical_report_v2.docx
+++ b/muon_technical_report_v2.docx
@@ -45,9 +45,14 @@
           <w:sz w:val="24"/>
           <w:szCs w:val="24"/>
         </w:rPr>
-        <w:t xml:space="preserve">Clock </w:t>
-      </w:r>
-      <w:proofErr w:type="spellStart"/>
+        <w:t>Clock Synchronisation, Calibration, Coincidence Statistics,</w:t>
+      </w:r>
+    </w:p>
+    <w:p>
+      <w:pPr>
+        <w:spacing w:after="600"/>
+        <w:jc w:val="center"/>
+      </w:pPr>
       <w:r>
         <w:rPr>
           <w:i/>
@@ -56,33 +61,6 @@
           <w:sz w:val="24"/>
           <w:szCs w:val="24"/>
         </w:rPr>
-        <w:t>Synchronisation</w:t>
-      </w:r>
-      <w:proofErr w:type="spellEnd"/>
-      <w:r>
-        <w:rPr>
-          <w:i/>
-          <w:iCs/>
-          <w:color w:val="555555"/>
-          <w:sz w:val="24"/>
-          <w:szCs w:val="24"/>
-        </w:rPr>
-        <w:t>, Calibration, Coincidence Statistics,</w:t>
-      </w:r>
-    </w:p>
-    <w:p>
-      <w:pPr>
-        <w:spacing w:after="600"/>
-        <w:jc w:val="center"/>
-      </w:pPr>
-      <w:r>
-        <w:rPr>
-          <w:i/>
-          <w:iCs/>
-          <w:color w:val="555555"/>
-          <w:sz w:val="24"/>
-          <w:szCs w:val="24"/>
-        </w:rPr>
         <w:t>Confidence Estimation, and Analysis Narrative</w:t>
       </w:r>
     </w:p>
@@ -125,63 +103,57 @@
       <w:r>
         <w:t xml:space="preserve">The detector array consists of eight Arduino Nano microcontrollers (follower nodes) each coupled to a plastic scintillator and photomultiplier tube, plus a single Arduino Uno (master node). When a charged particle traverses a scintillator, the resulting analogue pulse triggers a hardware interrupt on the corresponding Nano via pin 2 (FALLING edge), which records the arrival time using the Nano's own </w:t>
       </w:r>
-      <w:proofErr w:type="gramStart"/>
       <w:r>
         <w:rPr>
           <w:rFonts w:ascii="Courier New" w:eastAsia="Courier New" w:hAnsi="Courier New" w:cs="Courier New"/>
           <w:sz w:val="20"/>
           <w:szCs w:val="20"/>
         </w:rPr>
-        <w:t>micros(</w:t>
-      </w:r>
-      <w:proofErr w:type="gramEnd"/>
+        <w:t>micros()</w:t>
+      </w:r>
+      <w:r>
+        <w:t xml:space="preserve"> counter and sets a flag. Periodically, the Uno asserts a synchronisation pulse on a shared digital line (pin 6), which all eight Nanos detect simultaneously via their pin 3 interrupts (RISING edge); each Nano records its own </w:t>
+      </w:r>
       <w:r>
         <w:rPr>
           <w:rFonts w:ascii="Courier New" w:eastAsia="Courier New" w:hAnsi="Courier New" w:cs="Courier New"/>
           <w:sz w:val="20"/>
           <w:szCs w:val="20"/>
         </w:rPr>
-        <w:t>)</w:t>
-      </w:r>
-      <w:r>
-        <w:t xml:space="preserve"> counter and sets a flag. Periodically, the Uno asserts a </w:t>
-      </w:r>
-      <w:proofErr w:type="spellStart"/>
-      <w:r>
-        <w:t>synchronisation</w:t>
-      </w:r>
-      <w:proofErr w:type="spellEnd"/>
-      <w:r>
-        <w:t xml:space="preserve"> pulse on a shared digital line (pin 6), which all eight Nanos detect simultaneously via their pin 3 interrupts (RISING edge); each Nano records its own </w:t>
-      </w:r>
-      <w:proofErr w:type="gramStart"/>
+        <w:t>micros()</w:t>
+      </w:r>
+      <w:r>
+        <w:t xml:space="preserve"> value at that moment as a sync timestamp (ST). The Uno then polls each Nano in turn over I²C to retrieve whichever event — particle pulse (PT) or sync event (ST) — is waiting in that Nano's output register.</w:t>
+      </w:r>
+    </w:p>
+    <w:p>
+      <w:pPr>
+        <w:spacing w:after="160"/>
+      </w:pPr>
+      <w:r>
+        <w:t xml:space="preserve">All events are logged to a CSV file in the format </w:t>
+      </w:r>
       <w:r>
         <w:rPr>
           <w:rFonts w:ascii="Courier New" w:eastAsia="Courier New" w:hAnsi="Courier New" w:cs="Courier New"/>
           <w:sz w:val="20"/>
           <w:szCs w:val="20"/>
         </w:rPr>
-        <w:t>micros(</w:t>
-      </w:r>
-      <w:proofErr w:type="gramEnd"/>
+        <w:t>&lt;nano_id&gt;,PT,&lt;timestamp_us&gt;</w:t>
+      </w:r>
+      <w:r>
+        <w:t xml:space="preserve"> or </w:t>
+      </w:r>
       <w:r>
         <w:rPr>
           <w:rFonts w:ascii="Courier New" w:eastAsia="Courier New" w:hAnsi="Courier New" w:cs="Courier New"/>
           <w:sz w:val="20"/>
           <w:szCs w:val="20"/>
         </w:rPr>
-        <w:t>)</w:t>
-      </w:r>
-      <w:r>
-        <w:t xml:space="preserve"> value at that moment as a sync timestamp (ST). The Uno then polls each Nano in turn over I²C to retrieve whichever event — particle pulse (PT) or sync event (ST) — is waiting in that Nano's output register.</w:t>
-      </w:r>
-    </w:p>
-    <w:p>
-      <w:pPr>
-        <w:spacing w:after="160"/>
-      </w:pPr>
-      <w:r>
-        <w:t xml:space="preserve">All events are logged to a CSV file in the format </w:t>
+        <w:t>&lt;nano_id&gt;,ST,&lt;timestamp_us&gt;</w:t>
+      </w:r>
+      <w:r>
+        <w:t xml:space="preserve">, together with </w:t>
       </w:r>
       <w:r>
         <w:rPr>
@@ -189,168 +161,48 @@
           <w:sz w:val="20"/>
           <w:szCs w:val="20"/>
         </w:rPr>
-        <w:t>&lt;</w:t>
-      </w:r>
-      <w:proofErr w:type="spellStart"/>
+        <w:t>MasterStart</w:t>
+      </w:r>
+      <w:r>
+        <w:t xml:space="preserve"> and </w:t>
+      </w:r>
       <w:r>
         <w:rPr>
           <w:rFonts w:ascii="Courier New" w:eastAsia="Courier New" w:hAnsi="Courier New" w:cs="Courier New"/>
           <w:sz w:val="20"/>
           <w:szCs w:val="20"/>
         </w:rPr>
-        <w:t>nano_id</w:t>
-      </w:r>
-      <w:proofErr w:type="spellEnd"/>
-      <w:proofErr w:type="gramStart"/>
+        <w:t>MasterSync</w:t>
+      </w:r>
+      <w:r>
+        <w:t xml:space="preserve"> entries recorded by the Uno itself. The central challenge of the analysis is that every Nano runs on its own independent 16 MHz crystal oscillator. These oscillators drift relative to one another at rates of up to approximately 1 260 ppm, accumulating offsets of several seconds over the ~60-minute run. Before coincidence counting is meaningful, all timestamps must be projected onto a single shared time axis.</w:t>
+      </w:r>
+    </w:p>
+    <w:p>
+      <w:pPr>
+        <w:pStyle w:val="Heading1"/>
+      </w:pPr>
+      <w:r>
+        <w:t>2. Sources of Jitter in the Master–Nano Sync Relationship</w:t>
+      </w:r>
+    </w:p>
+    <w:p>
+      <w:pPr>
+        <w:spacing w:after="160"/>
+      </w:pPr>
+      <w:r>
+        <w:t xml:space="preserve">At first glance the master Uno appears to have all the information needed to calibrate each Nano: it issues a sync pulse, knows its own </w:t>
+      </w:r>
       <w:r>
         <w:rPr>
           <w:rFonts w:ascii="Courier New" w:eastAsia="Courier New" w:hAnsi="Courier New" w:cs="Courier New"/>
           <w:sz w:val="20"/>
           <w:szCs w:val="20"/>
         </w:rPr>
-        <w:t>&gt;,PT</w:t>
-      </w:r>
-      <w:proofErr w:type="gramEnd"/>
-      <w:r>
-        <w:rPr>
-          <w:rFonts w:ascii="Courier New" w:eastAsia="Courier New" w:hAnsi="Courier New" w:cs="Courier New"/>
-          <w:sz w:val="20"/>
-          <w:szCs w:val="20"/>
-        </w:rPr>
-        <w:t>,&lt;</w:t>
-      </w:r>
-      <w:proofErr w:type="spellStart"/>
-      <w:r>
-        <w:rPr>
-          <w:rFonts w:ascii="Courier New" w:eastAsia="Courier New" w:hAnsi="Courier New" w:cs="Courier New"/>
-          <w:sz w:val="20"/>
-          <w:szCs w:val="20"/>
-        </w:rPr>
-        <w:t>timestamp_us</w:t>
-      </w:r>
-      <w:proofErr w:type="spellEnd"/>
-      <w:r>
-        <w:rPr>
-          <w:rFonts w:ascii="Courier New" w:eastAsia="Courier New" w:hAnsi="Courier New" w:cs="Courier New"/>
-          <w:sz w:val="20"/>
-          <w:szCs w:val="20"/>
-        </w:rPr>
-        <w:t>&gt;</w:t>
-      </w:r>
-      <w:r>
-        <w:t xml:space="preserve"> or </w:t>
-      </w:r>
-      <w:r>
-        <w:rPr>
-          <w:rFonts w:ascii="Courier New" w:eastAsia="Courier New" w:hAnsi="Courier New" w:cs="Courier New"/>
-          <w:sz w:val="20"/>
-          <w:szCs w:val="20"/>
-        </w:rPr>
-        <w:t>&lt;</w:t>
-      </w:r>
-      <w:proofErr w:type="spellStart"/>
-      <w:r>
-        <w:rPr>
-          <w:rFonts w:ascii="Courier New" w:eastAsia="Courier New" w:hAnsi="Courier New" w:cs="Courier New"/>
-          <w:sz w:val="20"/>
-          <w:szCs w:val="20"/>
-        </w:rPr>
-        <w:t>nano_id</w:t>
-      </w:r>
-      <w:proofErr w:type="spellEnd"/>
-      <w:r>
-        <w:rPr>
-          <w:rFonts w:ascii="Courier New" w:eastAsia="Courier New" w:hAnsi="Courier New" w:cs="Courier New"/>
-          <w:sz w:val="20"/>
-          <w:szCs w:val="20"/>
-        </w:rPr>
-        <w:t>&gt;,ST,&lt;</w:t>
-      </w:r>
-      <w:proofErr w:type="spellStart"/>
-      <w:r>
-        <w:rPr>
-          <w:rFonts w:ascii="Courier New" w:eastAsia="Courier New" w:hAnsi="Courier New" w:cs="Courier New"/>
-          <w:sz w:val="20"/>
-          <w:szCs w:val="20"/>
-        </w:rPr>
-        <w:t>timestamp_us</w:t>
-      </w:r>
-      <w:proofErr w:type="spellEnd"/>
-      <w:r>
-        <w:rPr>
-          <w:rFonts w:ascii="Courier New" w:eastAsia="Courier New" w:hAnsi="Courier New" w:cs="Courier New"/>
-          <w:sz w:val="20"/>
-          <w:szCs w:val="20"/>
-        </w:rPr>
-        <w:t>&gt;</w:t>
-      </w:r>
-      <w:r>
-        <w:t xml:space="preserve">, together with </w:t>
-      </w:r>
-      <w:proofErr w:type="spellStart"/>
-      <w:r>
-        <w:rPr>
-          <w:rFonts w:ascii="Courier New" w:eastAsia="Courier New" w:hAnsi="Courier New" w:cs="Courier New"/>
-          <w:sz w:val="20"/>
-          <w:szCs w:val="20"/>
-        </w:rPr>
-        <w:t>MasterStart</w:t>
-      </w:r>
-      <w:proofErr w:type="spellEnd"/>
-      <w:r>
-        <w:t xml:space="preserve"> and </w:t>
-      </w:r>
-      <w:proofErr w:type="spellStart"/>
-      <w:r>
-        <w:rPr>
-          <w:rFonts w:ascii="Courier New" w:eastAsia="Courier New" w:hAnsi="Courier New" w:cs="Courier New"/>
-          <w:sz w:val="20"/>
-          <w:szCs w:val="20"/>
-        </w:rPr>
-        <w:t>MasterSync</w:t>
-      </w:r>
-      <w:proofErr w:type="spellEnd"/>
-      <w:r>
-        <w:t xml:space="preserve"> entries recorded by the Uno itself. The central challenge of the analysis is that every Nano runs on its own independent 16 MHz crystal oscillator. These oscillators drift relative to one another at rates of up to approximately 1 260 ppm, accumulating offsets of several seconds over the ~60-minute run. Before coincidence counting is meaningful, all timestamps must be projected onto a single shared time axis.</w:t>
-      </w:r>
-    </w:p>
-    <w:p>
-      <w:pPr>
-        <w:pStyle w:val="Heading1"/>
-      </w:pPr>
-      <w:r>
-        <w:t>2. Sources of Jitter in the Master–Nano Sync Relationship</w:t>
-      </w:r>
-    </w:p>
-    <w:p>
-      <w:pPr>
-        <w:spacing w:after="160"/>
-      </w:pPr>
-      <w:r>
-        <w:t xml:space="preserve">At first glance the master Uno appears to have all the information needed to calibrate each Nano: it issues a sync pulse, knows its own </w:t>
-      </w:r>
-      <w:proofErr w:type="gramStart"/>
-      <w:r>
-        <w:rPr>
-          <w:rFonts w:ascii="Courier New" w:eastAsia="Courier New" w:hAnsi="Courier New" w:cs="Courier New"/>
-          <w:sz w:val="20"/>
-          <w:szCs w:val="20"/>
-        </w:rPr>
-        <w:t>micros(</w:t>
-      </w:r>
-      <w:proofErr w:type="gramEnd"/>
-      <w:r>
-        <w:rPr>
-          <w:rFonts w:ascii="Courier New" w:eastAsia="Courier New" w:hAnsi="Courier New" w:cs="Courier New"/>
-          <w:sz w:val="20"/>
-          <w:szCs w:val="20"/>
-        </w:rPr>
-        <w:t>)</w:t>
+        <w:t>micros()</w:t>
       </w:r>
       <w:r>
         <w:t xml:space="preserve"> value at that moment, and subsequently retrieves from each Nano the timestamp at which the pulse arrived. The difference should, in principle, equal the clock </w:t>
-      </w:r>
-      <w:r>
         <w:lastRenderedPageBreak/>
         <w:t>offset of that Nano relative to the master. In practice, three distinct mechanisms corrupt this relationship.</w:t>
       </w:r>
@@ -359,13 +211,8 @@
       <w:pPr>
         <w:pStyle w:val="Heading2"/>
       </w:pPr>
-      <w:proofErr w:type="gramStart"/>
-      <w:r>
-        <w:t>2.1  The</w:t>
-      </w:r>
-      <w:proofErr w:type="gramEnd"/>
-      <w:r>
-        <w:t xml:space="preserve"> Master's Recorded Send Time Is Not the Pulse Time</w:t>
+      <w:r>
+        <w:t>2.1  The Master's Recorded Send Time Is Not the Pulse Time</w:t>
       </w:r>
     </w:p>
     <w:p>
@@ -392,147 +239,7 @@
           <w:sz w:val="18"/>
           <w:szCs w:val="18"/>
         </w:rPr>
-        <w:t xml:space="preserve">// In </w:t>
-      </w:r>
-      <w:proofErr w:type="gramStart"/>
-      <w:r>
-        <w:rPr>
-          <w:rFonts w:ascii="Courier New" w:eastAsia="Courier New" w:hAnsi="Courier New" w:cs="Courier New"/>
-          <w:color w:val="333333"/>
-          <w:sz w:val="18"/>
-          <w:szCs w:val="18"/>
-        </w:rPr>
-        <w:t>loop(</w:t>
-      </w:r>
-      <w:proofErr w:type="gramEnd"/>
-      <w:r>
-        <w:rPr>
-          <w:rFonts w:ascii="Courier New" w:eastAsia="Courier New" w:hAnsi="Courier New" w:cs="Courier New"/>
-          <w:color w:val="333333"/>
-          <w:sz w:val="18"/>
-          <w:szCs w:val="18"/>
-        </w:rPr>
-        <w:t xml:space="preserve">): unsigned long now = micros();           // (a) 'now' sampled here ... </w:t>
-      </w:r>
-      <w:proofErr w:type="spellStart"/>
-      <w:r>
-        <w:rPr>
-          <w:rFonts w:ascii="Courier New" w:eastAsia="Courier New" w:hAnsi="Courier New" w:cs="Courier New"/>
-          <w:color w:val="333333"/>
-          <w:sz w:val="18"/>
-          <w:szCs w:val="18"/>
-        </w:rPr>
-        <w:t>sendSyncPulse</w:t>
-      </w:r>
-      <w:proofErr w:type="spellEnd"/>
-      <w:r>
-        <w:rPr>
-          <w:rFonts w:ascii="Courier New" w:eastAsia="Courier New" w:hAnsi="Courier New" w:cs="Courier New"/>
-          <w:color w:val="333333"/>
-          <w:sz w:val="18"/>
-          <w:szCs w:val="18"/>
-        </w:rPr>
-        <w:t xml:space="preserve">();                        // (b) pin goes HIGH inside here ... </w:t>
-      </w:r>
-      <w:proofErr w:type="spellStart"/>
-      <w:r>
-        <w:rPr>
-          <w:rFonts w:ascii="Courier New" w:eastAsia="Courier New" w:hAnsi="Courier New" w:cs="Courier New"/>
-          <w:color w:val="333333"/>
-          <w:sz w:val="18"/>
-          <w:szCs w:val="18"/>
-        </w:rPr>
-        <w:t>lastSyncTime</w:t>
-      </w:r>
-      <w:proofErr w:type="spellEnd"/>
-      <w:r>
-        <w:rPr>
-          <w:rFonts w:ascii="Courier New" w:eastAsia="Courier New" w:hAnsi="Courier New" w:cs="Courier New"/>
-          <w:color w:val="333333"/>
-          <w:sz w:val="18"/>
-          <w:szCs w:val="18"/>
-        </w:rPr>
-        <w:t xml:space="preserve"> = now;                     // (c) 'now' stored as the sync time  // Inside </w:t>
-      </w:r>
-      <w:proofErr w:type="spellStart"/>
-      <w:r>
-        <w:rPr>
-          <w:rFonts w:ascii="Courier New" w:eastAsia="Courier New" w:hAnsi="Courier New" w:cs="Courier New"/>
-          <w:color w:val="333333"/>
-          <w:sz w:val="18"/>
-          <w:szCs w:val="18"/>
-        </w:rPr>
-        <w:t>sendSyncPulse</w:t>
-      </w:r>
-      <w:proofErr w:type="spellEnd"/>
-      <w:r>
-        <w:rPr>
-          <w:rFonts w:ascii="Courier New" w:eastAsia="Courier New" w:hAnsi="Courier New" w:cs="Courier New"/>
-          <w:color w:val="333333"/>
-          <w:sz w:val="18"/>
-          <w:szCs w:val="18"/>
-        </w:rPr>
-        <w:t xml:space="preserve">(): </w:t>
-      </w:r>
-      <w:proofErr w:type="spellStart"/>
-      <w:r>
-        <w:rPr>
-          <w:rFonts w:ascii="Courier New" w:eastAsia="Courier New" w:hAnsi="Courier New" w:cs="Courier New"/>
-          <w:color w:val="333333"/>
-          <w:sz w:val="18"/>
-          <w:szCs w:val="18"/>
-        </w:rPr>
-        <w:t>digitalWrite</w:t>
-      </w:r>
-      <w:proofErr w:type="spellEnd"/>
-      <w:r>
-        <w:rPr>
-          <w:rFonts w:ascii="Courier New" w:eastAsia="Courier New" w:hAnsi="Courier New" w:cs="Courier New"/>
-          <w:color w:val="333333"/>
-          <w:sz w:val="18"/>
-          <w:szCs w:val="18"/>
-        </w:rPr>
-        <w:t xml:space="preserve">(SYNC_PIN, HIGH);           // RISING edge fires here delay(10);                              // holds pin HIGH for 10 </w:t>
-      </w:r>
-      <w:proofErr w:type="spellStart"/>
-      <w:r>
-        <w:rPr>
-          <w:rFonts w:ascii="Courier New" w:eastAsia="Courier New" w:hAnsi="Courier New" w:cs="Courier New"/>
-          <w:color w:val="333333"/>
-          <w:sz w:val="18"/>
-          <w:szCs w:val="18"/>
-        </w:rPr>
-        <w:t>ms</w:t>
-      </w:r>
-      <w:proofErr w:type="spellEnd"/>
-      <w:r>
-        <w:rPr>
-          <w:rFonts w:ascii="Courier New" w:eastAsia="Courier New" w:hAnsi="Courier New" w:cs="Courier New"/>
-          <w:color w:val="333333"/>
-          <w:sz w:val="18"/>
-          <w:szCs w:val="18"/>
-        </w:rPr>
-        <w:t xml:space="preserve"> </w:t>
-      </w:r>
-      <w:proofErr w:type="spellStart"/>
-      <w:r>
-        <w:rPr>
-          <w:rFonts w:ascii="Courier New" w:eastAsia="Courier New" w:hAnsi="Courier New" w:cs="Courier New"/>
-          <w:color w:val="333333"/>
-          <w:sz w:val="18"/>
-          <w:szCs w:val="18"/>
-        </w:rPr>
-        <w:t>digitalWrite</w:t>
-      </w:r>
-      <w:proofErr w:type="spellEnd"/>
-      <w:r>
-        <w:rPr>
-          <w:rFonts w:ascii="Courier New" w:eastAsia="Courier New" w:hAnsi="Courier New" w:cs="Courier New"/>
-          <w:color w:val="333333"/>
-          <w:sz w:val="18"/>
-          <w:szCs w:val="18"/>
-        </w:rPr>
-        <w:t>(SYNC_PIN, LOW);</w:t>
+        <w:t>// In loop(): unsigned long now = micros();           // (a) 'now' sampled here ... sendSyncPulse();                        // (b) pin goes HIGH inside here ... lastSyncTime = now;                     // (c) 'now' stored as the sync time  // Inside sendSyncPulse(): digitalWrite(SYNC_PIN, HIGH);           // RISING edge fires here delay(10);                              // holds pin HIGH for 10 ms digitalWrite(SYNC_PIN, LOW);</w:t>
       </w:r>
     </w:p>
     <w:p>
@@ -563,177 +270,86 @@
       <w:r>
         <w:t xml:space="preserve"> </w:t>
       </w:r>
-      <w:proofErr w:type="spellStart"/>
-      <w:proofErr w:type="gramStart"/>
       <w:r>
         <w:rPr>
           <w:rFonts w:ascii="Courier New" w:eastAsia="Courier New" w:hAnsi="Courier New" w:cs="Courier New"/>
           <w:sz w:val="20"/>
           <w:szCs w:val="20"/>
         </w:rPr>
-        <w:t>sendSyncPulse</w:t>
-      </w:r>
-      <w:proofErr w:type="spellEnd"/>
+        <w:t>sendSyncPulse()</w:t>
+      </w:r>
+      <w:r>
+        <w:t xml:space="preserve"> is called. Inside that function, </w:t>
+      </w:r>
       <w:r>
         <w:rPr>
           <w:rFonts w:ascii="Courier New" w:eastAsia="Courier New" w:hAnsi="Courier New" w:cs="Courier New"/>
           <w:sz w:val="20"/>
           <w:szCs w:val="20"/>
         </w:rPr>
-        <w:t>(</w:t>
-      </w:r>
-      <w:proofErr w:type="gramEnd"/>
+        <w:t>digitalWrite(SYNC_PIN, HIGH)</w:t>
+      </w:r>
+      <w:r>
+        <w:t xml:space="preserve"> executes almost immediately — the pin goes HIGH after only a few microseconds of function-call and stack-frame overhead. The Nanos fire their interrupts on this RISING edge. The subsequent </w:t>
+      </w:r>
       <w:r>
         <w:rPr>
           <w:rFonts w:ascii="Courier New" w:eastAsia="Courier New" w:hAnsi="Courier New" w:cs="Courier New"/>
           <w:sz w:val="20"/>
           <w:szCs w:val="20"/>
         </w:rPr>
-        <w:t>)</w:t>
-      </w:r>
-      <w:r>
-        <w:t xml:space="preserve"> is called. Inside that function, </w:t>
-      </w:r>
-      <w:proofErr w:type="spellStart"/>
-      <w:proofErr w:type="gramStart"/>
+        <w:t>delay(10)</w:t>
+      </w:r>
+      <w:r>
+        <w:t xml:space="preserve"> merely holds the pin HIGH to create a 10 ms pulse </w:t>
+      </w:r>
+      <w:r>
+        <w:rPr>
+          <w:i/>
+          <w:iCs/>
+        </w:rPr>
+        <w:t>width</w:t>
+      </w:r>
+      <w:r>
+        <w:t xml:space="preserve">; it does not delay the rising edge itself. Consequently, the discrepancy between </w:t>
+      </w:r>
       <w:r>
         <w:rPr>
           <w:rFonts w:ascii="Courier New" w:eastAsia="Courier New" w:hAnsi="Courier New" w:cs="Courier New"/>
           <w:sz w:val="20"/>
           <w:szCs w:val="20"/>
         </w:rPr>
-        <w:t>digitalWrite</w:t>
-      </w:r>
-      <w:proofErr w:type="spellEnd"/>
+        <w:t>now</w:t>
+      </w:r>
+      <w:r>
+        <w:t xml:space="preserve"> (the master's recorded sync time) and the moment the Nanos' ISRs execute is small — a few microseconds of function-entry overhead — but it is variable and therefore constitutes genuine jitter on the master's side of any master-to-Nano timing comparison.</w:t>
+      </w:r>
+    </w:p>
+    <w:p>
+      <w:pPr>
+        <w:pStyle w:val="Heading2"/>
+      </w:pPr>
+      <w:r>
+        <w:t>2.2  ST Delivery Can Be Displaced by One Polling Cycle</w:t>
+      </w:r>
+    </w:p>
+    <w:p>
+      <w:pPr>
+        <w:spacing w:after="160"/>
+      </w:pPr>
+      <w:r>
+        <w:t xml:space="preserve">This is the dominant source of the large, discrete jumps visible in the Nano-to-Nano timing plots described in Section 5. After recording a sync timestamp in its ISR, a Nano holds it in a buffer until the Uno polls it. The Nano's </w:t>
+      </w:r>
       <w:r>
         <w:rPr>
           <w:rFonts w:ascii="Courier New" w:eastAsia="Courier New" w:hAnsi="Courier New" w:cs="Courier New"/>
           <w:sz w:val="20"/>
           <w:szCs w:val="20"/>
         </w:rPr>
-        <w:t>(</w:t>
-      </w:r>
-      <w:proofErr w:type="gramEnd"/>
-      <w:r>
-        <w:rPr>
-          <w:rFonts w:ascii="Courier New" w:eastAsia="Courier New" w:hAnsi="Courier New" w:cs="Courier New"/>
-          <w:sz w:val="20"/>
-          <w:szCs w:val="20"/>
-        </w:rPr>
-        <w:t>SYNC_PIN, HIGH)</w:t>
-      </w:r>
-      <w:r>
-        <w:t xml:space="preserve"> executes almost immediately — the pin goes HIGH after only a few microseconds of function-call and stack-frame overhead. The Nanos fire their interrupts on this RISING edge. The subsequent </w:t>
-      </w:r>
-      <w:proofErr w:type="gramStart"/>
-      <w:r>
-        <w:rPr>
-          <w:rFonts w:ascii="Courier New" w:eastAsia="Courier New" w:hAnsi="Courier New" w:cs="Courier New"/>
-          <w:sz w:val="20"/>
-          <w:szCs w:val="20"/>
-        </w:rPr>
-        <w:t>delay(</w:t>
-      </w:r>
-      <w:proofErr w:type="gramEnd"/>
-      <w:r>
-        <w:rPr>
-          <w:rFonts w:ascii="Courier New" w:eastAsia="Courier New" w:hAnsi="Courier New" w:cs="Courier New"/>
-          <w:sz w:val="20"/>
-          <w:szCs w:val="20"/>
-        </w:rPr>
-        <w:t>10)</w:t>
-      </w:r>
-      <w:r>
-        <w:t xml:space="preserve"> merely holds the pin HIGH to create a 10 </w:t>
-      </w:r>
-      <w:proofErr w:type="spellStart"/>
-      <w:r>
-        <w:t>ms</w:t>
-      </w:r>
-      <w:proofErr w:type="spellEnd"/>
-      <w:r>
-        <w:t xml:space="preserve"> pulse </w:t>
-      </w:r>
-      <w:r>
-        <w:rPr>
-          <w:i/>
-          <w:iCs/>
-        </w:rPr>
-        <w:t>width</w:t>
-      </w:r>
-      <w:r>
-        <w:t xml:space="preserve">; it does not delay the rising edge itself. Consequently, the discrepancy between </w:t>
-      </w:r>
-      <w:r>
-        <w:rPr>
-          <w:rFonts w:ascii="Courier New" w:eastAsia="Courier New" w:hAnsi="Courier New" w:cs="Courier New"/>
-          <w:sz w:val="20"/>
-          <w:szCs w:val="20"/>
-        </w:rPr>
-        <w:t>now</w:t>
-      </w:r>
-      <w:r>
-        <w:t xml:space="preserve"> (the master's recorded sync time) and the moment the Nanos' ISRs execute is small — a few microseconds of function-entry overhead — but it is variable and therefore constitutes genuine jitter on the master's side of any master-to-Nano timing comparison.</w:t>
-      </w:r>
-    </w:p>
-    <w:p>
-      <w:pPr>
-        <w:pStyle w:val="Heading2"/>
-      </w:pPr>
-      <w:proofErr w:type="gramStart"/>
-      <w:r>
-        <w:t>2.2  ST</w:t>
-      </w:r>
-      <w:proofErr w:type="gramEnd"/>
-      <w:r>
-        <w:t xml:space="preserve"> Delivery Can Be Displaced by One Polling Cycle</w:t>
-      </w:r>
-    </w:p>
-    <w:p>
-      <w:pPr>
-        <w:spacing w:after="160"/>
-      </w:pPr>
-      <w:r>
-        <w:t xml:space="preserve">This is the dominant source of the large, discrete jumps visible in the Nano-to-Nano timing plots described in Section 5. After recording a sync timestamp in its ISR, a Nano holds it in a buffer until the Uno polls it. The Nano's </w:t>
-      </w:r>
-      <w:proofErr w:type="spellStart"/>
-      <w:proofErr w:type="gramStart"/>
-      <w:r>
-        <w:rPr>
-          <w:rFonts w:ascii="Courier New" w:eastAsia="Courier New" w:hAnsi="Courier New" w:cs="Courier New"/>
-          <w:sz w:val="20"/>
-          <w:szCs w:val="20"/>
-        </w:rPr>
-        <w:t>sendData</w:t>
-      </w:r>
-      <w:proofErr w:type="spellEnd"/>
-      <w:r>
-        <w:rPr>
-          <w:rFonts w:ascii="Courier New" w:eastAsia="Courier New" w:hAnsi="Courier New" w:cs="Courier New"/>
-          <w:sz w:val="20"/>
-          <w:szCs w:val="20"/>
-        </w:rPr>
-        <w:t>(</w:t>
-      </w:r>
-      <w:proofErr w:type="gramEnd"/>
-      <w:r>
-        <w:rPr>
-          <w:rFonts w:ascii="Courier New" w:eastAsia="Courier New" w:hAnsi="Courier New" w:cs="Courier New"/>
-          <w:sz w:val="20"/>
-          <w:szCs w:val="20"/>
-        </w:rPr>
-        <w:t>)</w:t>
-      </w:r>
-      <w:r>
-        <w:t xml:space="preserve"> function </w:t>
-      </w:r>
-      <w:proofErr w:type="spellStart"/>
-      <w:r>
-        <w:t>prioritises</w:t>
-      </w:r>
-      <w:proofErr w:type="spellEnd"/>
-      <w:r>
-        <w:t xml:space="preserve"> PT events over ST events:</w:t>
+        <w:t>sendData()</w:t>
+      </w:r>
+      <w:r>
+        <w:t xml:space="preserve"> function prioritises PT events over ST events:</w:t>
       </w:r>
     </w:p>
     <w:p>
@@ -752,238 +368,7 @@
           <w:sz w:val="18"/>
           <w:szCs w:val="18"/>
         </w:rPr>
-        <w:t xml:space="preserve">void </w:t>
-      </w:r>
-      <w:proofErr w:type="spellStart"/>
-      <w:proofErr w:type="gramStart"/>
-      <w:r>
-        <w:rPr>
-          <w:rFonts w:ascii="Courier New" w:eastAsia="Courier New" w:hAnsi="Courier New" w:cs="Courier New"/>
-          <w:color w:val="333333"/>
-          <w:sz w:val="18"/>
-          <w:szCs w:val="18"/>
-        </w:rPr>
-        <w:t>sendData</w:t>
-      </w:r>
-      <w:proofErr w:type="spellEnd"/>
-      <w:r>
-        <w:rPr>
-          <w:rFonts w:ascii="Courier New" w:eastAsia="Courier New" w:hAnsi="Courier New" w:cs="Courier New"/>
-          <w:color w:val="333333"/>
-          <w:sz w:val="18"/>
-          <w:szCs w:val="18"/>
-        </w:rPr>
-        <w:t>(</w:t>
-      </w:r>
-      <w:proofErr w:type="gramEnd"/>
-      <w:r>
-        <w:rPr>
-          <w:rFonts w:ascii="Courier New" w:eastAsia="Courier New" w:hAnsi="Courier New" w:cs="Courier New"/>
-          <w:color w:val="333333"/>
-          <w:sz w:val="18"/>
-          <w:szCs w:val="18"/>
-        </w:rPr>
-        <w:t>) {   if (</w:t>
-      </w:r>
-      <w:proofErr w:type="spellStart"/>
-      <w:r>
-        <w:rPr>
-          <w:rFonts w:ascii="Courier New" w:eastAsia="Courier New" w:hAnsi="Courier New" w:cs="Courier New"/>
-          <w:color w:val="333333"/>
-          <w:sz w:val="18"/>
-          <w:szCs w:val="18"/>
-        </w:rPr>
-        <w:t>pulseDetected</w:t>
-      </w:r>
-      <w:proofErr w:type="spellEnd"/>
-      <w:r>
-        <w:rPr>
-          <w:rFonts w:ascii="Courier New" w:eastAsia="Courier New" w:hAnsi="Courier New" w:cs="Courier New"/>
-          <w:color w:val="333333"/>
-          <w:sz w:val="18"/>
-          <w:szCs w:val="18"/>
-        </w:rPr>
-        <w:t xml:space="preserve">) {     </w:t>
-      </w:r>
-      <w:proofErr w:type="spellStart"/>
-      <w:r>
-        <w:rPr>
-          <w:rFonts w:ascii="Courier New" w:eastAsia="Courier New" w:hAnsi="Courier New" w:cs="Courier New"/>
-          <w:color w:val="333333"/>
-          <w:sz w:val="18"/>
-          <w:szCs w:val="18"/>
-        </w:rPr>
-        <w:t>timestampToSend</w:t>
-      </w:r>
-      <w:proofErr w:type="spellEnd"/>
-      <w:r>
-        <w:rPr>
-          <w:rFonts w:ascii="Courier New" w:eastAsia="Courier New" w:hAnsi="Courier New" w:cs="Courier New"/>
-          <w:color w:val="333333"/>
-          <w:sz w:val="18"/>
-          <w:szCs w:val="18"/>
-        </w:rPr>
-        <w:t xml:space="preserve"> = </w:t>
-      </w:r>
-      <w:proofErr w:type="spellStart"/>
-      <w:r>
-        <w:rPr>
-          <w:rFonts w:ascii="Courier New" w:eastAsia="Courier New" w:hAnsi="Courier New" w:cs="Courier New"/>
-          <w:color w:val="333333"/>
-          <w:sz w:val="18"/>
-          <w:szCs w:val="18"/>
-        </w:rPr>
-        <w:t>pulseTimestamp</w:t>
-      </w:r>
-      <w:proofErr w:type="spellEnd"/>
-      <w:r>
-        <w:rPr>
-          <w:rFonts w:ascii="Courier New" w:eastAsia="Courier New" w:hAnsi="Courier New" w:cs="Courier New"/>
-          <w:color w:val="333333"/>
-          <w:sz w:val="18"/>
-          <w:szCs w:val="18"/>
-        </w:rPr>
-        <w:t xml:space="preserve">;     </w:t>
-      </w:r>
-      <w:proofErr w:type="spellStart"/>
-      <w:r>
-        <w:rPr>
-          <w:rFonts w:ascii="Courier New" w:eastAsia="Courier New" w:hAnsi="Courier New" w:cs="Courier New"/>
-          <w:color w:val="333333"/>
-          <w:sz w:val="18"/>
-          <w:szCs w:val="18"/>
-        </w:rPr>
-        <w:t>typeToSend</w:t>
-      </w:r>
-      <w:proofErr w:type="spellEnd"/>
-      <w:r>
-        <w:rPr>
-          <w:rFonts w:ascii="Courier New" w:eastAsia="Courier New" w:hAnsi="Courier New" w:cs="Courier New"/>
-          <w:color w:val="333333"/>
-          <w:sz w:val="18"/>
-          <w:szCs w:val="18"/>
-        </w:rPr>
-        <w:t xml:space="preserve"> = 1;     </w:t>
-      </w:r>
-      <w:proofErr w:type="spellStart"/>
-      <w:r>
-        <w:rPr>
-          <w:rFonts w:ascii="Courier New" w:eastAsia="Courier New" w:hAnsi="Courier New" w:cs="Courier New"/>
-          <w:color w:val="333333"/>
-          <w:sz w:val="18"/>
-          <w:szCs w:val="18"/>
-        </w:rPr>
-        <w:t>pulseDetected</w:t>
-      </w:r>
-      <w:proofErr w:type="spellEnd"/>
-      <w:r>
-        <w:rPr>
-          <w:rFonts w:ascii="Courier New" w:eastAsia="Courier New" w:hAnsi="Courier New" w:cs="Courier New"/>
-          <w:color w:val="333333"/>
-          <w:sz w:val="18"/>
-          <w:szCs w:val="18"/>
-        </w:rPr>
-        <w:t xml:space="preserve"> = false;   } else if (</w:t>
-      </w:r>
-      <w:proofErr w:type="spellStart"/>
-      <w:r>
-        <w:rPr>
-          <w:rFonts w:ascii="Courier New" w:eastAsia="Courier New" w:hAnsi="Courier New" w:cs="Courier New"/>
-          <w:color w:val="333333"/>
-          <w:sz w:val="18"/>
-          <w:szCs w:val="18"/>
-        </w:rPr>
-        <w:t>syncDetected</w:t>
-      </w:r>
-      <w:proofErr w:type="spellEnd"/>
-      <w:r>
-        <w:rPr>
-          <w:rFonts w:ascii="Courier New" w:eastAsia="Courier New" w:hAnsi="Courier New" w:cs="Courier New"/>
-          <w:color w:val="333333"/>
-          <w:sz w:val="18"/>
-          <w:szCs w:val="18"/>
-        </w:rPr>
-        <w:t xml:space="preserve">) {     </w:t>
-      </w:r>
-      <w:proofErr w:type="spellStart"/>
-      <w:r>
-        <w:rPr>
-          <w:rFonts w:ascii="Courier New" w:eastAsia="Courier New" w:hAnsi="Courier New" w:cs="Courier New"/>
-          <w:color w:val="333333"/>
-          <w:sz w:val="18"/>
-          <w:szCs w:val="18"/>
-        </w:rPr>
-        <w:t>timestampToSend</w:t>
-      </w:r>
-      <w:proofErr w:type="spellEnd"/>
-      <w:r>
-        <w:rPr>
-          <w:rFonts w:ascii="Courier New" w:eastAsia="Courier New" w:hAnsi="Courier New" w:cs="Courier New"/>
-          <w:color w:val="333333"/>
-          <w:sz w:val="18"/>
-          <w:szCs w:val="18"/>
-        </w:rPr>
-        <w:t xml:space="preserve"> = </w:t>
-      </w:r>
-      <w:proofErr w:type="spellStart"/>
-      <w:r>
-        <w:rPr>
-          <w:rFonts w:ascii="Courier New" w:eastAsia="Courier New" w:hAnsi="Courier New" w:cs="Courier New"/>
-          <w:color w:val="333333"/>
-          <w:sz w:val="18"/>
-          <w:szCs w:val="18"/>
-        </w:rPr>
-        <w:t>syncTimestamp</w:t>
-      </w:r>
-      <w:proofErr w:type="spellEnd"/>
-      <w:r>
-        <w:rPr>
-          <w:rFonts w:ascii="Courier New" w:eastAsia="Courier New" w:hAnsi="Courier New" w:cs="Courier New"/>
-          <w:color w:val="333333"/>
-          <w:sz w:val="18"/>
-          <w:szCs w:val="18"/>
-        </w:rPr>
-        <w:t xml:space="preserve">;     </w:t>
-      </w:r>
-      <w:proofErr w:type="spellStart"/>
-      <w:r>
-        <w:rPr>
-          <w:rFonts w:ascii="Courier New" w:eastAsia="Courier New" w:hAnsi="Courier New" w:cs="Courier New"/>
-          <w:color w:val="333333"/>
-          <w:sz w:val="18"/>
-          <w:szCs w:val="18"/>
-        </w:rPr>
-        <w:t>typeToSend</w:t>
-      </w:r>
-      <w:proofErr w:type="spellEnd"/>
-      <w:r>
-        <w:rPr>
-          <w:rFonts w:ascii="Courier New" w:eastAsia="Courier New" w:hAnsi="Courier New" w:cs="Courier New"/>
-          <w:color w:val="333333"/>
-          <w:sz w:val="18"/>
-          <w:szCs w:val="18"/>
-        </w:rPr>
-        <w:t xml:space="preserve"> = 2;     </w:t>
-      </w:r>
-      <w:proofErr w:type="spellStart"/>
-      <w:r>
-        <w:rPr>
-          <w:rFonts w:ascii="Courier New" w:eastAsia="Courier New" w:hAnsi="Courier New" w:cs="Courier New"/>
-          <w:color w:val="333333"/>
-          <w:sz w:val="18"/>
-          <w:szCs w:val="18"/>
-        </w:rPr>
-        <w:t>syncDetected</w:t>
-      </w:r>
-      <w:proofErr w:type="spellEnd"/>
-      <w:r>
-        <w:rPr>
-          <w:rFonts w:ascii="Courier New" w:eastAsia="Courier New" w:hAnsi="Courier New" w:cs="Courier New"/>
-          <w:color w:val="333333"/>
-          <w:sz w:val="18"/>
-          <w:szCs w:val="18"/>
-        </w:rPr>
-        <w:t xml:space="preserve"> = false;   }   ...</w:t>
+        <w:t>void sendData() {   if (pulseDetected) {     timestampToSend = pulseTimestamp;     typeToSend = 1;     pulseDetected = false;   } else if (syncDetected) {     timestampToSend = syncTimestamp;     typeToSend = 2;     syncDetected = false;   }   ...</w:t>
       </w:r>
     </w:p>
     <w:p>
@@ -1001,28 +386,15 @@
         <w:t>next</w:t>
       </w:r>
       <w:r>
-        <w:t xml:space="preserve"> cycle. The ST timestamp value itself is unaffected — it was correctly captured at interrupt time — but it is delivered late. When the data analysis then assembles the sync table by pairing the k-</w:t>
-      </w:r>
-      <w:proofErr w:type="spellStart"/>
-      <w:r>
-        <w:t>th</w:t>
-      </w:r>
-      <w:proofErr w:type="spellEnd"/>
-      <w:r>
-        <w:t xml:space="preserve"> ST from each Nano by index, one or more Nanos will have their ST list offset by one event, causing all subsequent pairings for that Nano to compare timestamps from different physical sync events. The resulting apparent offset is not a smooth drift value but a sudden jump of approximately one inter-sync interval. This is precisely what is seen in the raw pairwise-offset plots: smooth gradual evolution punctuated by occasional large discrete steps.</w:t>
+        <w:t xml:space="preserve"> cycle. The ST timestamp value itself is unaffected — it was correctly captured at interrupt time — but it is delivered late. When the data analysis then assembles the sync table by pairing the k-th ST from each Nano by index, one or more Nanos will have their ST list offset by one event, causing all subsequent pairings for that Nano to compare timestamps from different physical sync events. The resulting apparent offset is not a smooth drift value but a sudden jump of approximately one inter-sync interval. This is precisely what is seen in the raw pairwise-offset plots: smooth gradual evolution punctuated by occasional large discrete steps.</w:t>
       </w:r>
     </w:p>
     <w:p>
       <w:pPr>
         <w:pStyle w:val="Heading2"/>
       </w:pPr>
-      <w:proofErr w:type="gramStart"/>
-      <w:r>
-        <w:t>2.3  Crystal</w:t>
-      </w:r>
-      <w:proofErr w:type="gramEnd"/>
-      <w:r>
-        <w:t xml:space="preserve"> Frequency Mismatch Accumulates Over Time</w:t>
+      <w:r>
+        <w:t>2.3  Crystal Frequency Mismatch Accumulates Over Time</w:t>
       </w:r>
     </w:p>
     <w:p>
@@ -1037,13 +409,8 @@
       <w:pPr>
         <w:pStyle w:val="Heading2"/>
       </w:pPr>
-      <w:proofErr w:type="gramStart"/>
-      <w:r>
-        <w:t>2.4  Why</w:t>
-      </w:r>
-      <w:proofErr w:type="gramEnd"/>
-      <w:r>
-        <w:t xml:space="preserve"> the I²C Polling Latency Does Not Corrupt the Timestamps</w:t>
+      <w:r>
+        <w:t>2.4  Why the I²C Polling Latency Does Not Corrupt the Timestamps</w:t>
       </w:r>
     </w:p>
     <w:p>
@@ -1062,15 +429,7 @@
         <w:t>not</w:t>
       </w:r>
       <w:r>
-        <w:t xml:space="preserve"> do. The polling loop takes approximately 600 µs per Nano (100 kHz I²C, 6 bytes), so the Uno queries Nano 8 roughly 4–5 </w:t>
-      </w:r>
-      <w:proofErr w:type="spellStart"/>
-      <w:r>
-        <w:t>ms</w:t>
-      </w:r>
-      <w:proofErr w:type="spellEnd"/>
-      <w:r>
-        <w:t xml:space="preserve"> after querying Nano 1. However, the Nano timestamps are captured by hardware interrupts and held in buffer registers; the time of polling has no effect on their values. The only consequence of polling latency is the delivery-priority issue described in Section 2.2, not any corruption of the timestamp values themselves.</w:t>
+        <w:t xml:space="preserve"> do. The polling loop takes approximately 600 µs per Nano (100 kHz I²C, 6 bytes), so the Uno queries Nano 8 roughly 4–5 ms after querying Nano 1. However, the Nano timestamps are captured by hardware interrupts and held in buffer registers; the time of polling has no effect on their values. The only consequence of polling latency is the delivery-priority issue described in Section 2.2, not any corruption of the timestamp values themselves.</w:t>
       </w:r>
     </w:p>
     <w:p>
@@ -1078,15 +437,7 @@
         <w:pStyle w:val="Heading1"/>
       </w:pPr>
       <w:r>
-        <w:t xml:space="preserve">3. Better </w:t>
-      </w:r>
-      <w:proofErr w:type="spellStart"/>
-      <w:r>
-        <w:t>Synchronisation</w:t>
-      </w:r>
-      <w:proofErr w:type="spellEnd"/>
-      <w:r>
-        <w:t xml:space="preserve"> Architectures</w:t>
+        <w:t>3. Better Synchronisation Architectures</w:t>
       </w:r>
     </w:p>
     <w:p>
@@ -1101,13 +452,8 @@
       <w:pPr>
         <w:pStyle w:val="Heading3"/>
       </w:pPr>
-      <w:proofErr w:type="gramStart"/>
-      <w:r>
-        <w:t>3.1  Hardware</w:t>
-      </w:r>
-      <w:proofErr w:type="gramEnd"/>
-      <w:r>
-        <w:t xml:space="preserve"> Interrupt Timestamp on the Master</w:t>
+      <w:r>
+        <w:t>3.1  Hardware Interrupt Timestamp on the Master</w:t>
       </w:r>
     </w:p>
     <w:p>
@@ -1122,13 +468,8 @@
       <w:pPr>
         <w:pStyle w:val="Heading3"/>
       </w:pPr>
-      <w:proofErr w:type="gramStart"/>
-      <w:r>
-        <w:t>3.2  GPS</w:t>
-      </w:r>
-      <w:proofErr w:type="gramEnd"/>
-      <w:r>
-        <w:t xml:space="preserve"> 1-PPS Reference</w:t>
+      <w:r>
+        <w:t>3.2  GPS 1-PPS Reference</w:t>
       </w:r>
     </w:p>
     <w:p>
@@ -1143,13 +484,8 @@
       <w:pPr>
         <w:pStyle w:val="Heading3"/>
       </w:pPr>
-      <w:proofErr w:type="gramStart"/>
-      <w:r>
-        <w:t>3.3  Dedicated</w:t>
-      </w:r>
-      <w:proofErr w:type="gramEnd"/>
-      <w:r>
-        <w:t xml:space="preserve"> Time-to-Digital Converters</w:t>
+      <w:r>
+        <w:t>3.3  Dedicated Time-to-Digital Converters</w:t>
       </w:r>
     </w:p>
     <w:p>
@@ -1157,23 +493,7 @@
         <w:spacing w:after="160"/>
       </w:pPr>
       <w:r>
-        <w:t>For sub-microsecond coincidence timing in a laboratory setting, dedicated TDC ICs (</w:t>
-      </w:r>
-      <w:proofErr w:type="gramStart"/>
-      <w:r>
-        <w:t>e.g.</w:t>
-      </w:r>
-      <w:proofErr w:type="gramEnd"/>
-      <w:r>
-        <w:t xml:space="preserve"> TDC7200, AS6501) connected to a single master clock distributed through matched-length cables provide timing resolution of 55 </w:t>
-      </w:r>
-      <w:proofErr w:type="spellStart"/>
-      <w:r>
-        <w:t>ps</w:t>
-      </w:r>
-      <w:proofErr w:type="spellEnd"/>
-      <w:r>
-        <w:t xml:space="preserve"> and eliminate all software-timing jitter. This is the standard approach in large-scale cosmic-ray experiments such as AERA at the Pierre Auger Observatory.</w:t>
+        <w:t>For sub-microsecond coincidence timing in a laboratory setting, dedicated TDC ICs (e.g. TDC7200, AS6501) connected to a single master clock distributed through matched-length cables provide timing resolution of 55 ps and eliminate all software-timing jitter. This is the standard approach in large-scale cosmic-ray experiments such as AERA at the Pierre Auger Observatory.</w:t>
       </w:r>
     </w:p>
     <w:p>
@@ -1191,7 +511,6 @@
       <w:r>
         <w:t xml:space="preserve">Because all eight Nanos are connected to the same physical sync wire, every sync pulse arrives at all of them essentially simultaneously (propagation delay ≈5 ns/m, negligible at board-to-board distances). Therefore, when Nano </w:t>
       </w:r>
-      <w:proofErr w:type="spellStart"/>
       <w:r>
         <w:rPr>
           <w:i/>
@@ -1199,7 +518,6 @@
         </w:rPr>
         <w:t>i</w:t>
       </w:r>
-      <w:proofErr w:type="spellEnd"/>
       <w:r>
         <w:t xml:space="preserve"> and Nano 1 both record the same sync event k, the difference:</w:t>
       </w:r>
@@ -1212,59 +530,13 @@
         <w:spacing w:before="140" w:after="140"/>
         <w:ind w:left="720"/>
       </w:pPr>
-      <w:proofErr w:type="gramStart"/>
       <w:r>
         <w:rPr>
           <w:rFonts w:ascii="Cambria Math" w:eastAsia="Cambria Math" w:hAnsi="Cambria Math" w:cs="Cambria Math"/>
           <w:i/>
           <w:iCs/>
         </w:rPr>
-        <w:t>Δ[</w:t>
-      </w:r>
-      <w:proofErr w:type="gramEnd"/>
-      <w:r>
-        <w:rPr>
-          <w:rFonts w:ascii="Cambria Math" w:eastAsia="Cambria Math" w:hAnsi="Cambria Math" w:cs="Cambria Math"/>
-          <w:i/>
-          <w:iCs/>
-        </w:rPr>
-        <w:t xml:space="preserve">k, </w:t>
-      </w:r>
-      <w:proofErr w:type="spellStart"/>
-      <w:r>
-        <w:rPr>
-          <w:rFonts w:ascii="Cambria Math" w:eastAsia="Cambria Math" w:hAnsi="Cambria Math" w:cs="Cambria Math"/>
-          <w:i/>
-          <w:iCs/>
-        </w:rPr>
-        <w:t>i</w:t>
-      </w:r>
-      <w:proofErr w:type="spellEnd"/>
-      <w:r>
-        <w:rPr>
-          <w:rFonts w:ascii="Cambria Math" w:eastAsia="Cambria Math" w:hAnsi="Cambria Math" w:cs="Cambria Math"/>
-          <w:i/>
-          <w:iCs/>
-        </w:rPr>
-        <w:t xml:space="preserve">]  =  ST[k, </w:t>
-      </w:r>
-      <w:proofErr w:type="spellStart"/>
-      <w:r>
-        <w:rPr>
-          <w:rFonts w:ascii="Cambria Math" w:eastAsia="Cambria Math" w:hAnsi="Cambria Math" w:cs="Cambria Math"/>
-          <w:i/>
-          <w:iCs/>
-        </w:rPr>
-        <w:t>i</w:t>
-      </w:r>
-      <w:proofErr w:type="spellEnd"/>
-      <w:r>
-        <w:rPr>
-          <w:rFonts w:ascii="Cambria Math" w:eastAsia="Cambria Math" w:hAnsi="Cambria Math" w:cs="Cambria Math"/>
-          <w:i/>
-          <w:iCs/>
-        </w:rPr>
-        <w:t>]  −  ST[k, 1]</w:t>
+        <w:t>Δ[k, i]  =  ST[k, i]  −  ST[k, 1]</w:t>
       </w:r>
       <w:r>
         <w:rPr>
@@ -1284,7 +556,6 @@
       <w:r>
         <w:t xml:space="preserve">is the clock offset of Nano </w:t>
       </w:r>
-      <w:proofErr w:type="spellStart"/>
       <w:r>
         <w:rPr>
           <w:i/>
@@ -1292,7 +563,6 @@
         </w:rPr>
         <w:t>i</w:t>
       </w:r>
-      <w:proofErr w:type="spellEnd"/>
       <w:r>
         <w:t xml:space="preserve"> relative to the reference Nano 1 at that moment, determined entirely by the two Nanos' own hardware timestamps. All master-side jitter sources listed in Section 2 — the pre-call capture of </w:t>
       </w:r>
@@ -1312,13 +582,8 @@
       <w:pPr>
         <w:pStyle w:val="Heading2"/>
       </w:pPr>
-      <w:proofErr w:type="gramStart"/>
-      <w:r>
-        <w:t>4.1  Piecewise</w:t>
-      </w:r>
-      <w:proofErr w:type="gramEnd"/>
-      <w:r>
-        <w:t>-Linear Interpolation</w:t>
+      <w:r>
+        <w:t>4.1  Piecewise-Linear Interpolation</w:t>
       </w:r>
     </w:p>
     <w:p>
@@ -1326,25 +591,8 @@
         <w:spacing w:after="160"/>
       </w:pPr>
       <w:r>
-        <w:t xml:space="preserve">The offsets </w:t>
-      </w:r>
-      <w:proofErr w:type="gramStart"/>
-      <w:r>
-        <w:t>Δ[</w:t>
-      </w:r>
-      <w:proofErr w:type="gramEnd"/>
-      <w:r>
-        <w:t xml:space="preserve">k, </w:t>
-      </w:r>
-      <w:proofErr w:type="spellStart"/>
-      <w:r>
-        <w:t>i</w:t>
-      </w:r>
-      <w:proofErr w:type="spellEnd"/>
-      <w:r>
-        <w:t xml:space="preserve">] evolve smoothly over time as crystals drift. With sync events every 10 seconds, 359 calibration pairs are available over the 60-minute run. For a particle pulse arriving at Nano </w:t>
-      </w:r>
-      <w:proofErr w:type="spellStart"/>
+        <w:t xml:space="preserve">The offsets Δ[k, i] evolve smoothly over time as crystals drift. With sync events every 10 seconds, 359 calibration pairs are available over the 60-minute run. For a particle pulse arriving at Nano </w:t>
+      </w:r>
       <w:r>
         <w:rPr>
           <w:i/>
@@ -1352,7 +600,6 @@
         </w:rPr>
         <w:t>i</w:t>
       </w:r>
-      <w:proofErr w:type="spellEnd"/>
       <w:r>
         <w:t xml:space="preserve"> at raw time </w:t>
       </w:r>
@@ -1372,27 +619,7 @@
           <w:sz w:val="20"/>
           <w:szCs w:val="20"/>
         </w:rPr>
-        <w:t>ST[</w:t>
-      </w:r>
-      <w:proofErr w:type="spellStart"/>
-      <w:proofErr w:type="gramStart"/>
-      <w:r>
-        <w:rPr>
-          <w:rFonts w:ascii="Courier New" w:eastAsia="Courier New" w:hAnsi="Courier New" w:cs="Courier New"/>
-          <w:sz w:val="20"/>
-          <w:szCs w:val="20"/>
-        </w:rPr>
-        <w:t>k,i</w:t>
-      </w:r>
-      <w:proofErr w:type="spellEnd"/>
-      <w:proofErr w:type="gramEnd"/>
-      <w:r>
-        <w:rPr>
-          <w:rFonts w:ascii="Courier New" w:eastAsia="Courier New" w:hAnsi="Courier New" w:cs="Courier New"/>
-          <w:sz w:val="20"/>
-          <w:szCs w:val="20"/>
-        </w:rPr>
-        <w:t>] ≤ t &lt; ST[k+1,i]</w:t>
+        <w:t>ST[k,i] ≤ t &lt; ST[k+1,i]</w:t>
       </w:r>
       <w:r>
         <w:t>) and the offset is interpolated:</w:t>
@@ -1406,7 +633,6 @@
         <w:spacing w:before="140" w:after="140"/>
         <w:ind w:left="720"/>
       </w:pPr>
-      <w:proofErr w:type="gramStart"/>
       <w:r>
         <w:rPr>
           <w:rFonts w:ascii="Cambria Math" w:eastAsia="Cambria Math" w:hAnsi="Cambria Math" w:cs="Cambria Math"/>
@@ -1414,70 +640,7 @@
           <w:iCs/>
         </w:rPr>
         <w:lastRenderedPageBreak/>
-        <w:t>frac  =</w:t>
-      </w:r>
-      <w:proofErr w:type="gramEnd"/>
-      <w:r>
-        <w:rPr>
-          <w:rFonts w:ascii="Cambria Math" w:eastAsia="Cambria Math" w:hAnsi="Cambria Math" w:cs="Cambria Math"/>
-          <w:i/>
-          <w:iCs/>
-        </w:rPr>
-        <w:t xml:space="preserve">  (t − ST[k, </w:t>
-      </w:r>
-      <w:proofErr w:type="spellStart"/>
-      <w:r>
-        <w:rPr>
-          <w:rFonts w:ascii="Cambria Math" w:eastAsia="Cambria Math" w:hAnsi="Cambria Math" w:cs="Cambria Math"/>
-          <w:i/>
-          <w:iCs/>
-        </w:rPr>
-        <w:t>i</w:t>
-      </w:r>
-      <w:proofErr w:type="spellEnd"/>
-      <w:r>
-        <w:rPr>
-          <w:rFonts w:ascii="Cambria Math" w:eastAsia="Cambria Math" w:hAnsi="Cambria Math" w:cs="Cambria Math"/>
-          <w:i/>
-          <w:iCs/>
-        </w:rPr>
-        <w:t xml:space="preserve">])  /  (ST[k+1, </w:t>
-      </w:r>
-      <w:proofErr w:type="spellStart"/>
-      <w:r>
-        <w:rPr>
-          <w:rFonts w:ascii="Cambria Math" w:eastAsia="Cambria Math" w:hAnsi="Cambria Math" w:cs="Cambria Math"/>
-          <w:i/>
-          <w:iCs/>
-        </w:rPr>
-        <w:t>i</w:t>
-      </w:r>
-      <w:proofErr w:type="spellEnd"/>
-      <w:r>
-        <w:rPr>
-          <w:rFonts w:ascii="Cambria Math" w:eastAsia="Cambria Math" w:hAnsi="Cambria Math" w:cs="Cambria Math"/>
-          <w:i/>
-          <w:iCs/>
-        </w:rPr>
-        <w:t xml:space="preserve">] − ST[k, </w:t>
-      </w:r>
-      <w:proofErr w:type="spellStart"/>
-      <w:r>
-        <w:rPr>
-          <w:rFonts w:ascii="Cambria Math" w:eastAsia="Cambria Math" w:hAnsi="Cambria Math" w:cs="Cambria Math"/>
-          <w:i/>
-          <w:iCs/>
-        </w:rPr>
-        <w:t>i</w:t>
-      </w:r>
-      <w:proofErr w:type="spellEnd"/>
-      <w:r>
-        <w:rPr>
-          <w:rFonts w:ascii="Cambria Math" w:eastAsia="Cambria Math" w:hAnsi="Cambria Math" w:cs="Cambria Math"/>
-          <w:i/>
-          <w:iCs/>
-        </w:rPr>
-        <w:t>])</w:t>
+        <w:t>frac  =  (t − ST[k, i])  /  (ST[k+1, i] − ST[k, i])</w:t>
       </w:r>
       <w:r>
         <w:rPr>
@@ -1498,113 +661,13 @@
         <w:spacing w:before="140" w:after="140"/>
         <w:ind w:left="720"/>
       </w:pPr>
-      <w:proofErr w:type="spellStart"/>
       <w:r>
         <w:rPr>
           <w:rFonts w:ascii="Cambria Math" w:eastAsia="Cambria Math" w:hAnsi="Cambria Math" w:cs="Cambria Math"/>
           <w:i/>
           <w:iCs/>
         </w:rPr>
-        <w:t>Δ_</w:t>
-      </w:r>
-      <w:proofErr w:type="gramStart"/>
-      <w:r>
-        <w:rPr>
-          <w:rFonts w:ascii="Cambria Math" w:eastAsia="Cambria Math" w:hAnsi="Cambria Math" w:cs="Cambria Math"/>
-          <w:i/>
-          <w:iCs/>
-        </w:rPr>
-        <w:t>interp</w:t>
-      </w:r>
-      <w:proofErr w:type="spellEnd"/>
-      <w:r>
-        <w:rPr>
-          <w:rFonts w:ascii="Cambria Math" w:eastAsia="Cambria Math" w:hAnsi="Cambria Math" w:cs="Cambria Math"/>
-          <w:i/>
-          <w:iCs/>
-        </w:rPr>
-        <w:t>(</w:t>
-      </w:r>
-      <w:proofErr w:type="gramEnd"/>
-      <w:r>
-        <w:rPr>
-          <w:rFonts w:ascii="Cambria Math" w:eastAsia="Cambria Math" w:hAnsi="Cambria Math" w:cs="Cambria Math"/>
-          <w:i/>
-          <w:iCs/>
-        </w:rPr>
-        <w:t xml:space="preserve">t, </w:t>
-      </w:r>
-      <w:proofErr w:type="spellStart"/>
-      <w:r>
-        <w:rPr>
-          <w:rFonts w:ascii="Cambria Math" w:eastAsia="Cambria Math" w:hAnsi="Cambria Math" w:cs="Cambria Math"/>
-          <w:i/>
-          <w:iCs/>
-        </w:rPr>
-        <w:t>i</w:t>
-      </w:r>
-      <w:proofErr w:type="spellEnd"/>
-      <w:r>
-        <w:rPr>
-          <w:rFonts w:ascii="Cambria Math" w:eastAsia="Cambria Math" w:hAnsi="Cambria Math" w:cs="Cambria Math"/>
-          <w:i/>
-          <w:iCs/>
-        </w:rPr>
-        <w:t xml:space="preserve">)  =  Δ[k, </w:t>
-      </w:r>
-      <w:proofErr w:type="spellStart"/>
-      <w:r>
-        <w:rPr>
-          <w:rFonts w:ascii="Cambria Math" w:eastAsia="Cambria Math" w:hAnsi="Cambria Math" w:cs="Cambria Math"/>
-          <w:i/>
-          <w:iCs/>
-        </w:rPr>
-        <w:t>i</w:t>
-      </w:r>
-      <w:proofErr w:type="spellEnd"/>
-      <w:r>
-        <w:rPr>
-          <w:rFonts w:ascii="Cambria Math" w:eastAsia="Cambria Math" w:hAnsi="Cambria Math" w:cs="Cambria Math"/>
-          <w:i/>
-          <w:iCs/>
-        </w:rPr>
-        <w:t xml:space="preserve">]  +  frac × (Δ[k+1, </w:t>
-      </w:r>
-      <w:proofErr w:type="spellStart"/>
-      <w:r>
-        <w:rPr>
-          <w:rFonts w:ascii="Cambria Math" w:eastAsia="Cambria Math" w:hAnsi="Cambria Math" w:cs="Cambria Math"/>
-          <w:i/>
-          <w:iCs/>
-        </w:rPr>
-        <w:t>i</w:t>
-      </w:r>
-      <w:proofErr w:type="spellEnd"/>
-      <w:r>
-        <w:rPr>
-          <w:rFonts w:ascii="Cambria Math" w:eastAsia="Cambria Math" w:hAnsi="Cambria Math" w:cs="Cambria Math"/>
-          <w:i/>
-          <w:iCs/>
-        </w:rPr>
-        <w:t xml:space="preserve">]  −  Δ[k, </w:t>
-      </w:r>
-      <w:proofErr w:type="spellStart"/>
-      <w:r>
-        <w:rPr>
-          <w:rFonts w:ascii="Cambria Math" w:eastAsia="Cambria Math" w:hAnsi="Cambria Math" w:cs="Cambria Math"/>
-          <w:i/>
-          <w:iCs/>
-        </w:rPr>
-        <w:t>i</w:t>
-      </w:r>
-      <w:proofErr w:type="spellEnd"/>
-      <w:r>
-        <w:rPr>
-          <w:rFonts w:ascii="Cambria Math" w:eastAsia="Cambria Math" w:hAnsi="Cambria Math" w:cs="Cambria Math"/>
-          <w:i/>
-          <w:iCs/>
-        </w:rPr>
-        <w:t>])</w:t>
+        <w:t>Δ_interp(t, i)  =  Δ[k, i]  +  frac × (Δ[k+1, i]  −  Δ[k, i])</w:t>
       </w:r>
       <w:r>
         <w:rPr>
@@ -1633,95 +696,13 @@
         <w:spacing w:before="140" w:after="140"/>
         <w:ind w:left="720"/>
       </w:pPr>
-      <w:proofErr w:type="spellStart"/>
       <w:r>
         <w:rPr>
           <w:rFonts w:ascii="Cambria Math" w:eastAsia="Cambria Math" w:hAnsi="Cambria Math" w:cs="Cambria Math"/>
           <w:i/>
           <w:iCs/>
         </w:rPr>
-        <w:t>t_</w:t>
-      </w:r>
-      <w:proofErr w:type="gramStart"/>
-      <w:r>
-        <w:rPr>
-          <w:rFonts w:ascii="Cambria Math" w:eastAsia="Cambria Math" w:hAnsi="Cambria Math" w:cs="Cambria Math"/>
-          <w:i/>
-          <w:iCs/>
-        </w:rPr>
-        <w:t>corr</w:t>
-      </w:r>
-      <w:proofErr w:type="spellEnd"/>
-      <w:r>
-        <w:rPr>
-          <w:rFonts w:ascii="Cambria Math" w:eastAsia="Cambria Math" w:hAnsi="Cambria Math" w:cs="Cambria Math"/>
-          <w:i/>
-          <w:iCs/>
-        </w:rPr>
-        <w:t>(</w:t>
-      </w:r>
-      <w:proofErr w:type="gramEnd"/>
-      <w:r>
-        <w:rPr>
-          <w:rFonts w:ascii="Cambria Math" w:eastAsia="Cambria Math" w:hAnsi="Cambria Math" w:cs="Cambria Math"/>
-          <w:i/>
-          <w:iCs/>
-        </w:rPr>
-        <w:t xml:space="preserve">t, </w:t>
-      </w:r>
-      <w:proofErr w:type="spellStart"/>
-      <w:r>
-        <w:rPr>
-          <w:rFonts w:ascii="Cambria Math" w:eastAsia="Cambria Math" w:hAnsi="Cambria Math" w:cs="Cambria Math"/>
-          <w:i/>
-          <w:iCs/>
-        </w:rPr>
-        <w:t>i</w:t>
-      </w:r>
-      <w:proofErr w:type="spellEnd"/>
-      <w:r>
-        <w:rPr>
-          <w:rFonts w:ascii="Cambria Math" w:eastAsia="Cambria Math" w:hAnsi="Cambria Math" w:cs="Cambria Math"/>
-          <w:i/>
-          <w:iCs/>
-        </w:rPr>
-        <w:t xml:space="preserve">)  =  t  −  </w:t>
-      </w:r>
-      <w:proofErr w:type="spellStart"/>
-      <w:r>
-        <w:rPr>
-          <w:rFonts w:ascii="Cambria Math" w:eastAsia="Cambria Math" w:hAnsi="Cambria Math" w:cs="Cambria Math"/>
-          <w:i/>
-          <w:iCs/>
-        </w:rPr>
-        <w:t>Δ_interp</w:t>
-      </w:r>
-      <w:proofErr w:type="spellEnd"/>
-      <w:r>
-        <w:rPr>
-          <w:rFonts w:ascii="Cambria Math" w:eastAsia="Cambria Math" w:hAnsi="Cambria Math" w:cs="Cambria Math"/>
-          <w:i/>
-          <w:iCs/>
-        </w:rPr>
-        <w:t xml:space="preserve">(t, </w:t>
-      </w:r>
-      <w:proofErr w:type="spellStart"/>
-      <w:r>
-        <w:rPr>
-          <w:rFonts w:ascii="Cambria Math" w:eastAsia="Cambria Math" w:hAnsi="Cambria Math" w:cs="Cambria Math"/>
-          <w:i/>
-          <w:iCs/>
-        </w:rPr>
-        <w:t>i</w:t>
-      </w:r>
-      <w:proofErr w:type="spellEnd"/>
-      <w:r>
-        <w:rPr>
-          <w:rFonts w:ascii="Cambria Math" w:eastAsia="Cambria Math" w:hAnsi="Cambria Math" w:cs="Cambria Math"/>
-          <w:i/>
-          <w:iCs/>
-        </w:rPr>
-        <w:t>)</w:t>
+        <w:t>t_corr(t, i)  =  t  −  Δ_interp(t, i)</w:t>
       </w:r>
       <w:r>
         <w:rPr>
@@ -1739,20 +720,15 @@
         <w:spacing w:after="160"/>
       </w:pPr>
       <w:r>
-        <w:t>This approach makes no assumptions about the functional form of clock drift. Because each 10-second sync interval is calibrated independently, nonlinear thermal drift is automatically accommodated. At the sync points themselves the calibration is exact by construction (the inter-Nano spread collapses to 0 µs at every sync event), and the residual timing uncertainty between sync events is set by the change in Δ across a single 10-second interval — typically 1 500–2 000 µs in these data.</w:t>
+        <w:t>This approach makes no assumptions about the functional form of clock drift. Because each 10-second sync interval is calibrated independently, nonlinear thermal drift is automatically accommodated. At the sync points themselves the calibration is exact by construction (the inter-Nano spread collapses to 0 µs at every sync event), and the residual timing uncertainty between sync events is set by the change in Δ across a single 10-second interval. In these data the RMS of that change, computed across all intervals, is 1,500–2,000 µs per Nano — but this figure is dominated by isolated spike intervals caused by firmware timing artifacts (interrupt deferral during I²C callbacks), which affect approximately 1.4% of all sync intervals. Excluding those spike intervals, the true RMS drops to 0.005–0.164 ms across all Nanos, with a combined value of approximately 75 µs. This is the physically meaningful timing floor for PT events in normal (non-spike) intervals.</w:t>
       </w:r>
     </w:p>
     <w:p>
       <w:pPr>
         <w:pStyle w:val="Heading2"/>
       </w:pPr>
-      <w:proofErr w:type="gramStart"/>
-      <w:r>
-        <w:t>4.2  Dropping</w:t>
-      </w:r>
-      <w:proofErr w:type="gramEnd"/>
-      <w:r>
-        <w:t xml:space="preserve"> the First Two ST Entries</w:t>
+      <w:r>
+        <w:t>4.2  Dropping the First Two ST Entries</w:t>
       </w:r>
     </w:p>
     <w:p>
@@ -1760,15 +736,7 @@
         <w:spacing w:after="160"/>
       </w:pPr>
       <w:r>
-        <w:t xml:space="preserve">The first two ST entries per Nano are anomalous: the array requires a few sync cycles to reach steady state, during which the Nano interrupt service routine may not yet be fully armed or the I²C bus may not have completed its </w:t>
-      </w:r>
-      <w:proofErr w:type="spellStart"/>
-      <w:r>
-        <w:t>initialisation</w:t>
-      </w:r>
-      <w:proofErr w:type="spellEnd"/>
-      <w:r>
-        <w:t>. These entries are dropped before constructing the sync table (</w:t>
+        <w:t>The first two ST entries per Nano are anomalous: the array requires a few sync cycles to reach steady state, during which the Nano interrupt service routine may not yet be fully armed or the I²C bus may not have completed its initialisation. These entries are dropped before constructing the sync table (</w:t>
       </w:r>
       <w:r>
         <w:rPr>
@@ -1786,13 +754,8 @@
       <w:pPr>
         <w:pStyle w:val="Heading2"/>
       </w:pPr>
-      <w:proofErr w:type="gramStart"/>
-      <w:r>
-        <w:t>4.3  Sync</w:t>
-      </w:r>
-      <w:proofErr w:type="gramEnd"/>
-      <w:r>
-        <w:t xml:space="preserve"> Veto</w:t>
+      <w:r>
+        <w:t>4.3  Sync Veto</w:t>
       </w:r>
     </w:p>
     <w:p>
@@ -1800,23 +763,7 @@
         <w:spacing w:after="160"/>
       </w:pPr>
       <w:r>
-        <w:t xml:space="preserve">The sync pulse is a 10 </w:t>
-      </w:r>
-      <w:proofErr w:type="spellStart"/>
-      <w:r>
-        <w:t>ms</w:t>
-      </w:r>
-      <w:proofErr w:type="spellEnd"/>
-      <w:r>
-        <w:t xml:space="preserve"> electrical transient injected into the system. Even with careful shielding, capacitive coupling onto signal lines can produce spurious PT events near sync times. Any PT event within ±20 </w:t>
-      </w:r>
-      <w:proofErr w:type="spellStart"/>
-      <w:r>
-        <w:t>ms</w:t>
-      </w:r>
-      <w:proofErr w:type="spellEnd"/>
-      <w:r>
-        <w:t xml:space="preserve"> of a raw ST timestamp for that specific Nano is removed before coincidence counting:</w:t>
+        <w:t>The sync pulse is a 10 ms electrical transient injected into the system. Even with careful shielding, capacitive coupling onto signal lines can produce spurious PT events near sync times. Any PT event within ±20 ms of a raw ST timestamp for that specific Nano is removed before coincidence counting:</w:t>
       </w:r>
     </w:p>
     <w:p>
@@ -1831,71 +778,34 @@
           <w:i/>
           <w:iCs/>
         </w:rPr>
-        <w:t>|</w:t>
-      </w:r>
-      <w:proofErr w:type="spellStart"/>
+        <w:t>|t_PT − t_ST|  &lt;  20 ms  →  veto</w:t>
+      </w:r>
+    </w:p>
+    <w:p>
+      <w:pPr>
+        <w:spacing w:after="160"/>
+      </w:pPr>
+      <w:r>
+        <w:t xml:space="preserve">In the February 27 data, 137 of 28 935 events (0.47%) were vetoed. The veto reduces the effective live time by </w:t>
+      </w:r>
       <w:r>
         <w:rPr>
           <w:rFonts w:ascii="Cambria Math" w:eastAsia="Cambria Math" w:hAnsi="Cambria Math" w:cs="Cambria Math"/>
           <w:i/>
           <w:iCs/>
         </w:rPr>
-        <w:t>t_PT</w:t>
-      </w:r>
-      <w:proofErr w:type="spellEnd"/>
-      <w:r>
-        <w:rPr>
-          <w:rFonts w:ascii="Cambria Math" w:eastAsia="Cambria Math" w:hAnsi="Cambria Math" w:cs="Cambria Math"/>
-          <w:i/>
-          <w:iCs/>
-        </w:rPr>
-        <w:t xml:space="preserve"> − </w:t>
-      </w:r>
-      <w:proofErr w:type="spellStart"/>
-      <w:r>
-        <w:rPr>
-          <w:rFonts w:ascii="Cambria Math" w:eastAsia="Cambria Math" w:hAnsi="Cambria Math" w:cs="Cambria Math"/>
-          <w:i/>
-          <w:iCs/>
-        </w:rPr>
-        <w:t>t_ST</w:t>
-      </w:r>
-      <w:proofErr w:type="spellEnd"/>
-      <w:proofErr w:type="gramStart"/>
-      <w:r>
-        <w:rPr>
-          <w:rFonts w:ascii="Cambria Math" w:eastAsia="Cambria Math" w:hAnsi="Cambria Math" w:cs="Cambria Math"/>
-          <w:i/>
-          <w:iCs/>
-        </w:rPr>
-        <w:t>|  &lt;</w:t>
-      </w:r>
-      <w:proofErr w:type="gramEnd"/>
-      <w:r>
-        <w:rPr>
-          <w:rFonts w:ascii="Cambria Math" w:eastAsia="Cambria Math" w:hAnsi="Cambria Math" w:cs="Cambria Math"/>
-          <w:i/>
-          <w:iCs/>
-        </w:rPr>
-        <w:t xml:space="preserve">  20 </w:t>
-      </w:r>
-      <w:proofErr w:type="spellStart"/>
-      <w:r>
-        <w:rPr>
-          <w:rFonts w:ascii="Cambria Math" w:eastAsia="Cambria Math" w:hAnsi="Cambria Math" w:cs="Cambria Math"/>
-          <w:i/>
-          <w:iCs/>
-        </w:rPr>
-        <w:t>ms</w:t>
-      </w:r>
-      <w:proofErr w:type="spellEnd"/>
-      <w:r>
-        <w:rPr>
-          <w:rFonts w:ascii="Cambria Math" w:eastAsia="Cambria Math" w:hAnsi="Cambria Math" w:cs="Cambria Math"/>
-          <w:i/>
-          <w:iCs/>
-        </w:rPr>
-        <w:t xml:space="preserve">  →  veto</w:t>
+        <w:t>N_sync × 2 × 20 ms = 359 × 40 ms ≈ 14.4 s</w:t>
+      </w:r>
+      <w:r>
+        <w:t xml:space="preserve"> per Nano, giving an effective run duration of approximately 3 576 s (59.6 min).</w:t>
+      </w:r>
+    </w:p>
+    <w:p>
+      <w:pPr>
+        <w:pStyle w:val="Heading1"/>
+      </w:pPr>
+      <w:r>
+        <w:t>5. Analysis Narrative and Plot Discussion</w:t>
       </w:r>
     </w:p>
     <w:p>
@@ -1903,79 +813,6 @@
         <w:spacing w:after="160"/>
       </w:pPr>
       <w:r>
-        <w:t xml:space="preserve">In the February 27 data, 137 of 28 935 events (0.47%) were vetoed. The veto reduces the effective live time by </w:t>
-      </w:r>
-      <w:proofErr w:type="spellStart"/>
-      <w:r>
-        <w:rPr>
-          <w:rFonts w:ascii="Cambria Math" w:eastAsia="Cambria Math" w:hAnsi="Cambria Math" w:cs="Cambria Math"/>
-          <w:i/>
-          <w:iCs/>
-        </w:rPr>
-        <w:t>N_sync</w:t>
-      </w:r>
-      <w:proofErr w:type="spellEnd"/>
-      <w:r>
-        <w:rPr>
-          <w:rFonts w:ascii="Cambria Math" w:eastAsia="Cambria Math" w:hAnsi="Cambria Math" w:cs="Cambria Math"/>
-          <w:i/>
-          <w:iCs/>
-        </w:rPr>
-        <w:t xml:space="preserve"> × 2 × 20 </w:t>
-      </w:r>
-      <w:proofErr w:type="spellStart"/>
-      <w:r>
-        <w:rPr>
-          <w:rFonts w:ascii="Cambria Math" w:eastAsia="Cambria Math" w:hAnsi="Cambria Math" w:cs="Cambria Math"/>
-          <w:i/>
-          <w:iCs/>
-        </w:rPr>
-        <w:t>ms</w:t>
-      </w:r>
-      <w:proofErr w:type="spellEnd"/>
-      <w:r>
-        <w:rPr>
-          <w:rFonts w:ascii="Cambria Math" w:eastAsia="Cambria Math" w:hAnsi="Cambria Math" w:cs="Cambria Math"/>
-          <w:i/>
-          <w:iCs/>
-        </w:rPr>
-        <w:t xml:space="preserve"> = 359 × 40 </w:t>
-      </w:r>
-      <w:proofErr w:type="spellStart"/>
-      <w:r>
-        <w:rPr>
-          <w:rFonts w:ascii="Cambria Math" w:eastAsia="Cambria Math" w:hAnsi="Cambria Math" w:cs="Cambria Math"/>
-          <w:i/>
-          <w:iCs/>
-        </w:rPr>
-        <w:t>ms</w:t>
-      </w:r>
-      <w:proofErr w:type="spellEnd"/>
-      <w:r>
-        <w:rPr>
-          <w:rFonts w:ascii="Cambria Math" w:eastAsia="Cambria Math" w:hAnsi="Cambria Math" w:cs="Cambria Math"/>
-          <w:i/>
-          <w:iCs/>
-        </w:rPr>
-        <w:t xml:space="preserve"> ≈ 14.4 s</w:t>
-      </w:r>
-      <w:r>
-        <w:t xml:space="preserve"> per Nano, giving an effective run duration of approximately 3 576 s (59.6 min).</w:t>
-      </w:r>
-    </w:p>
-    <w:p>
-      <w:pPr>
-        <w:pStyle w:val="Heading1"/>
-      </w:pPr>
-      <w:r>
-        <w:t>5. Analysis Narrative and Plot Discussion</w:t>
-      </w:r>
-    </w:p>
-    <w:p>
-      <w:pPr>
-        <w:spacing w:after="160"/>
-      </w:pPr>
-      <w:r>
         <w:t>The analysis was developed interactively in two stages. The first stage was an exploratory and calibration phase conducted in a Claude.ai chat session, during which the data structure was examined, calibration strategies were compared, and the coincidence pipeline was designed. The second stage was a clean reproduction run using the fully specified pipeline in a scripted environment. The plots from both stages are discussed below.</w:t>
       </w:r>
     </w:p>
@@ -1983,13 +820,8 @@
       <w:pPr>
         <w:pStyle w:val="Heading2"/>
       </w:pPr>
-      <w:proofErr w:type="gramStart"/>
-      <w:r>
-        <w:t>5.1  Exploratory</w:t>
-      </w:r>
-      <w:proofErr w:type="gramEnd"/>
-      <w:r>
-        <w:t xml:space="preserve"> Phase: Per-Detector Rates</w:t>
+      <w:r>
+        <w:t>5.1  Exploratory Phase: Per-Detector Rates</w:t>
       </w:r>
     </w:p>
     <w:p>
@@ -2078,13 +910,8 @@
       <w:pPr>
         <w:pStyle w:val="Heading2"/>
       </w:pPr>
-      <w:proofErr w:type="gramStart"/>
-      <w:r>
-        <w:t>5.2  Master</w:t>
-      </w:r>
-      <w:proofErr w:type="gramEnd"/>
-      <w:r>
-        <w:t>-Referenced Clock Offsets</w:t>
+      <w:r>
+        <w:t>5.2  Master-Referenced Clock Offsets</w:t>
       </w:r>
     </w:p>
     <w:p>
@@ -2092,62 +919,18 @@
         <w:spacing w:after="160"/>
       </w:pPr>
       <w:r>
-        <w:t xml:space="preserve">The next step was to </w:t>
-      </w:r>
-      <w:proofErr w:type="spellStart"/>
-      <w:r>
-        <w:t>visualise</w:t>
-      </w:r>
-      <w:proofErr w:type="spellEnd"/>
-      <w:r>
-        <w:t xml:space="preserve"> the clock structure by plotting, for each sync event k, the difference </w:t>
-      </w:r>
-      <w:proofErr w:type="spellStart"/>
+        <w:t xml:space="preserve">The next step was to visualise the clock structure by plotting, for each sync event k, the difference </w:t>
+      </w:r>
       <w:r>
         <w:rPr>
           <w:rFonts w:ascii="Cambria Math" w:eastAsia="Cambria Math" w:hAnsi="Cambria Math" w:cs="Cambria Math"/>
           <w:i/>
           <w:iCs/>
         </w:rPr>
-        <w:t>NanoST</w:t>
-      </w:r>
-      <w:proofErr w:type="spellEnd"/>
-      <w:r>
-        <w:rPr>
-          <w:rFonts w:ascii="Cambria Math" w:eastAsia="Cambria Math" w:hAnsi="Cambria Math" w:cs="Cambria Math"/>
-          <w:i/>
-          <w:iCs/>
-        </w:rPr>
-        <w:t xml:space="preserve">[k] − </w:t>
-      </w:r>
-      <w:proofErr w:type="spellStart"/>
-      <w:r>
-        <w:rPr>
-          <w:rFonts w:ascii="Cambria Math" w:eastAsia="Cambria Math" w:hAnsi="Cambria Math" w:cs="Cambria Math"/>
-          <w:i/>
-          <w:iCs/>
-        </w:rPr>
-        <w:t>MasterSync</w:t>
-      </w:r>
-      <w:proofErr w:type="spellEnd"/>
-      <w:r>
-        <w:rPr>
-          <w:rFonts w:ascii="Cambria Math" w:eastAsia="Cambria Math" w:hAnsi="Cambria Math" w:cs="Cambria Math"/>
-          <w:i/>
-          <w:iCs/>
-        </w:rPr>
-        <w:t>[k]</w:t>
-      </w:r>
-      <w:r>
-        <w:t xml:space="preserve"> — </w:t>
-      </w:r>
-      <w:proofErr w:type="gramStart"/>
-      <w:r>
-        <w:t>i.e.</w:t>
-      </w:r>
-      <w:proofErr w:type="gramEnd"/>
-      <w:r>
-        <w:t xml:space="preserve"> the Nano's time minus the Uno's time for the same sync event — as a function of time. This is the simplest approach but, as discussed in Section 2, the master's timestamp is imprecise.</w:t>
+        <w:t>NanoST[k] − MasterSync[k]</w:t>
+      </w:r>
+      <w:r>
+        <w:t xml:space="preserve"> — i.e. the Nano's time minus the Uno's time for the same sync event — as a function of time. This is the simplest approach but, as discussed in Section 2, the master's timestamp is imprecise.</w:t>
       </w:r>
     </w:p>
     <w:p>
@@ -2212,51 +995,7 @@
           <w:sz w:val="18"/>
           <w:szCs w:val="18"/>
         </w:rPr>
-        <w:t xml:space="preserve">Figure 2. Master-referenced clock offsets: </w:t>
-      </w:r>
-      <w:proofErr w:type="spellStart"/>
-      <w:r>
-        <w:rPr>
-          <w:i/>
-          <w:iCs/>
-          <w:color w:val="555555"/>
-          <w:sz w:val="18"/>
-          <w:szCs w:val="18"/>
-        </w:rPr>
-        <w:t>NanoST</w:t>
-      </w:r>
-      <w:proofErr w:type="spellEnd"/>
-      <w:r>
-        <w:rPr>
-          <w:i/>
-          <w:iCs/>
-          <w:color w:val="555555"/>
-          <w:sz w:val="18"/>
-          <w:szCs w:val="18"/>
-        </w:rPr>
-        <w:t xml:space="preserve">[k] − </w:t>
-      </w:r>
-      <w:proofErr w:type="spellStart"/>
-      <w:r>
-        <w:rPr>
-          <w:i/>
-          <w:iCs/>
-          <w:color w:val="555555"/>
-          <w:sz w:val="18"/>
-          <w:szCs w:val="18"/>
-        </w:rPr>
-        <w:t>MasterSync</w:t>
-      </w:r>
-      <w:proofErr w:type="spellEnd"/>
-      <w:r>
-        <w:rPr>
-          <w:i/>
-          <w:iCs/>
-          <w:color w:val="555555"/>
-          <w:sz w:val="18"/>
-          <w:szCs w:val="18"/>
-        </w:rPr>
-        <w:t>[k] for each of the eight Nanos vs. sync index, after removing the linear trend. Large residuals of 4 000–7 000 µs are clearly visible, far exceeding what crystal drift alone would produce in a 10-second interval.</w:t>
+        <w:t>Figure 2. Master-referenced clock offsets: NanoST[k] − MasterSync[k] for each of the eight Nanos vs. sync index, after removing the linear trend. Large residuals of 4 000–7 000 µs are clearly visible, far exceeding what crystal drift alone would produce in a 10-second interval.</w:t>
       </w:r>
     </w:p>
     <w:p>
@@ -2265,77 +1004,31 @@
       </w:pPr>
       <w:r>
         <w:lastRenderedPageBreak/>
-        <w:t xml:space="preserve">The linear drift is large and clear — up to several seconds over the hour — and is straightforwardly removed by a linear fit. However, after linear detrending the residuals are enormous: σ ≈ 4 000–7 000 µs, with excursions up to ~18 </w:t>
-      </w:r>
-      <w:proofErr w:type="spellStart"/>
-      <w:r>
-        <w:t>ms</w:t>
-      </w:r>
-      <w:proofErr w:type="spellEnd"/>
-      <w:r>
-        <w:t xml:space="preserve"> for Nano 8. This is orders of magnitude larger than the ~50–100 ppm crystal noise expected over a 10-second sync interval. These large residuals are a consequence of the imprecision in the master's software-logged sync time and the ST delivery-priority mechanism described in Section 2.2 — they do not reflect the true inter-Nano timing uncertainty.</w:t>
+        <w:t>The linear drift is large and clear — up to several seconds over the hour — and is straightforwardly removed by a linear fit. However, after linear detrending the residuals are enormous: σ ≈ 4 000–7 000 µs, with excursions up to ~18 ms for Nano 8. This is orders of magnitude larger than the ~50–100 ppm crystal noise expected over a 10-second sync interval. These large residuals are a consequence of the imprecision in the master's software-logged sync time and the ST delivery-priority mechanism described in Section 2.2 — they do not reflect the true inter-Nano timing uncertainty.</w:t>
       </w:r>
     </w:p>
     <w:p>
       <w:pPr>
         <w:pStyle w:val="Heading2"/>
       </w:pPr>
-      <w:proofErr w:type="gramStart"/>
-      <w:r>
-        <w:t>5.3  Pairwise</w:t>
-      </w:r>
-      <w:proofErr w:type="gramEnd"/>
-      <w:r>
-        <w:t xml:space="preserve"> Nano-to-Nano Offsets</w:t>
+      <w:r>
+        <w:t>5.3  Pairwise Nano-to-Nano Offsets</w:t>
       </w:r>
     </w:p>
     <w:p>
       <w:pPr>
         <w:spacing w:after="160"/>
       </w:pPr>
-      <w:proofErr w:type="spellStart"/>
-      <w:r>
-        <w:t>Recognising</w:t>
-      </w:r>
-      <w:proofErr w:type="spellEnd"/>
-      <w:r>
-        <w:t xml:space="preserve"> that the master timestamps were the problem, the analysis was repeated using Nano-to-Nano differences directly: for each sync event k, the difference </w:t>
-      </w:r>
-      <w:proofErr w:type="gramStart"/>
+      <w:r>
+        <w:t xml:space="preserve">Recognising that the master timestamps were the problem, the analysis was repeated using Nano-to-Nano differences directly: for each sync event k, the difference </w:t>
+      </w:r>
       <w:r>
         <w:rPr>
           <w:rFonts w:ascii="Cambria Math" w:eastAsia="Cambria Math" w:hAnsi="Cambria Math" w:cs="Cambria Math"/>
           <w:i/>
           <w:iCs/>
         </w:rPr>
-        <w:t>ST[</w:t>
-      </w:r>
-      <w:proofErr w:type="gramEnd"/>
-      <w:r>
-        <w:rPr>
-          <w:rFonts w:ascii="Cambria Math" w:eastAsia="Cambria Math" w:hAnsi="Cambria Math" w:cs="Cambria Math"/>
-          <w:i/>
-          <w:iCs/>
-        </w:rPr>
-        <w:t xml:space="preserve">k, </w:t>
-      </w:r>
-      <w:proofErr w:type="spellStart"/>
-      <w:r>
-        <w:rPr>
-          <w:rFonts w:ascii="Cambria Math" w:eastAsia="Cambria Math" w:hAnsi="Cambria Math" w:cs="Cambria Math"/>
-          <w:i/>
-          <w:iCs/>
-        </w:rPr>
-        <w:t>i</w:t>
-      </w:r>
-      <w:proofErr w:type="spellEnd"/>
-      <w:r>
-        <w:rPr>
-          <w:rFonts w:ascii="Cambria Math" w:eastAsia="Cambria Math" w:hAnsi="Cambria Math" w:cs="Cambria Math"/>
-          <w:i/>
-          <w:iCs/>
-        </w:rPr>
-        <w:t>] − ST[k, 1]</w:t>
+        <w:t>ST[k, i] − ST[k, 1]</w:t>
       </w:r>
       <w:r>
         <w:t xml:space="preserve"> was plotted for all seven non-reference Nanos.</w:t>
@@ -2403,53 +1096,7 @@
           <w:sz w:val="18"/>
           <w:szCs w:val="18"/>
         </w:rPr>
-        <w:t>Figure 3. Raw pairwise clock offsets: ST[</w:t>
-      </w:r>
-      <w:proofErr w:type="spellStart"/>
-      <w:proofErr w:type="gramStart"/>
-      <w:r>
-        <w:rPr>
-          <w:i/>
-          <w:iCs/>
-          <w:color w:val="555555"/>
-          <w:sz w:val="18"/>
-          <w:szCs w:val="18"/>
-        </w:rPr>
-        <w:t>k,i</w:t>
-      </w:r>
-      <w:proofErr w:type="spellEnd"/>
-      <w:proofErr w:type="gramEnd"/>
-      <w:r>
-        <w:rPr>
-          <w:i/>
-          <w:iCs/>
-          <w:color w:val="555555"/>
-          <w:sz w:val="18"/>
-          <w:szCs w:val="18"/>
-        </w:rPr>
-        <w:t xml:space="preserve">] − ST[k,1] for each Nano </w:t>
-      </w:r>
-      <w:proofErr w:type="spellStart"/>
-      <w:r>
-        <w:rPr>
-          <w:i/>
-          <w:iCs/>
-          <w:color w:val="555555"/>
-          <w:sz w:val="18"/>
-          <w:szCs w:val="18"/>
-        </w:rPr>
-        <w:t>i</w:t>
-      </w:r>
-      <w:proofErr w:type="spellEnd"/>
-      <w:r>
-        <w:rPr>
-          <w:i/>
-          <w:iCs/>
-          <w:color w:val="555555"/>
-          <w:sz w:val="18"/>
-          <w:szCs w:val="18"/>
-        </w:rPr>
-        <w:t xml:space="preserve"> vs. sync event index. Smooth linear drift is visible, but discrete jumps of varying sizes are also clearly present in several Nanos, most notably Nanos 3, 7, and 8.</w:t>
+        <w:t>Figure 3. Raw pairwise clock offsets: ST[k,i] − ST[k,1] for each Nano i vs. sync event index. Smooth linear drift is visible, but discrete jumps of varying sizes are also clearly present in several Nanos, most notably Nanos 3, 7, and 8.</w:t>
       </w:r>
     </w:p>
     <w:p>
@@ -2538,13 +1185,8 @@
       <w:pPr>
         <w:pStyle w:val="Heading2"/>
       </w:pPr>
-      <w:proofErr w:type="gramStart"/>
-      <w:r>
-        <w:t>5.4  Piecewise</w:t>
-      </w:r>
-      <w:proofErr w:type="gramEnd"/>
-      <w:r>
-        <w:t xml:space="preserve"> Interpolation: Comparing Calibration Versions</w:t>
+      <w:r>
+        <w:t>5.4  Piecewise Interpolation: Comparing Calibration Versions</w:t>
       </w:r>
     </w:p>
     <w:p>
@@ -2642,7 +1284,7 @@
           <wp:inline distT="0" distB="0" distL="0" distR="0">
             <wp:extent cx="4572000" cy="3914775"/>
             <wp:effectExtent l="0" t="0" r="0" b="0"/>
-            <wp:docPr id="1531413560" name="Figure 6. Interval-to-interval change in the pairwise offset under piecewise calibration (v3). This is the true timing resolution floor: the RMS change in offset across consecutive 10-second sync intervals, which sets the maximum interpolation error for any PT event. Values range from σ ≈ 1 500 µs (Nano 7) to σ ≈ 2 000 µs (Nano 6)." descr="Figure 6. Interval-to-interval change in the pairwise offset under piecewise calibration (v3). This is the true timing resolution floor: the RMS change in offset across consecutive 10-second sync intervals, which sets the maximum interpolation error for any PT event. Values range from σ ≈ 1 500 µs (Nano 7) to σ ≈ 2 000 µs (Nano 6)." title="Figure 6. Interval-to-interval change in the pairwise offset under piecewise calibration (v3). This is the true timing resolution floor: the RMS change in offset across consecutive 10-second sync intervals, which sets the maximum interpolation error for any PT event. Values range from σ ≈ 1 500 µs (Nano 7) to σ ≈ 2 000 µs (Nano 6)."/>
+            <wp:docPr id="1531413560" name="Figure 6. Interval-to-interval change in the pairwise offset under piecewise calibration (v3). This plot shows the change in pairwise offset per 10-second sync interval. The flat baseline for each Nano reflects steady crystal drift. The isolated spikes are firmware timing artifacts (interrupt deferral during I²C callbacks), affecting ~1.4% of intervals. The RMS of the full distribution (1,500–2,000 µs) is dominated by these spikes. Excluding spike intervals, the true timing floor is 0.005–0.164 ms across all Nanos (combined RMS ≈ 75 µs), which is the physically meaningful calibration accuracy for PT events in normal intervals." descr="Figure 6. Interval-to-interval change in the pairwise offset under piecewise calibration (v3). This plot shows the change in pairwise offset per 10-second sync interval. The flat baseline for each Nano reflects steady crystal drift. The isolated spikes are firmware timing artifacts (interrupt deferral during I²C callbacks), affecting ~1.4% of intervals. The RMS of the full distribution (1,500–2,000 µs) is dominated by these spikes. Excluding spike intervals, the true timing floor is 0.005–0.164 ms across all Nanos (combined RMS ≈ 75 µs), which is the physically meaningful calibration accuracy for PT events in normal intervals." title="Figure 6. Interval-to-interval change in the pairwise offset under piecewise calibration (v3). This plot shows the change in pairwise offset per 10-second sync interval. The flat baseline for each Nano reflects steady crystal drift. The isolated spikes are firmware timing artifacts (interrupt deferral during I²C callbacks), affecting ~1.4% of intervals. The RMS of the full distribution (1,500–2,000 µs) is dominated by these spikes. Excluding spike intervals, the true timing floor is 0.005–0.164 ms across all Nanos (combined RMS ≈ 75 µs), which is the physically meaningful calibration accuracy for PT events in normal intervals."/>
             <wp:cNvGraphicFramePr>
               <a:graphicFrameLocks xmlns:a="http://schemas.openxmlformats.org/drawingml/2006/main" noChangeAspect="1"/>
             </wp:cNvGraphicFramePr>
@@ -2691,7 +1333,7 @@
           <w:sz w:val="18"/>
           <w:szCs w:val="18"/>
         </w:rPr>
-        <w:t>Figure 6. Interval-to-interval change in the pairwise offset under piecewise calibration (v3). This is the true timing resolution floor: the RMS change in offset across consecutive 10-second sync intervals, which sets the maximum interpolation error for any PT event. Values range from σ ≈ 1 500 µs (Nano 7) to σ ≈ 2 000 µs (Nano 6).</w:t>
+        <w:t>Figure 6. Interval-to-interval change in the pairwise offset under piecewise calibration (v3). This plot shows the change in pairwise offset per 10-second sync interval. The flat baseline for each Nano reflects steady crystal drift. The isolated spikes are firmware timing artifacts (interrupt deferral during I²C callbacks), affecting ~1.4% of intervals. The RMS of the full distribution (1,500–2,000 µs) is dominated by these spikes. Excluding spike intervals, the true timing floor is 0.005–0.164 ms across all Nanos (combined RMS ≈ 75 µs), which is the physically meaningful calibration accuracy for PT events in normal intervals.</w:t>
       </w:r>
     </w:p>
     <w:p>
@@ -2700,7 +1342,7 @@
       </w:pPr>
       <w:r>
         <w:lastRenderedPageBreak/>
-        <w:t>Under piecewise calibration the residual timing uncertainty is σ ≈ 1 500–2 000 µs — approximately three times better than the master-referenced approach. This sets the effective timing resolution floor for coincidence analysis. A PT event falls, on average, in the middle of a 10-second sync interval, so the maximum interpolation error is half the interval's drift change. The piecewise method is also exact at the sync points themselves, meaning it has zero error at those moments by construction.</w:t>
+        <w:t>The RMS of the per-interval offset change across all intervals is σ ≈ 1,500–2,000 µs per Nano — but this is dominated by isolated spike intervals caused by firmware timing artifacts. Approximately 1.4% of intervals are affected. Excluding those intervals, the true timing floor is 0.005–0.164 ms (combined RMS ≈ 75 µs). This is the calibration accuracy that applies to PT events in normal intervals, which constitute 98.6% of the run. The 1 ms coincidence window is therefore well-justified by the calibration quality. The spike intervals are handled by the jump veto described in Section 4.3.</w:t>
       </w:r>
     </w:p>
     <w:p>
@@ -2708,15 +1350,7 @@
         <w:spacing w:after="160"/>
       </w:pPr>
       <w:r>
-        <w:t xml:space="preserve">For comparison, the final </w:t>
-      </w:r>
-      <w:proofErr w:type="spellStart"/>
-      <w:r>
-        <w:t>Cowork</w:t>
-      </w:r>
-      <w:proofErr w:type="spellEnd"/>
-      <w:r>
-        <w:t xml:space="preserve"> reproduction run produces the equivalent plot:</w:t>
+        <w:t>For comparison, the final Cowork reproduction run produces the equivalent plot:</w:t>
       </w:r>
     </w:p>
     <w:p>
@@ -2781,47 +1415,15 @@
           <w:sz w:val="18"/>
           <w:szCs w:val="18"/>
         </w:rPr>
-        <w:t xml:space="preserve">Figure 7. Calibration residuals from the </w:t>
-      </w:r>
-      <w:proofErr w:type="spellStart"/>
-      <w:r>
-        <w:rPr>
-          <w:i/>
-          <w:iCs/>
-          <w:color w:val="555555"/>
-          <w:sz w:val="18"/>
-          <w:szCs w:val="18"/>
-        </w:rPr>
-        <w:t>Cowork</w:t>
-      </w:r>
-      <w:proofErr w:type="spellEnd"/>
-      <w:r>
-        <w:rPr>
-          <w:i/>
-          <w:iCs/>
-          <w:color w:val="555555"/>
-          <w:sz w:val="18"/>
-          <w:szCs w:val="18"/>
-        </w:rPr>
-        <w:t xml:space="preserve"> reproduction run (piecewise interpolation, v3 equivalent). The per-interval drift changes are consistent with the chat-session result, confirming pipeline reproducibility.</w:t>
+        <w:t>Figure 7. Calibration residuals from the Cowork reproduction run (piecewise interpolation, v3 equivalent). The per-interval drift changes are consistent with the chat-session result, confirming pipeline reproducibility.</w:t>
       </w:r>
     </w:p>
     <w:p>
       <w:pPr>
         <w:pStyle w:val="Heading2"/>
       </w:pPr>
-      <w:proofErr w:type="gramStart"/>
-      <w:r>
-        <w:t xml:space="preserve">5.5  </w:t>
-      </w:r>
-      <w:proofErr w:type="spellStart"/>
-      <w:r>
-        <w:t>Cowork</w:t>
-      </w:r>
-      <w:proofErr w:type="spellEnd"/>
-      <w:proofErr w:type="gramEnd"/>
-      <w:r>
-        <w:t xml:space="preserve"> Run: Clock Offsets</w:t>
+      <w:r>
+        <w:t>5.5  Cowork Run: Clock Offsets</w:t>
       </w:r>
     </w:p>
     <w:p>
@@ -2886,51 +1488,7 @@
           <w:sz w:val="18"/>
           <w:szCs w:val="18"/>
         </w:rPr>
-        <w:t>Figure 8. Pairwise clock offsets (</w:t>
-      </w:r>
-      <w:proofErr w:type="spellStart"/>
-      <w:r>
-        <w:rPr>
-          <w:i/>
-          <w:iCs/>
-          <w:color w:val="555555"/>
-          <w:sz w:val="18"/>
-          <w:szCs w:val="18"/>
-        </w:rPr>
-        <w:t>Nano_i</w:t>
-      </w:r>
-      <w:proofErr w:type="spellEnd"/>
-      <w:r>
-        <w:rPr>
-          <w:i/>
-          <w:iCs/>
-          <w:color w:val="555555"/>
-          <w:sz w:val="18"/>
-          <w:szCs w:val="18"/>
-        </w:rPr>
-        <w:t xml:space="preserve"> − Nano_1) from the </w:t>
-      </w:r>
-      <w:proofErr w:type="spellStart"/>
-      <w:r>
-        <w:rPr>
-          <w:i/>
-          <w:iCs/>
-          <w:color w:val="555555"/>
-          <w:sz w:val="18"/>
-          <w:szCs w:val="18"/>
-        </w:rPr>
-        <w:t>Cowork</w:t>
-      </w:r>
-      <w:proofErr w:type="spellEnd"/>
-      <w:r>
-        <w:rPr>
-          <w:i/>
-          <w:iCs/>
-          <w:color w:val="555555"/>
-          <w:sz w:val="18"/>
-          <w:szCs w:val="18"/>
-        </w:rPr>
-        <w:t xml:space="preserve"> run, plotted vs. time in minutes with linear fits. Drift rates range from −139 ppm (Nano 5) to −1 263 ppm (Nano 8), demonstrating the necessity of calibration.</w:t>
+        <w:t>Figure 8. Pairwise clock offsets (Nano_i − Nano_1) from the Cowork run, plotted vs. time in minutes with linear fits. Drift rates range from −139 ppm (Nano 5) to −1 263 ppm (Nano 8), demonstrating the necessity of calibration.</w:t>
       </w:r>
     </w:p>
     <w:p>
@@ -2938,42 +1496,15 @@
         <w:spacing w:after="160"/>
       </w:pPr>
       <w:r>
-        <w:t xml:space="preserve">The </w:t>
-      </w:r>
-      <w:proofErr w:type="spellStart"/>
-      <w:r>
-        <w:t>Cowork</w:t>
-      </w:r>
-      <w:proofErr w:type="spellEnd"/>
-      <w:r>
-        <w:t xml:space="preserve"> run's clock-offset plots confirm the drift rates from the chat session. The linear fits are tight and the slopes are highly consistent between runs, as expected for a single data file. The large negative drifts of Nanos 3, 4, 7, and 8 (all below −900 ppm) indicate their crystals run significantly </w:t>
-      </w:r>
-      <w:r>
-        <w:t>slower</w:t>
-      </w:r>
-      <w:r>
-        <w:t xml:space="preserve"> than Nano 1.</w:t>
+        <w:t>The Cowork run's clock-offset plots confirm the drift rates from the chat session. The linear fits are tight and the slopes are highly consistent between runs, as expected for a single data file. The large negative drifts of Nanos 3, 4, 7, and 8 (all below −900 ppm) indicate their crystals run significantly slower than Nano 1.</w:t>
       </w:r>
     </w:p>
     <w:p>
       <w:pPr>
         <w:pStyle w:val="Heading2"/>
       </w:pPr>
-      <w:proofErr w:type="gramStart"/>
-      <w:r>
-        <w:t>5.6  Per</w:t>
-      </w:r>
-      <w:proofErr w:type="gramEnd"/>
-      <w:r>
-        <w:t>-Detector Rates (</w:t>
-      </w:r>
-      <w:proofErr w:type="spellStart"/>
-      <w:r>
-        <w:t>Cowork</w:t>
-      </w:r>
-      <w:proofErr w:type="spellEnd"/>
-      <w:r>
-        <w:t xml:space="preserve"> Run)</w:t>
+      <w:r>
+        <w:t>5.6  Per-Detector Rates (Cowork Run)</w:t>
       </w:r>
     </w:p>
     <w:p>
@@ -3039,75 +1570,42 @@
           <w:sz w:val="18"/>
           <w:szCs w:val="18"/>
         </w:rPr>
-        <w:t xml:space="preserve">Figure 9. Per-detector pulse rates from the </w:t>
-      </w:r>
-      <w:proofErr w:type="spellStart"/>
+        <w:t>Figure 9. Per-detector pulse rates from the Cowork run after calibration and sync veto: mean rates (left) and rate vs. time in 60-second bins (right). The mean dashed line at ~1.0 Hz is shown for reference.</w:t>
+      </w:r>
+    </w:p>
+    <w:p>
+      <w:pPr>
+        <w:spacing w:after="160"/>
+      </w:pPr>
+      <w:r>
+        <w:t>After calibration and the sync veto, rates are stable and consistent with the exploratory analysis. Nano 1 remains the most active detector at 1.25 Hz and Nano 6 the least active at 0.81 Hz. No detector shows the sudden rate increase that would indicate a sync-pulse bleedthrough artefact surviving the veto.</w:t>
+      </w:r>
+    </w:p>
+    <w:p>
+      <w:pPr>
+        <w:pStyle w:val="Heading1"/>
+      </w:pPr>
+      <w:r>
+        <w:t>6. Derivation of Expected Accidental Coincidence Rates</w:t>
+      </w:r>
+    </w:p>
+    <w:p>
+      <w:pPr>
+        <w:spacing w:after="160"/>
+      </w:pPr>
+      <w:r>
+        <w:t xml:space="preserve">After calibration and sync veto, each detector generates a sequence of independent Poisson-distributed particle events. Let detector </w:t>
+      </w:r>
       <w:r>
         <w:rPr>
           <w:i/>
           <w:iCs/>
-          <w:color w:val="555555"/>
-          <w:sz w:val="18"/>
-          <w:szCs w:val="18"/>
-        </w:rPr>
-        <w:t>Cowork</w:t>
-      </w:r>
-      <w:proofErr w:type="spellEnd"/>
-      <w:r>
-        <w:rPr>
-          <w:i/>
-          <w:iCs/>
-          <w:color w:val="555555"/>
-          <w:sz w:val="18"/>
-          <w:szCs w:val="18"/>
-        </w:rPr>
-        <w:t xml:space="preserve"> run after calibration and sync veto: mean rates (left) and rate vs. time in 60-second bins (right). The mean dashed line at ~1.0 Hz is shown for reference.</w:t>
-      </w:r>
-    </w:p>
-    <w:p>
-      <w:pPr>
-        <w:spacing w:after="160"/>
-      </w:pPr>
-      <w:r>
-        <w:t xml:space="preserve">After calibration and the sync veto, rates are stable and consistent with the exploratory analysis. Nano 1 remains the most active detector at 1.25 Hz and Nano 6 the least active at 0.81 Hz. No detector shows the sudden rate increase that would indicate a sync-pulse </w:t>
-      </w:r>
-      <w:proofErr w:type="spellStart"/>
-      <w:r>
-        <w:t>bleedthrough</w:t>
-      </w:r>
-      <w:proofErr w:type="spellEnd"/>
-      <w:r>
-        <w:t xml:space="preserve"> artefact surviving the veto.</w:t>
-      </w:r>
-    </w:p>
-    <w:p>
-      <w:pPr>
-        <w:pStyle w:val="Heading1"/>
-      </w:pPr>
-      <w:r>
-        <w:t>6. Derivation of Expected Accidental Coincidence Rates</w:t>
-      </w:r>
-    </w:p>
-    <w:p>
-      <w:pPr>
-        <w:spacing w:after="160"/>
-      </w:pPr>
-      <w:r>
-        <w:t xml:space="preserve">After calibration and sync veto, each detector generates a sequence of independent Poisson-distributed particle events. Let detector </w:t>
-      </w:r>
-      <w:proofErr w:type="spellStart"/>
-      <w:r>
-        <w:rPr>
-          <w:i/>
-          <w:iCs/>
         </w:rPr>
         <w:t>i</w:t>
       </w:r>
-      <w:proofErr w:type="spellEnd"/>
       <w:r>
         <w:t xml:space="preserve"> have measured rate </w:t>
       </w:r>
-      <w:proofErr w:type="spellStart"/>
       <w:r>
         <w:rPr>
           <w:rFonts w:ascii="Cambria Math" w:eastAsia="Cambria Math" w:hAnsi="Cambria Math" w:cs="Cambria Math"/>
@@ -3116,11 +1614,9 @@
         </w:rPr>
         <w:t>r_i</w:t>
       </w:r>
-      <w:proofErr w:type="spellEnd"/>
       <w:r>
         <w:t xml:space="preserve"> (Hz) over effective run duration </w:t>
       </w:r>
-      <w:proofErr w:type="spellStart"/>
       <w:r>
         <w:rPr>
           <w:rFonts w:ascii="Cambria Math" w:eastAsia="Cambria Math" w:hAnsi="Cambria Math" w:cs="Cambria Math"/>
@@ -3129,7 +1625,6 @@
         </w:rPr>
         <w:t>T_eff</w:t>
       </w:r>
-      <w:proofErr w:type="spellEnd"/>
       <w:r>
         <w:t xml:space="preserve"> (seconds). We derive the expected number of times k specified detectors all fire within a time window of half-width τ purely by chance.</w:t>
       </w:r>
@@ -3138,13 +1633,8 @@
       <w:pPr>
         <w:pStyle w:val="Heading2"/>
       </w:pPr>
-      <w:proofErr w:type="gramStart"/>
-      <w:r>
-        <w:t>6.1  Two</w:t>
-      </w:r>
-      <w:proofErr w:type="gramEnd"/>
-      <w:r>
-        <w:t>-Fold Accidentals</w:t>
+      <w:r>
+        <w:t>6.1  Two-Fold Accidentals</w:t>
       </w:r>
     </w:p>
     <w:p>
@@ -3152,17 +1642,8 @@
         <w:spacing w:after="160"/>
       </w:pPr>
       <w:r>
-        <w:t xml:space="preserve">Consider detectors </w:t>
-      </w:r>
-      <w:proofErr w:type="spellStart"/>
-      <w:r>
-        <w:t>i</w:t>
-      </w:r>
-      <w:proofErr w:type="spellEnd"/>
-      <w:r>
-        <w:t xml:space="preserve"> and j with rates </w:t>
-      </w:r>
-      <w:proofErr w:type="spellStart"/>
+        <w:t xml:space="preserve">Consider detectors i and j with rates </w:t>
+      </w:r>
       <w:r>
         <w:rPr>
           <w:rFonts w:ascii="Cambria Math" w:eastAsia="Cambria Math" w:hAnsi="Cambria Math" w:cs="Cambria Math"/>
@@ -3171,11 +1652,9 @@
         </w:rPr>
         <w:t>r_i</w:t>
       </w:r>
-      <w:proofErr w:type="spellEnd"/>
       <w:r>
         <w:t xml:space="preserve"> and </w:t>
       </w:r>
-      <w:proofErr w:type="spellStart"/>
       <w:r>
         <w:rPr>
           <w:rFonts w:ascii="Cambria Math" w:eastAsia="Cambria Math" w:hAnsi="Cambria Math" w:cs="Cambria Math"/>
@@ -3184,107 +1663,34 @@
         </w:rPr>
         <w:t>r_j</w:t>
       </w:r>
-      <w:proofErr w:type="spellEnd"/>
-      <w:r>
-        <w:t xml:space="preserve">. Designate detector </w:t>
-      </w:r>
-      <w:proofErr w:type="spellStart"/>
-      <w:r>
-        <w:t>i</w:t>
-      </w:r>
-      <w:proofErr w:type="spellEnd"/>
-      <w:r>
-        <w:t xml:space="preserve"> as the 'trigger': it fires at some time t, and we ask whether detector j also fires within the symmetric window [t−τ, </w:t>
-      </w:r>
-      <w:proofErr w:type="spellStart"/>
-      <w:r>
-        <w:t>t+τ</w:t>
-      </w:r>
-      <w:proofErr w:type="spellEnd"/>
-      <w:r>
-        <w:t xml:space="preserve">] of width 2τ. Because detector j's events are a Poisson process, the probability that at least one falls in any window of width 2τ is, for small </w:t>
-      </w:r>
-      <w:proofErr w:type="spellStart"/>
+      <w:r>
+        <w:t xml:space="preserve">. Designate detector i as the 'trigger': it fires at some time t, and we ask whether detector j also fires within the symmetric window [t−τ, t+τ] of width 2τ. Because detector j's events are a Poisson process, the probability that at least one falls in any window of width 2τ is, for small </w:t>
+      </w:r>
       <w:r>
         <w:rPr>
           <w:rFonts w:ascii="Cambria Math" w:eastAsia="Cambria Math" w:hAnsi="Cambria Math" w:cs="Cambria Math"/>
           <w:i/>
           <w:iCs/>
         </w:rPr>
-        <w:t>r_j</w:t>
-      </w:r>
-      <w:proofErr w:type="spellEnd"/>
+        <w:t>r_j × 2τ</w:t>
+      </w:r>
+      <w:r>
+        <w:t>:</w:t>
+      </w:r>
+    </w:p>
+    <w:p>
+      <w:pPr>
+        <w:spacing w:before="140" w:after="140"/>
+        <w:ind w:left="720" w:right="720"/>
+        <w:jc w:val="center"/>
+      </w:pPr>
       <w:r>
         <w:rPr>
           <w:rFonts w:ascii="Cambria Math" w:eastAsia="Cambria Math" w:hAnsi="Cambria Math" w:cs="Cambria Math"/>
           <w:i/>
           <w:iCs/>
         </w:rPr>
-        <w:t xml:space="preserve"> × 2τ</w:t>
-      </w:r>
-      <w:r>
-        <w:t>:</w:t>
-      </w:r>
-    </w:p>
-    <w:p>
-      <w:pPr>
-        <w:spacing w:before="140" w:after="140"/>
-        <w:ind w:left="720" w:right="720"/>
-        <w:jc w:val="center"/>
-      </w:pPr>
-      <w:proofErr w:type="gramStart"/>
-      <w:r>
-        <w:rPr>
-          <w:rFonts w:ascii="Cambria Math" w:eastAsia="Cambria Math" w:hAnsi="Cambria Math" w:cs="Cambria Math"/>
-          <w:i/>
-          <w:iCs/>
-        </w:rPr>
-        <w:t>P(</w:t>
-      </w:r>
-      <w:proofErr w:type="gramEnd"/>
-      <w:r>
-        <w:rPr>
-          <w:rFonts w:ascii="Cambria Math" w:eastAsia="Cambria Math" w:hAnsi="Cambria Math" w:cs="Cambria Math"/>
-          <w:i/>
-          <w:iCs/>
-        </w:rPr>
-        <w:t xml:space="preserve">j fires in window | </w:t>
-      </w:r>
-      <w:proofErr w:type="spellStart"/>
-      <w:r>
-        <w:rPr>
-          <w:rFonts w:ascii="Cambria Math" w:eastAsia="Cambria Math" w:hAnsi="Cambria Math" w:cs="Cambria Math"/>
-          <w:i/>
-          <w:iCs/>
-        </w:rPr>
-        <w:t>i</w:t>
-      </w:r>
-      <w:proofErr w:type="spellEnd"/>
-      <w:r>
-        <w:rPr>
-          <w:rFonts w:ascii="Cambria Math" w:eastAsia="Cambria Math" w:hAnsi="Cambria Math" w:cs="Cambria Math"/>
-          <w:i/>
-          <w:iCs/>
-        </w:rPr>
-        <w:t xml:space="preserve"> triggered)  ≈  </w:t>
-      </w:r>
-      <w:proofErr w:type="spellStart"/>
-      <w:r>
-        <w:rPr>
-          <w:rFonts w:ascii="Cambria Math" w:eastAsia="Cambria Math" w:hAnsi="Cambria Math" w:cs="Cambria Math"/>
-          <w:i/>
-          <w:iCs/>
-        </w:rPr>
-        <w:t>r_j</w:t>
-      </w:r>
-      <w:proofErr w:type="spellEnd"/>
-      <w:r>
-        <w:rPr>
-          <w:rFonts w:ascii="Cambria Math" w:eastAsia="Cambria Math" w:hAnsi="Cambria Math" w:cs="Cambria Math"/>
-          <w:i/>
-          <w:iCs/>
-        </w:rPr>
-        <w:t xml:space="preserve"> × 2τ</w:t>
+        <w:t>P(j fires in window | i triggered)  ≈  r_j × 2τ</w:t>
       </w:r>
     </w:p>
     <w:p>
@@ -3292,15 +1698,7 @@
         <w:spacing w:after="160"/>
       </w:pPr>
       <w:r>
-        <w:t>(The approximation drops the probability of two or more events from j in the same window, which is O(r²τ²) and negligible for our rates and windows.) The expected number of accidental 2-fold coincidences between the specific pair (</w:t>
-      </w:r>
-      <w:proofErr w:type="spellStart"/>
-      <w:r>
-        <w:t>i</w:t>
-      </w:r>
-      <w:proofErr w:type="spellEnd"/>
-      <w:r>
-        <w:t>, j) over the run is:</w:t>
+        <w:t>(The approximation drops the probability of two or more events from j in the same window, which is O(r²τ²) and negligible for our rates and windows.) The expected number of accidental 2-fold coincidences between the specific pair (i, j) over the run is:</w:t>
       </w:r>
     </w:p>
     <w:p>
@@ -3317,126 +1715,8 @@
           <w:i/>
           <w:iCs/>
         </w:rPr>
-        <w:t>E_{</w:t>
-      </w:r>
-      <w:proofErr w:type="gramStart"/>
-      <w:r>
-        <w:rPr>
-          <w:rFonts w:ascii="Cambria Math" w:eastAsia="Cambria Math" w:hAnsi="Cambria Math" w:cs="Cambria Math"/>
-          <w:i/>
-          <w:iCs/>
-        </w:rPr>
-        <w:t>2,ij</w:t>
-      </w:r>
-      <w:proofErr w:type="gramEnd"/>
-      <w:r>
-        <w:rPr>
-          <w:rFonts w:ascii="Cambria Math" w:eastAsia="Cambria Math" w:hAnsi="Cambria Math" w:cs="Cambria Math"/>
-          <w:i/>
-          <w:iCs/>
-        </w:rPr>
-        <w:t xml:space="preserve">}  =  </w:t>
-      </w:r>
-      <w:proofErr w:type="spellStart"/>
-      <w:r>
-        <w:rPr>
-          <w:rFonts w:ascii="Cambria Math" w:eastAsia="Cambria Math" w:hAnsi="Cambria Math" w:cs="Cambria Math"/>
-          <w:i/>
-          <w:iCs/>
-        </w:rPr>
-        <w:t>r_i</w:t>
-      </w:r>
-      <w:proofErr w:type="spellEnd"/>
-      <w:r>
-        <w:rPr>
-          <w:rFonts w:ascii="Cambria Math" w:eastAsia="Cambria Math" w:hAnsi="Cambria Math" w:cs="Cambria Math"/>
-          <w:i/>
-          <w:iCs/>
-        </w:rPr>
-        <w:t xml:space="preserve"> </w:t>
-      </w:r>
-      <w:proofErr w:type="spellStart"/>
-      <w:r>
-        <w:rPr>
-          <w:rFonts w:ascii="Cambria Math" w:eastAsia="Cambria Math" w:hAnsi="Cambria Math" w:cs="Cambria Math"/>
-          <w:i/>
-          <w:iCs/>
-        </w:rPr>
-        <w:t>T_eff</w:t>
-      </w:r>
-      <w:proofErr w:type="spellEnd"/>
-      <w:r>
-        <w:rPr>
-          <w:rFonts w:ascii="Cambria Math" w:eastAsia="Cambria Math" w:hAnsi="Cambria Math" w:cs="Cambria Math"/>
-          <w:i/>
-          <w:iCs/>
-        </w:rPr>
-        <w:t xml:space="preserve"> × </w:t>
-      </w:r>
-      <w:proofErr w:type="spellStart"/>
-      <w:r>
-        <w:rPr>
-          <w:rFonts w:ascii="Cambria Math" w:eastAsia="Cambria Math" w:hAnsi="Cambria Math" w:cs="Cambria Math"/>
-          <w:i/>
-          <w:iCs/>
-        </w:rPr>
-        <w:t>r_j</w:t>
-      </w:r>
-      <w:proofErr w:type="spellEnd"/>
-      <w:r>
-        <w:rPr>
-          <w:rFonts w:ascii="Cambria Math" w:eastAsia="Cambria Math" w:hAnsi="Cambria Math" w:cs="Cambria Math"/>
-          <w:i/>
-          <w:iCs/>
-        </w:rPr>
-        <w:t xml:space="preserve"> (2τ)  =  </w:t>
-      </w:r>
-      <w:proofErr w:type="spellStart"/>
-      <w:r>
-        <w:rPr>
-          <w:rFonts w:ascii="Cambria Math" w:eastAsia="Cambria Math" w:hAnsi="Cambria Math" w:cs="Cambria Math"/>
-          <w:i/>
-          <w:iCs/>
-        </w:rPr>
-        <w:t>r_i</w:t>
-      </w:r>
-      <w:proofErr w:type="spellEnd"/>
-      <w:r>
-        <w:rPr>
-          <w:rFonts w:ascii="Cambria Math" w:eastAsia="Cambria Math" w:hAnsi="Cambria Math" w:cs="Cambria Math"/>
-          <w:i/>
-          <w:iCs/>
-        </w:rPr>
-        <w:t xml:space="preserve"> </w:t>
-      </w:r>
-      <w:proofErr w:type="spellStart"/>
-      <w:r>
-        <w:rPr>
-          <w:rFonts w:ascii="Cambria Math" w:eastAsia="Cambria Math" w:hAnsi="Cambria Math" w:cs="Cambria Math"/>
-          <w:i/>
-          <w:iCs/>
-        </w:rPr>
-        <w:t>r_j</w:t>
-      </w:r>
-      <w:proofErr w:type="spellEnd"/>
-      <w:r>
-        <w:rPr>
-          <w:rFonts w:ascii="Cambria Math" w:eastAsia="Cambria Math" w:hAnsi="Cambria Math" w:cs="Cambria Math"/>
-          <w:i/>
-          <w:iCs/>
-        </w:rPr>
-        <w:t xml:space="preserve"> (2τ) </w:t>
-      </w:r>
-      <w:proofErr w:type="spellStart"/>
-      <w:r>
-        <w:rPr>
-          <w:rFonts w:ascii="Cambria Math" w:eastAsia="Cambria Math" w:hAnsi="Cambria Math" w:cs="Cambria Math"/>
-          <w:i/>
-          <w:iCs/>
-        </w:rPr>
-        <w:t>T_eff</w:t>
-      </w:r>
-      <w:proofErr w:type="spellEnd"/>
+        <w:t>E_{2,ij}  =  r_i T_eff × r_j (2τ)  =  r_i r_j (2τ) T_eff</w:t>
+      </w:r>
       <w:r>
         <w:rPr>
           <w:b/>
@@ -3453,73 +1733,23 @@
         <w:spacing w:after="160"/>
       </w:pPr>
       <w:r>
-        <w:t xml:space="preserve">This expression is symmetric in </w:t>
-      </w:r>
-      <w:proofErr w:type="spellStart"/>
-      <w:r>
-        <w:t>i</w:t>
-      </w:r>
-      <w:proofErr w:type="spellEnd"/>
-      <w:r>
-        <w:t xml:space="preserve"> and j, as it must be — the expected accidental rate does not depend on which detector we nominate as the trigger.</w:t>
+        <w:t>This expression is symmetric in i and j, as it must be — the expected accidental rate does not depend on which detector we nominate as the trigger.</w:t>
       </w:r>
     </w:p>
     <w:p>
       <w:pPr>
         <w:pStyle w:val="Heading2"/>
       </w:pPr>
-      <w:proofErr w:type="gramStart"/>
-      <w:r>
-        <w:t>6.2  k</w:t>
-      </w:r>
-      <w:proofErr w:type="gramEnd"/>
-      <w:r>
-        <w:t>-Fold Accidentals for a Specific k-Tuple</w:t>
+      <w:r>
+        <w:t>6.2  k-Fold Accidentals for a Specific k-Tuple</w:t>
       </w:r>
     </w:p>
     <w:p>
       <w:pPr>
         <w:spacing w:after="160"/>
       </w:pPr>
-      <w:proofErr w:type="spellStart"/>
-      <w:r>
-        <w:t>Generalising</w:t>
-      </w:r>
-      <w:proofErr w:type="spellEnd"/>
-      <w:r>
-        <w:t xml:space="preserve"> to a specific set of k detectors {</w:t>
-      </w:r>
-      <w:proofErr w:type="spellStart"/>
-      <w:r>
-        <w:t>i</w:t>
-      </w:r>
-      <w:proofErr w:type="spellEnd"/>
-      <w:r>
-        <w:t xml:space="preserve">₁, </w:t>
-      </w:r>
-      <w:proofErr w:type="spellStart"/>
-      <w:r>
-        <w:t>i</w:t>
-      </w:r>
-      <w:proofErr w:type="spellEnd"/>
-      <w:r>
-        <w:t xml:space="preserve">₂, …, </w:t>
-      </w:r>
-      <w:proofErr w:type="spellStart"/>
-      <w:r>
-        <w:t>i</w:t>
-      </w:r>
-      <w:proofErr w:type="spellEnd"/>
-      <w:r>
-        <w:t xml:space="preserve">ₖ}: designate </w:t>
-      </w:r>
-      <w:proofErr w:type="spellStart"/>
-      <w:r>
-        <w:t>i</w:t>
-      </w:r>
-      <w:proofErr w:type="spellEnd"/>
-      <w:r>
-        <w:t xml:space="preserve">₁ as the trigger. The probability that each of the remaining k−1 detectors fires within the window of the trigger is </w:t>
+      <w:r>
+        <w:t xml:space="preserve">Generalising to a specific set of k detectors {i₁, i₂, …, iₖ}: designate i₁ as the trigger. The probability that each of the remaining k−1 detectors fires within the window of the trigger is </w:t>
       </w:r>
       <w:r>
         <w:rPr>
@@ -3527,98 +1757,42 @@
           <w:i/>
           <w:iCs/>
         </w:rPr>
-        <w:t>r_{</w:t>
-      </w:r>
-      <w:proofErr w:type="spellStart"/>
+        <w:t>r_{i_m} × 2τ</w:t>
+      </w:r>
+      <w:r>
+        <w:t xml:space="preserve"> for each m = 2, …, k. These are independent (different detectors), so:</w:t>
+      </w:r>
+    </w:p>
+    <w:p>
+      <w:pPr>
+        <w:spacing w:before="140" w:after="140"/>
+        <w:ind w:left="720" w:right="720"/>
+        <w:jc w:val="center"/>
+      </w:pPr>
       <w:r>
         <w:rPr>
           <w:rFonts w:ascii="Cambria Math" w:eastAsia="Cambria Math" w:hAnsi="Cambria Math" w:cs="Cambria Math"/>
           <w:i/>
           <w:iCs/>
         </w:rPr>
-        <w:t>i_m</w:t>
-      </w:r>
-      <w:proofErr w:type="spellEnd"/>
+        <w:t>P(all k−1 followers fire in window | trigger)  =  Π_{m=2}^{k}  r_{i_m} (2τ)</w:t>
+      </w:r>
+    </w:p>
+    <w:p>
+      <w:pPr>
+        <w:spacing w:after="160"/>
+      </w:pPr>
+      <w:r>
+        <w:t xml:space="preserve">Multiplying by the number of trigger events over the run, </w:t>
+      </w:r>
       <w:r>
         <w:rPr>
           <w:rFonts w:ascii="Cambria Math" w:eastAsia="Cambria Math" w:hAnsi="Cambria Math" w:cs="Cambria Math"/>
           <w:i/>
           <w:iCs/>
         </w:rPr>
-        <w:t>} × 2τ</w:t>
-      </w:r>
-      <w:r>
-        <w:t xml:space="preserve"> for each m = 2, …, k. These are independent (different detectors), so:</w:t>
-      </w:r>
-    </w:p>
-    <w:p>
-      <w:pPr>
-        <w:spacing w:before="140" w:after="140"/>
-        <w:ind w:left="720" w:right="720"/>
-        <w:jc w:val="center"/>
-      </w:pPr>
-      <w:proofErr w:type="gramStart"/>
-      <w:r>
-        <w:rPr>
-          <w:rFonts w:ascii="Cambria Math" w:eastAsia="Cambria Math" w:hAnsi="Cambria Math" w:cs="Cambria Math"/>
-          <w:i/>
-          <w:iCs/>
-        </w:rPr>
-        <w:t>P(</w:t>
-      </w:r>
-      <w:proofErr w:type="gramEnd"/>
-      <w:r>
-        <w:rPr>
-          <w:rFonts w:ascii="Cambria Math" w:eastAsia="Cambria Math" w:hAnsi="Cambria Math" w:cs="Cambria Math"/>
-          <w:i/>
-          <w:iCs/>
-        </w:rPr>
-        <w:t>all k−1 followers fire in window | trigger)  =  Π_{m=2}^{k}  r_{</w:t>
-      </w:r>
-      <w:proofErr w:type="spellStart"/>
-      <w:r>
-        <w:rPr>
-          <w:rFonts w:ascii="Cambria Math" w:eastAsia="Cambria Math" w:hAnsi="Cambria Math" w:cs="Cambria Math"/>
-          <w:i/>
-          <w:iCs/>
-        </w:rPr>
-        <w:t>i_m</w:t>
-      </w:r>
-      <w:proofErr w:type="spellEnd"/>
-      <w:r>
-        <w:rPr>
-          <w:rFonts w:ascii="Cambria Math" w:eastAsia="Cambria Math" w:hAnsi="Cambria Math" w:cs="Cambria Math"/>
-          <w:i/>
-          <w:iCs/>
-        </w:rPr>
-        <w:t>} (2τ)</w:t>
-      </w:r>
-    </w:p>
-    <w:p>
-      <w:pPr>
-        <w:spacing w:after="160"/>
-      </w:pPr>
-      <w:r>
-        <w:t xml:space="preserve">Multiplying by the number of trigger events over the run, </w:t>
-      </w:r>
-      <w:r>
-        <w:rPr>
-          <w:rFonts w:ascii="Cambria Math" w:eastAsia="Cambria Math" w:hAnsi="Cambria Math" w:cs="Cambria Math"/>
-          <w:i/>
-          <w:iCs/>
-        </w:rPr>
-        <w:t xml:space="preserve">r_{i_1} </w:t>
-      </w:r>
-      <w:proofErr w:type="spellStart"/>
-      <w:r>
-        <w:rPr>
-          <w:rFonts w:ascii="Cambria Math" w:eastAsia="Cambria Math" w:hAnsi="Cambria Math" w:cs="Cambria Math"/>
-          <w:i/>
-          <w:iCs/>
-        </w:rPr>
-        <w:t>T_eff</w:t>
-      </w:r>
-      <w:proofErr w:type="spellEnd"/>
+        <w:t>r_{i_1} T_eff</w:t>
+      </w:r>
       <w:r>
         <w:t>:</w:t>
       </w:r>
@@ -3637,115 +1811,7 @@
           <w:i/>
           <w:iCs/>
         </w:rPr>
-        <w:t>E</w:t>
-      </w:r>
-      <w:proofErr w:type="gramStart"/>
-      <w:r>
-        <w:rPr>
-          <w:rFonts w:ascii="Cambria Math" w:eastAsia="Cambria Math" w:hAnsi="Cambria Math" w:cs="Cambria Math"/>
-          <w:i/>
-          <w:iCs/>
-        </w:rPr>
-        <w:t>_{</w:t>
-      </w:r>
-      <w:proofErr w:type="gramEnd"/>
-      <w:r>
-        <w:rPr>
-          <w:rFonts w:ascii="Cambria Math" w:eastAsia="Cambria Math" w:hAnsi="Cambria Math" w:cs="Cambria Math"/>
-          <w:i/>
-          <w:iCs/>
-        </w:rPr>
-        <w:t>k, {i_1,…,</w:t>
-      </w:r>
-      <w:proofErr w:type="spellStart"/>
-      <w:r>
-        <w:rPr>
-          <w:rFonts w:ascii="Cambria Math" w:eastAsia="Cambria Math" w:hAnsi="Cambria Math" w:cs="Cambria Math"/>
-          <w:i/>
-          <w:iCs/>
-        </w:rPr>
-        <w:t>i_k</w:t>
-      </w:r>
-      <w:proofErr w:type="spellEnd"/>
-      <w:r>
-        <w:rPr>
-          <w:rFonts w:ascii="Cambria Math" w:eastAsia="Cambria Math" w:hAnsi="Cambria Math" w:cs="Cambria Math"/>
-          <w:i/>
-          <w:iCs/>
-        </w:rPr>
-        <w:t xml:space="preserve">}}  =  r_{i_1} </w:t>
-      </w:r>
-      <w:proofErr w:type="spellStart"/>
-      <w:r>
-        <w:rPr>
-          <w:rFonts w:ascii="Cambria Math" w:eastAsia="Cambria Math" w:hAnsi="Cambria Math" w:cs="Cambria Math"/>
-          <w:i/>
-          <w:iCs/>
-        </w:rPr>
-        <w:t>T_eff</w:t>
-      </w:r>
-      <w:proofErr w:type="spellEnd"/>
-      <w:r>
-        <w:rPr>
-          <w:rFonts w:ascii="Cambria Math" w:eastAsia="Cambria Math" w:hAnsi="Cambria Math" w:cs="Cambria Math"/>
-          <w:i/>
-          <w:iCs/>
-        </w:rPr>
-        <w:t xml:space="preserve">  ×  Π_{m=2}^{k} r_{</w:t>
-      </w:r>
-      <w:proofErr w:type="spellStart"/>
-      <w:r>
-        <w:rPr>
-          <w:rFonts w:ascii="Cambria Math" w:eastAsia="Cambria Math" w:hAnsi="Cambria Math" w:cs="Cambria Math"/>
-          <w:i/>
-          <w:iCs/>
-        </w:rPr>
-        <w:t>i_m</w:t>
-      </w:r>
-      <w:proofErr w:type="spellEnd"/>
-      <w:r>
-        <w:rPr>
-          <w:rFonts w:ascii="Cambria Math" w:eastAsia="Cambria Math" w:hAnsi="Cambria Math" w:cs="Cambria Math"/>
-          <w:i/>
-          <w:iCs/>
-        </w:rPr>
-        <w:t xml:space="preserve">} (2τ)  =  </w:t>
-      </w:r>
-      <w:proofErr w:type="spellStart"/>
-      <w:r>
-        <w:rPr>
-          <w:rFonts w:ascii="Cambria Math" w:eastAsia="Cambria Math" w:hAnsi="Cambria Math" w:cs="Cambria Math"/>
-          <w:i/>
-          <w:iCs/>
-        </w:rPr>
-        <w:t>T_eff</w:t>
-      </w:r>
-      <w:proofErr w:type="spellEnd"/>
-      <w:r>
-        <w:rPr>
-          <w:rFonts w:ascii="Cambria Math" w:eastAsia="Cambria Math" w:hAnsi="Cambria Math" w:cs="Cambria Math"/>
-          <w:i/>
-          <w:iCs/>
-        </w:rPr>
-        <w:t xml:space="preserve"> (2τ)^{k−1} Π_{m=1}^{k} r_{</w:t>
-      </w:r>
-      <w:proofErr w:type="spellStart"/>
-      <w:r>
-        <w:rPr>
-          <w:rFonts w:ascii="Cambria Math" w:eastAsia="Cambria Math" w:hAnsi="Cambria Math" w:cs="Cambria Math"/>
-          <w:i/>
-          <w:iCs/>
-        </w:rPr>
-        <w:t>i_m</w:t>
-      </w:r>
-      <w:proofErr w:type="spellEnd"/>
-      <w:r>
-        <w:rPr>
-          <w:rFonts w:ascii="Cambria Math" w:eastAsia="Cambria Math" w:hAnsi="Cambria Math" w:cs="Cambria Math"/>
-          <w:i/>
-          <w:iCs/>
-        </w:rPr>
-        <w:t>}</w:t>
+        <w:t>E_{k, {i_1,…,i_k}}  =  r_{i_1} T_eff  ×  Π_{m=2}^{k} r_{i_m} (2τ)  =  T_eff (2τ)^{k−1} Π_{m=1}^{k} r_{i_m}</w:t>
       </w:r>
       <w:r>
         <w:rPr>
@@ -3770,14 +1836,9 @@
       <w:pPr>
         <w:pStyle w:val="Heading2"/>
       </w:pPr>
-      <w:proofErr w:type="gramStart"/>
       <w:r>
         <w:lastRenderedPageBreak/>
-        <w:t>6.3  Total</w:t>
-      </w:r>
-      <w:proofErr w:type="gramEnd"/>
-      <w:r>
-        <w:t xml:space="preserve"> Expected k-Fold Accidentals</w:t>
+        <w:t>6.3  Total Expected k-Fold Accidentals</w:t>
       </w:r>
     </w:p>
     <w:p>
@@ -3785,15 +1846,7 @@
         <w:spacing w:after="160"/>
       </w:pPr>
       <w:r>
-        <w:t xml:space="preserve">Summing over all </w:t>
-      </w:r>
-      <w:proofErr w:type="gramStart"/>
-      <w:r>
-        <w:t>C(</w:t>
-      </w:r>
-      <w:proofErr w:type="gramEnd"/>
-      <w:r>
-        <w:t>8, k) subsets of k detectors from the N = 8 available:</w:t>
+        <w:t>Summing over all C(8, k) subsets of k detectors from the N = 8 available:</w:t>
       </w:r>
     </w:p>
     <w:p>
@@ -3804,88 +1857,14 @@
         <w:spacing w:before="140" w:after="140"/>
         <w:ind w:left="720"/>
       </w:pPr>
-      <w:proofErr w:type="spellStart"/>
       <w:r>
         <w:rPr>
           <w:rFonts w:ascii="Cambria Math" w:eastAsia="Cambria Math" w:hAnsi="Cambria Math" w:cs="Cambria Math"/>
           <w:i/>
           <w:iCs/>
         </w:rPr>
-        <w:t>E_</w:t>
-      </w:r>
-      <w:proofErr w:type="gramStart"/>
-      <w:r>
-        <w:rPr>
-          <w:rFonts w:ascii="Cambria Math" w:eastAsia="Cambria Math" w:hAnsi="Cambria Math" w:cs="Cambria Math"/>
-          <w:i/>
-          <w:iCs/>
-        </w:rPr>
-        <w:t>k</w:t>
-      </w:r>
-      <w:proofErr w:type="spellEnd"/>
-      <w:r>
-        <w:rPr>
-          <w:rFonts w:ascii="Cambria Math" w:eastAsia="Cambria Math" w:hAnsi="Cambria Math" w:cs="Cambria Math"/>
-          <w:i/>
-          <w:iCs/>
-        </w:rPr>
-        <w:t xml:space="preserve">  =</w:t>
-      </w:r>
-      <w:proofErr w:type="gramEnd"/>
-      <w:r>
-        <w:rPr>
-          <w:rFonts w:ascii="Cambria Math" w:eastAsia="Cambria Math" w:hAnsi="Cambria Math" w:cs="Cambria Math"/>
-          <w:i/>
-          <w:iCs/>
-        </w:rPr>
-        <w:t xml:space="preserve">  Σ_{S ⊂ {1,…,8}, |S|=k}   </w:t>
-      </w:r>
-      <w:proofErr w:type="spellStart"/>
-      <w:r>
-        <w:rPr>
-          <w:rFonts w:ascii="Cambria Math" w:eastAsia="Cambria Math" w:hAnsi="Cambria Math" w:cs="Cambria Math"/>
-          <w:i/>
-          <w:iCs/>
-        </w:rPr>
-        <w:t>T_eff</w:t>
-      </w:r>
-      <w:proofErr w:type="spellEnd"/>
-      <w:r>
-        <w:rPr>
-          <w:rFonts w:ascii="Cambria Math" w:eastAsia="Cambria Math" w:hAnsi="Cambria Math" w:cs="Cambria Math"/>
-          <w:i/>
-          <w:iCs/>
-        </w:rPr>
-        <w:t xml:space="preserve"> (2τ)^{k−1}  Π_{</w:t>
-      </w:r>
-      <w:proofErr w:type="spellStart"/>
-      <w:r>
-        <w:rPr>
-          <w:rFonts w:ascii="Cambria Math" w:eastAsia="Cambria Math" w:hAnsi="Cambria Math" w:cs="Cambria Math"/>
-          <w:i/>
-          <w:iCs/>
-        </w:rPr>
-        <w:t>i</w:t>
-      </w:r>
-      <w:proofErr w:type="spellEnd"/>
-      <w:r>
-        <w:rPr>
-          <w:rFonts w:ascii="Cambria Math" w:eastAsia="Cambria Math" w:hAnsi="Cambria Math" w:cs="Cambria Math"/>
-          <w:i/>
-          <w:iCs/>
-        </w:rPr>
-        <w:t xml:space="preserve"> ∈ S} </w:t>
-      </w:r>
-      <w:proofErr w:type="spellStart"/>
-      <w:r>
-        <w:rPr>
-          <w:rFonts w:ascii="Cambria Math" w:eastAsia="Cambria Math" w:hAnsi="Cambria Math" w:cs="Cambria Math"/>
-          <w:i/>
-          <w:iCs/>
-        </w:rPr>
-        <w:t>r_i</w:t>
-      </w:r>
-      <w:proofErr w:type="spellEnd"/>
+        <w:t>E_k  =  Σ_{S ⊂ {1,…,8}, |S|=k}   T_eff (2τ)^{k−1}  Π_{i ∈ S} r_i</w:t>
+      </w:r>
       <w:r>
         <w:rPr>
           <w:b/>
@@ -3904,52 +1883,16 @@
       <w:r>
         <w:t xml:space="preserve">This is the exact expression implemented in </w:t>
       </w:r>
-      <w:proofErr w:type="spellStart"/>
       <w:r>
         <w:rPr>
           <w:rFonts w:ascii="Courier New" w:eastAsia="Courier New" w:hAnsi="Courier New" w:cs="Courier New"/>
           <w:sz w:val="20"/>
           <w:szCs w:val="20"/>
         </w:rPr>
-        <w:t>expected_</w:t>
-      </w:r>
-      <w:proofErr w:type="gramStart"/>
-      <w:r>
-        <w:rPr>
-          <w:rFonts w:ascii="Courier New" w:eastAsia="Courier New" w:hAnsi="Courier New" w:cs="Courier New"/>
-          <w:sz w:val="20"/>
-          <w:szCs w:val="20"/>
-        </w:rPr>
-        <w:t>accidentals</w:t>
-      </w:r>
-      <w:proofErr w:type="spellEnd"/>
-      <w:r>
-        <w:rPr>
-          <w:rFonts w:ascii="Courier New" w:eastAsia="Courier New" w:hAnsi="Courier New" w:cs="Courier New"/>
-          <w:sz w:val="20"/>
-          <w:szCs w:val="20"/>
-        </w:rPr>
-        <w:t>(</w:t>
-      </w:r>
-      <w:proofErr w:type="gramEnd"/>
-      <w:r>
-        <w:rPr>
-          <w:rFonts w:ascii="Courier New" w:eastAsia="Courier New" w:hAnsi="Courier New" w:cs="Courier New"/>
-          <w:sz w:val="20"/>
-          <w:szCs w:val="20"/>
-        </w:rPr>
-        <w:t>)</w:t>
-      </w:r>
-      <w:r>
-        <w:t>. Representative values for the February 27 data (</w:t>
-      </w:r>
-      <w:proofErr w:type="spellStart"/>
-      <w:r>
-        <w:t>T_eff</w:t>
-      </w:r>
-      <w:proofErr w:type="spellEnd"/>
-      <w:r>
-        <w:t xml:space="preserve"> ≈ 3 576 s, rates 0.81–1.25 Hz):</w:t>
+        <w:t>expected_accidentals()</w:t>
+      </w:r>
+      <w:r>
+        <w:t>. Representative values for the February 27 data (T_eff ≈ 3 576 s, rates 0.81–1.25 Hz):</w:t>
       </w:r>
     </w:p>
     <w:tbl>
@@ -4222,17 +2165,8 @@
                 <w:sz w:val="20"/>
                 <w:szCs w:val="20"/>
               </w:rPr>
-              <w:t xml:space="preserve">1 </w:t>
-            </w:r>
-            <w:proofErr w:type="spellStart"/>
-            <w:r>
-              <w:rPr>
-                <w:sz w:val="20"/>
-                <w:szCs w:val="20"/>
-              </w:rPr>
-              <w:t>ms</w:t>
-            </w:r>
-            <w:proofErr w:type="spellEnd"/>
+              <w:t>1 ms</w:t>
+            </w:r>
           </w:p>
         </w:tc>
         <w:tc>
@@ -4419,17 +2353,8 @@
                 <w:sz w:val="20"/>
                 <w:szCs w:val="20"/>
               </w:rPr>
-              <w:t xml:space="preserve">2 </w:t>
-            </w:r>
-            <w:proofErr w:type="spellStart"/>
-            <w:r>
-              <w:rPr>
-                <w:sz w:val="20"/>
-                <w:szCs w:val="20"/>
-              </w:rPr>
-              <w:t>ms</w:t>
-            </w:r>
-            <w:proofErr w:type="spellEnd"/>
+              <w:t>2 ms</w:t>
+            </w:r>
           </w:p>
         </w:tc>
         <w:tc>
@@ -4616,17 +2541,8 @@
                 <w:sz w:val="20"/>
                 <w:szCs w:val="20"/>
               </w:rPr>
-              <w:t xml:space="preserve">5 </w:t>
-            </w:r>
-            <w:proofErr w:type="spellStart"/>
-            <w:r>
-              <w:rPr>
-                <w:sz w:val="20"/>
-                <w:szCs w:val="20"/>
-              </w:rPr>
-              <w:t>ms</w:t>
-            </w:r>
-            <w:proofErr w:type="spellEnd"/>
+              <w:t>5 ms</w:t>
+            </w:r>
           </w:p>
         </w:tc>
         <w:tc>
@@ -4813,17 +2729,8 @@
                 <w:sz w:val="20"/>
                 <w:szCs w:val="20"/>
               </w:rPr>
-              <w:t xml:space="preserve">10 </w:t>
-            </w:r>
-            <w:proofErr w:type="spellStart"/>
-            <w:r>
-              <w:rPr>
-                <w:sz w:val="20"/>
-                <w:szCs w:val="20"/>
-              </w:rPr>
-              <w:t>ms</w:t>
-            </w:r>
-            <w:proofErr w:type="spellEnd"/>
+              <w:t>10 ms</w:t>
+            </w:r>
           </w:p>
         </w:tc>
         <w:tc>
@@ -4999,28 +2906,15 @@
         <w:t>r × 2τ ≈ 0.002</w:t>
       </w:r>
       <w:r>
-        <w:t xml:space="preserve"> at the 1 </w:t>
-      </w:r>
-      <w:proofErr w:type="spellStart"/>
-      <w:r>
-        <w:t>ms</w:t>
-      </w:r>
-      <w:proofErr w:type="spellEnd"/>
-      <w:r>
-        <w:t xml:space="preserve"> window. Raising 0.002 to the (k−1) power gives E_5 ~ 10⁻¹¹ per event, so a single observed 5-fold event represents an enormous excess over background.</w:t>
+        <w:t xml:space="preserve"> at the 1 ms window. Raising 0.002 to the (k−1) power gives E_5 ~ 10⁻¹¹ per event, so a single observed 5-fold event represents an enormous excess over background.</w:t>
       </w:r>
     </w:p>
     <w:p>
       <w:pPr>
         <w:pStyle w:val="Heading2"/>
       </w:pPr>
-      <w:proofErr w:type="gramStart"/>
-      <w:r>
-        <w:t>6.4  Validity</w:t>
-      </w:r>
-      <w:proofErr w:type="gramEnd"/>
-      <w:r>
-        <w:t xml:space="preserve"> Conditions</w:t>
+      <w:r>
+        <w:t>6.4  Validity Conditions</w:t>
       </w:r>
     </w:p>
     <w:p>
@@ -5060,15 +2954,7 @@
         <w:t xml:space="preserve">Rare-event approximation: </w:t>
       </w:r>
       <w:r>
-        <w:t xml:space="preserve">r × 2τ ≪ 1 so that the probability of two hits from the same detector in the window is negligible. At r ≈ 1 Hz and τ = 0.5 </w:t>
-      </w:r>
-      <w:proofErr w:type="spellStart"/>
-      <w:r>
-        <w:t>ms</w:t>
-      </w:r>
-      <w:proofErr w:type="spellEnd"/>
-      <w:r>
-        <w:t xml:space="preserve"> this factor is 0.001, valid to 0.1%.</w:t>
+        <w:t>r × 2τ ≪ 1 so that the probability of two hits from the same detector in the window is negligible. At r ≈ 1 Hz and τ = 0.5 ms this factor is 0.001, valid to 0.1%.</w:t>
       </w:r>
     </w:p>
     <w:p>
@@ -5088,15 +2974,7 @@
         <w:t xml:space="preserve">Independence between detectors: </w:t>
       </w:r>
       <w:r>
-        <w:t xml:space="preserve">The probability of a hit on detector j is not affected by whether detector </w:t>
-      </w:r>
-      <w:proofErr w:type="spellStart"/>
-      <w:r>
-        <w:t>i</w:t>
-      </w:r>
-      <w:proofErr w:type="spellEnd"/>
-      <w:r>
-        <w:t xml:space="preserve"> fires. A significant excess above Eq. (6.3) implies correlated events — genuine showers.</w:t>
+        <w:t>The probability of a hit on detector j is not affected by whether detector i fires. A significant excess above Eq. (6.3) implies correlated events — genuine showers.</w:t>
       </w:r>
     </w:p>
     <w:p>
@@ -5116,13 +2994,8 @@
       <w:pPr>
         <w:pStyle w:val="Heading2"/>
       </w:pPr>
-      <w:proofErr w:type="gramStart"/>
-      <w:r>
-        <w:t>7.1  One</w:t>
-      </w:r>
-      <w:proofErr w:type="gramEnd"/>
-      <w:r>
-        <w:t>-Sided Poisson p-Value</w:t>
+      <w:r>
+        <w:t>7.1  One-Sided Poisson p-Value</w:t>
       </w:r>
     </w:p>
     <w:p>
@@ -5141,23 +3014,13 @@
         <w:spacing w:before="140" w:after="140"/>
         <w:ind w:left="720"/>
       </w:pPr>
-      <w:proofErr w:type="gramStart"/>
       <w:r>
         <w:rPr>
           <w:rFonts w:ascii="Cambria Math" w:eastAsia="Cambria Math" w:hAnsi="Cambria Math" w:cs="Cambria Math"/>
           <w:i/>
           <w:iCs/>
         </w:rPr>
-        <w:t>p  =</w:t>
-      </w:r>
-      <w:proofErr w:type="gramEnd"/>
-      <w:r>
-        <w:rPr>
-          <w:rFonts w:ascii="Cambria Math" w:eastAsia="Cambria Math" w:hAnsi="Cambria Math" w:cs="Cambria Math"/>
-          <w:i/>
-          <w:iCs/>
-        </w:rPr>
-        <w:t xml:space="preserve">  P(X ≥ O | Poisson(E))  =  1  −  P(X ≤ O−1 | Poisson(E))</w:t>
+        <w:t>p  =  P(X ≥ O | Poisson(E))  =  1  −  P(X ≤ O−1 | Poisson(E))</w:t>
       </w:r>
       <w:r>
         <w:rPr>
@@ -5186,41 +3049,13 @@
         <w:spacing w:before="140" w:after="140"/>
         <w:ind w:left="720"/>
       </w:pPr>
-      <w:proofErr w:type="gramStart"/>
       <w:r>
         <w:rPr>
           <w:rFonts w:ascii="Cambria Math" w:eastAsia="Cambria Math" w:hAnsi="Cambria Math" w:cs="Cambria Math"/>
           <w:i/>
           <w:iCs/>
         </w:rPr>
-        <w:t>P(</w:t>
-      </w:r>
-      <w:proofErr w:type="gramEnd"/>
-      <w:r>
-        <w:rPr>
-          <w:rFonts w:ascii="Cambria Math" w:eastAsia="Cambria Math" w:hAnsi="Cambria Math" w:cs="Cambria Math"/>
-          <w:i/>
-          <w:iCs/>
-        </w:rPr>
-        <w:t xml:space="preserve">X ≤ n | λ)  =  e^{−λ}  Σ_{j=0}^{n}  </w:t>
-      </w:r>
-      <w:proofErr w:type="spellStart"/>
-      <w:r>
-        <w:rPr>
-          <w:rFonts w:ascii="Cambria Math" w:eastAsia="Cambria Math" w:hAnsi="Cambria Math" w:cs="Cambria Math"/>
-          <w:i/>
-          <w:iCs/>
-        </w:rPr>
-        <w:t>λ^j</w:t>
-      </w:r>
-      <w:proofErr w:type="spellEnd"/>
-      <w:r>
-        <w:rPr>
-          <w:rFonts w:ascii="Cambria Math" w:eastAsia="Cambria Math" w:hAnsi="Cambria Math" w:cs="Cambria Math"/>
-          <w:i/>
-          <w:iCs/>
-        </w:rPr>
-        <w:t xml:space="preserve"> / j!</w:t>
+        <w:t>P(X ≤ n | λ)  =  e^{−λ}  Σ_{j=0}^{n}  λ^j / j!</w:t>
       </w:r>
       <w:r>
         <w:rPr>
@@ -5246,59 +3081,18 @@
           <w:sz w:val="20"/>
           <w:szCs w:val="20"/>
         </w:rPr>
-        <w:t xml:space="preserve">1.0 - </w:t>
-      </w:r>
-      <w:proofErr w:type="spellStart"/>
-      <w:proofErr w:type="gramStart"/>
-      <w:r>
-        <w:rPr>
-          <w:rFonts w:ascii="Courier New" w:eastAsia="Courier New" w:hAnsi="Courier New" w:cs="Courier New"/>
-          <w:sz w:val="20"/>
-          <w:szCs w:val="20"/>
-        </w:rPr>
-        <w:t>poisson.cdf</w:t>
-      </w:r>
-      <w:proofErr w:type="spellEnd"/>
-      <w:r>
-        <w:rPr>
-          <w:rFonts w:ascii="Courier New" w:eastAsia="Courier New" w:hAnsi="Courier New" w:cs="Courier New"/>
-          <w:sz w:val="20"/>
-          <w:szCs w:val="20"/>
-        </w:rPr>
-        <w:t>(</w:t>
-      </w:r>
-      <w:proofErr w:type="gramEnd"/>
-      <w:r>
-        <w:rPr>
-          <w:rFonts w:ascii="Courier New" w:eastAsia="Courier New" w:hAnsi="Courier New" w:cs="Courier New"/>
-          <w:sz w:val="20"/>
-          <w:szCs w:val="20"/>
-        </w:rPr>
-        <w:t>O − 1, E)</w:t>
-      </w:r>
-      <w:r>
-        <w:t xml:space="preserve"> using SciPy's </w:t>
-      </w:r>
-      <w:proofErr w:type="spellStart"/>
-      <w:r>
-        <w:t>regularised</w:t>
-      </w:r>
-      <w:proofErr w:type="spellEnd"/>
-      <w:r>
-        <w:t xml:space="preserve"> incomplete gamma function, which is numerically stable for all E and O.</w:t>
+        <w:t>1.0 - poisson.cdf(O − 1, E)</w:t>
+      </w:r>
+      <w:r>
+        <w:t xml:space="preserve"> using SciPy's regularised incomplete gamma function, which is numerically stable for all E and O.</w:t>
       </w:r>
     </w:p>
     <w:p>
       <w:pPr>
         <w:pStyle w:val="Heading2"/>
       </w:pPr>
-      <w:proofErr w:type="gramStart"/>
-      <w:r>
-        <w:t>7.2  Gaussian</w:t>
-      </w:r>
-      <w:proofErr w:type="gramEnd"/>
-      <w:r>
-        <w:t xml:space="preserve"> Sigma Conversion</w:t>
+      <w:r>
+        <w:t>7.2  Gaussian Sigma Conversion</w:t>
       </w:r>
     </w:p>
     <w:p>
@@ -5318,23 +3112,13 @@
         <w:spacing w:before="140" w:after="140"/>
         <w:ind w:left="720"/>
       </w:pPr>
-      <w:proofErr w:type="gramStart"/>
       <w:r>
         <w:rPr>
           <w:rFonts w:ascii="Cambria Math" w:eastAsia="Cambria Math" w:hAnsi="Cambria Math" w:cs="Cambria Math"/>
           <w:i/>
           <w:iCs/>
         </w:rPr>
-        <w:t>σ  =</w:t>
-      </w:r>
-      <w:proofErr w:type="gramEnd"/>
-      <w:r>
-        <w:rPr>
-          <w:rFonts w:ascii="Cambria Math" w:eastAsia="Cambria Math" w:hAnsi="Cambria Math" w:cs="Cambria Math"/>
-          <w:i/>
-          <w:iCs/>
-        </w:rPr>
-        <w:t xml:space="preserve">  Φ⁻¹(1 − p)</w:t>
+        <w:t>σ  =  Φ⁻¹(1 − p)</w:t>
       </w:r>
       <w:r>
         <w:rPr>
@@ -5354,33 +3138,13 @@
       <w:r>
         <w:t xml:space="preserve">where Φ⁻¹ is the percent-point function, implemented as </w:t>
       </w:r>
-      <w:proofErr w:type="spellStart"/>
-      <w:proofErr w:type="gramStart"/>
       <w:r>
         <w:rPr>
           <w:rFonts w:ascii="Courier New" w:eastAsia="Courier New" w:hAnsi="Courier New" w:cs="Courier New"/>
           <w:sz w:val="20"/>
           <w:szCs w:val="20"/>
         </w:rPr>
-        <w:t>scipy.stats.norm.ppf</w:t>
-      </w:r>
-      <w:proofErr w:type="spellEnd"/>
-      <w:r>
-        <w:rPr>
-          <w:rFonts w:ascii="Courier New" w:eastAsia="Courier New" w:hAnsi="Courier New" w:cs="Courier New"/>
-          <w:sz w:val="20"/>
-          <w:szCs w:val="20"/>
-        </w:rPr>
-        <w:t>(</w:t>
-      </w:r>
-      <w:proofErr w:type="gramEnd"/>
-      <w:r>
-        <w:rPr>
-          <w:rFonts w:ascii="Courier New" w:eastAsia="Courier New" w:hAnsi="Courier New" w:cs="Courier New"/>
-          <w:sz w:val="20"/>
-          <w:szCs w:val="20"/>
-        </w:rPr>
-        <w:t>1 − p)</w:t>
+        <w:t>scipy.stats.norm.ppf(1 − p)</w:t>
       </w:r>
       <w:r>
         <w:t>. By convention, σ &gt; 0 is an excess (more coincidences than expected), σ &lt; 0 is a deficit, and σ = −∞ when O = 0 (the null-hypothesis probability of observing nothing can be substantial). A numerical floor of p ≥ 10⁻¹⁵ prevents floating-point underflow, corresponding to σ ≈ 8.</w:t>
@@ -5390,13 +3154,8 @@
       <w:pPr>
         <w:pStyle w:val="Heading2"/>
       </w:pPr>
-      <w:proofErr w:type="gramStart"/>
-      <w:r>
-        <w:t>7.3  Results</w:t>
-      </w:r>
-      <w:proofErr w:type="gramEnd"/>
-      <w:r>
-        <w:t>: Observed vs. Expected</w:t>
+      <w:r>
+        <w:t>7.3  Results: Observed vs. Expected</w:t>
       </w:r>
     </w:p>
     <w:p>
@@ -5469,31 +3228,7 @@
         <w:spacing w:after="160"/>
       </w:pPr>
       <w:r>
-        <w:t xml:space="preserve">The observed-vs-expected plot shows a clear pattern: at tight windows (1–2 </w:t>
-      </w:r>
-      <w:proofErr w:type="spellStart"/>
-      <w:r>
-        <w:t>ms</w:t>
-      </w:r>
-      <w:proofErr w:type="spellEnd"/>
-      <w:r>
-        <w:t xml:space="preserve">), 2-fold, 3-fold, and 5-fold coincidences all lie significantly above the diagonal. At wide windows (≥10 </w:t>
-      </w:r>
-      <w:proofErr w:type="spellStart"/>
-      <w:r>
-        <w:t>ms</w:t>
-      </w:r>
-      <w:proofErr w:type="spellEnd"/>
-      <w:r>
-        <w:t>), the observed counts fall to or below the expected accidental rate — the signal is genuinely time-</w:t>
-      </w:r>
-      <w:proofErr w:type="spellStart"/>
-      <w:r>
-        <w:t>localised</w:t>
-      </w:r>
-      <w:proofErr w:type="spellEnd"/>
-      <w:r>
-        <w:t>.</w:t>
+        <w:t>The observed-vs-expected plot shows a clear pattern: at tight windows (1–2 ms), 2-fold, 3-fold, and 5-fold coincidences all lie significantly above the diagonal. At wide windows (≥10 ms), the observed counts fall to or below the expected accidental rate — the signal is genuinely time-localised.</w:t>
       </w:r>
     </w:p>
     <w:p>
@@ -5558,51 +3293,7 @@
           <w:sz w:val="18"/>
           <w:szCs w:val="18"/>
         </w:rPr>
-        <w:t xml:space="preserve">Figure 11. </w:t>
-      </w:r>
-      <w:proofErr w:type="spellStart"/>
-      <w:r>
-        <w:rPr>
-          <w:i/>
-          <w:iCs/>
-          <w:color w:val="555555"/>
-          <w:sz w:val="18"/>
-          <w:szCs w:val="18"/>
-        </w:rPr>
-        <w:t>Cowork</w:t>
-      </w:r>
-      <w:proofErr w:type="spellEnd"/>
-      <w:r>
-        <w:rPr>
-          <w:i/>
-          <w:iCs/>
-          <w:color w:val="555555"/>
-          <w:sz w:val="18"/>
-          <w:szCs w:val="18"/>
-        </w:rPr>
-        <w:t xml:space="preserve"> reproduction run: observed vs. expected (left) and significance vs. window size (right) for all fold levels. The 2-fold, 3-fold, and 5-fold excesses at 1 </w:t>
-      </w:r>
-      <w:proofErr w:type="spellStart"/>
-      <w:r>
-        <w:rPr>
-          <w:i/>
-          <w:iCs/>
-          <w:color w:val="555555"/>
-          <w:sz w:val="18"/>
-          <w:szCs w:val="18"/>
-        </w:rPr>
-        <w:t>ms</w:t>
-      </w:r>
-      <w:proofErr w:type="spellEnd"/>
-      <w:r>
-        <w:rPr>
-          <w:i/>
-          <w:iCs/>
-          <w:color w:val="555555"/>
-          <w:sz w:val="18"/>
-          <w:szCs w:val="18"/>
-        </w:rPr>
-        <w:t xml:space="preserve"> all exceed 4σ. The horizontal dashed lines mark the 3σ (grey) and 5σ (red) thresholds.</w:t>
+        <w:t>Figure 11. Cowork reproduction run: observed vs. expected (left) and significance vs. window size (right) for all fold levels. The 2-fold, 3-fold, and 5-fold excesses at 1 ms all exceed 4σ. The horizontal dashed lines mark the 3σ (grey) and 5σ (red) thresholds.</w:t>
       </w:r>
     </w:p>
     <w:p>
@@ -5611,28 +3302,15 @@
       </w:pPr>
       <w:r>
         <w:lastRenderedPageBreak/>
-        <w:t xml:space="preserve">The significance-vs-window plot has a characteristic shape for a genuine signal: it is highest at tight windows (where accidental background is minimal) and decreases as the window opens (as the accidental rate grows to swamp the signal). A purely accidental excess would not show this </w:t>
-      </w:r>
-      <w:proofErr w:type="spellStart"/>
-      <w:r>
-        <w:t>behaviour</w:t>
-      </w:r>
-      <w:proofErr w:type="spellEnd"/>
-      <w:r>
-        <w:t>.</w:t>
+        <w:t>The significance-vs-window plot has a characteristic shape for a genuine signal: it is highest at tight windows (where accidental background is minimal) and decreases as the window opens (as the accidental rate grows to swamp the signal). A purely accidental excess would not show this behaviour.</w:t>
       </w:r>
     </w:p>
     <w:p>
       <w:pPr>
         <w:pStyle w:val="Heading2"/>
       </w:pPr>
-      <w:proofErr w:type="gramStart"/>
-      <w:r>
-        <w:t>7.4  Significance</w:t>
-      </w:r>
-      <w:proofErr w:type="gramEnd"/>
-      <w:r>
-        <w:t xml:space="preserve"> Summary Table</w:t>
+      <w:r>
+        <w:t>7.4  Significance Summary Table</w:t>
       </w:r>
     </w:p>
     <w:tbl>
@@ -5905,17 +3583,8 @@
                 <w:sz w:val="20"/>
                 <w:szCs w:val="20"/>
               </w:rPr>
-              <w:t xml:space="preserve">1 </w:t>
-            </w:r>
-            <w:proofErr w:type="spellStart"/>
-            <w:r>
-              <w:rPr>
-                <w:sz w:val="20"/>
-                <w:szCs w:val="20"/>
-              </w:rPr>
-              <w:t>ms</w:t>
-            </w:r>
-            <w:proofErr w:type="spellEnd"/>
+              <w:t>1 ms</w:t>
+            </w:r>
           </w:p>
         </w:tc>
         <w:tc>
@@ -6102,17 +3771,8 @@
                 <w:sz w:val="20"/>
                 <w:szCs w:val="20"/>
               </w:rPr>
-              <w:t xml:space="preserve">1 </w:t>
-            </w:r>
-            <w:proofErr w:type="spellStart"/>
-            <w:r>
-              <w:rPr>
-                <w:sz w:val="20"/>
-                <w:szCs w:val="20"/>
-              </w:rPr>
-              <w:t>ms</w:t>
-            </w:r>
-            <w:proofErr w:type="spellEnd"/>
+              <w:t>1 ms</w:t>
+            </w:r>
           </w:p>
         </w:tc>
         <w:tc>
@@ -6299,17 +3959,8 @@
                 <w:sz w:val="20"/>
                 <w:szCs w:val="20"/>
               </w:rPr>
-              <w:t xml:space="preserve">1 </w:t>
-            </w:r>
-            <w:proofErr w:type="spellStart"/>
-            <w:r>
-              <w:rPr>
-                <w:sz w:val="20"/>
-                <w:szCs w:val="20"/>
-              </w:rPr>
-              <w:t>ms</w:t>
-            </w:r>
-            <w:proofErr w:type="spellEnd"/>
+              <w:t>1 ms</w:t>
+            </w:r>
           </w:p>
         </w:tc>
         <w:tc>
@@ -6496,17 +4147,8 @@
                 <w:sz w:val="20"/>
                 <w:szCs w:val="20"/>
               </w:rPr>
-              <w:t xml:space="preserve">2 </w:t>
-            </w:r>
-            <w:proofErr w:type="spellStart"/>
-            <w:r>
-              <w:rPr>
-                <w:sz w:val="20"/>
-                <w:szCs w:val="20"/>
-              </w:rPr>
-              <w:t>ms</w:t>
-            </w:r>
-            <w:proofErr w:type="spellEnd"/>
+              <w:t>2 ms</w:t>
+            </w:r>
           </w:p>
         </w:tc>
         <w:tc>
@@ -6693,17 +4335,8 @@
                 <w:sz w:val="20"/>
                 <w:szCs w:val="20"/>
               </w:rPr>
-              <w:t xml:space="preserve">2 </w:t>
-            </w:r>
-            <w:proofErr w:type="spellStart"/>
-            <w:r>
-              <w:rPr>
-                <w:sz w:val="20"/>
-                <w:szCs w:val="20"/>
-              </w:rPr>
-              <w:t>ms</w:t>
-            </w:r>
-            <w:proofErr w:type="spellEnd"/>
+              <w:t>2 ms</w:t>
+            </w:r>
           </w:p>
         </w:tc>
         <w:tc>
@@ -6875,13 +4508,8 @@
       <w:pPr>
         <w:pStyle w:val="Heading2"/>
       </w:pPr>
-      <w:proofErr w:type="gramStart"/>
-      <w:r>
-        <w:t>7.5  Coincidence</w:t>
-      </w:r>
-      <w:proofErr w:type="gramEnd"/>
-      <w:r>
-        <w:t xml:space="preserve"> Timeline and Shower Candidates</w:t>
+      <w:r>
+        <w:t>7.5  Coincidence Timeline and Shower Candidates</w:t>
       </w:r>
     </w:p>
     <w:p>
@@ -6946,73 +4574,7 @@
           <w:sz w:val="18"/>
           <w:szCs w:val="18"/>
         </w:rPr>
-        <w:t xml:space="preserve">Figure 12. Coincidence timeline from the </w:t>
-      </w:r>
-      <w:proofErr w:type="spellStart"/>
-      <w:r>
-        <w:rPr>
-          <w:i/>
-          <w:iCs/>
-          <w:color w:val="555555"/>
-          <w:sz w:val="18"/>
-          <w:szCs w:val="18"/>
-        </w:rPr>
-        <w:t>Cowork</w:t>
-      </w:r>
-      <w:proofErr w:type="spellEnd"/>
-      <w:r>
-        <w:rPr>
-          <w:i/>
-          <w:iCs/>
-          <w:color w:val="555555"/>
-          <w:sz w:val="18"/>
-          <w:szCs w:val="18"/>
-        </w:rPr>
-        <w:t xml:space="preserve"> run at a 1 </w:t>
-      </w:r>
-      <w:proofErr w:type="spellStart"/>
-      <w:r>
-        <w:rPr>
-          <w:i/>
-          <w:iCs/>
-          <w:color w:val="555555"/>
-          <w:sz w:val="18"/>
-          <w:szCs w:val="18"/>
-        </w:rPr>
-        <w:t>ms</w:t>
-      </w:r>
-      <w:proofErr w:type="spellEnd"/>
-      <w:r>
-        <w:rPr>
-          <w:i/>
-          <w:iCs/>
-          <w:color w:val="555555"/>
-          <w:sz w:val="18"/>
-          <w:szCs w:val="18"/>
-        </w:rPr>
-        <w:t xml:space="preserve"> window: each coincident cluster is plotted at its time of occurrence, </w:t>
-      </w:r>
-      <w:proofErr w:type="spellStart"/>
-      <w:r>
-        <w:rPr>
-          <w:i/>
-          <w:iCs/>
-          <w:color w:val="555555"/>
-          <w:sz w:val="18"/>
-          <w:szCs w:val="18"/>
-        </w:rPr>
-        <w:t>coloured</w:t>
-      </w:r>
-      <w:proofErr w:type="spellEnd"/>
-      <w:r>
-        <w:rPr>
-          <w:i/>
-          <w:iCs/>
-          <w:color w:val="555555"/>
-          <w:sz w:val="18"/>
-          <w:szCs w:val="18"/>
-        </w:rPr>
-        <w:t xml:space="preserve"> by multiplicity fold. The lone 5-fold event at ~50 min is clearly visible.</w:t>
+        <w:t>Figure 12. Coincidence timeline from the Cowork run at a 1 ms window: each coincident cluster is plotted at its time of occurrence, coloured by multiplicity fold. The lone 5-fold event at ~50 min is clearly visible.</w:t>
       </w:r>
     </w:p>
     <w:p>
@@ -7077,29 +4639,7 @@
           <w:sz w:val="18"/>
           <w:szCs w:val="18"/>
         </w:rPr>
-        <w:t xml:space="preserve">Figure 13. Timestamp ladder for the top three high-multiplicity clusters at the 1 </w:t>
-      </w:r>
-      <w:proofErr w:type="spellStart"/>
-      <w:r>
-        <w:rPr>
-          <w:i/>
-          <w:iCs/>
-          <w:color w:val="555555"/>
-          <w:sz w:val="18"/>
-          <w:szCs w:val="18"/>
-        </w:rPr>
-        <w:t>ms</w:t>
-      </w:r>
-      <w:proofErr w:type="spellEnd"/>
-      <w:r>
-        <w:rPr>
-          <w:i/>
-          <w:iCs/>
-          <w:color w:val="555555"/>
-          <w:sz w:val="18"/>
-          <w:szCs w:val="18"/>
-        </w:rPr>
-        <w:t xml:space="preserve"> window. Each vertical bar represents a single detector hit; the horizontal axis shows the time offset in microseconds from the earliest hit in the cluster. The 5-fold event (left panel) spans only 3.6 µs.</w:t>
+        <w:t>Figure 13. Timestamp ladder for the top three high-multiplicity clusters at the 1 ms window. Each vertical bar represents a single detector hit; the horizontal axis shows the time offset in microseconds from the earliest hit in the cluster. The 5-fold event (left panel) spans only 3.6 µs.</w:t>
       </w:r>
     </w:p>
     <w:p>
@@ -7165,51 +4705,7 @@
           <w:sz w:val="18"/>
           <w:szCs w:val="18"/>
         </w:rPr>
-        <w:t xml:space="preserve">Figure 14. Significance vs. window size from the chat-session final analysis (after sync veto and with piecewise calibration). The 3-fold excess peaks near 4.6σ at the 1 </w:t>
-      </w:r>
-      <w:proofErr w:type="spellStart"/>
-      <w:r>
-        <w:rPr>
-          <w:i/>
-          <w:iCs/>
-          <w:color w:val="555555"/>
-          <w:sz w:val="18"/>
-          <w:szCs w:val="18"/>
-        </w:rPr>
-        <w:t>ms</w:t>
-      </w:r>
-      <w:proofErr w:type="spellEnd"/>
-      <w:r>
-        <w:rPr>
-          <w:i/>
-          <w:iCs/>
-          <w:color w:val="555555"/>
-          <w:sz w:val="18"/>
-          <w:szCs w:val="18"/>
-        </w:rPr>
-        <w:t xml:space="preserve"> window, consistent with the </w:t>
-      </w:r>
-      <w:proofErr w:type="spellStart"/>
-      <w:r>
-        <w:rPr>
-          <w:i/>
-          <w:iCs/>
-          <w:color w:val="555555"/>
-          <w:sz w:val="18"/>
-          <w:szCs w:val="18"/>
-        </w:rPr>
-        <w:t>Cowork</w:t>
-      </w:r>
-      <w:proofErr w:type="spellEnd"/>
-      <w:r>
-        <w:rPr>
-          <w:i/>
-          <w:iCs/>
-          <w:color w:val="555555"/>
-          <w:sz w:val="18"/>
-          <w:szCs w:val="18"/>
-        </w:rPr>
-        <w:t xml:space="preserve"> reproduction.</w:t>
+        <w:t>Figure 14. Significance vs. window size from the chat-session final analysis (after sync veto and with piecewise calibration). The 3-fold excess peaks near 4.6σ at the 1 ms window, consistent with the Cowork reproduction.</w:t>
       </w:r>
     </w:p>
     <w:p>
@@ -7217,23 +4713,7 @@
         <w:spacing w:after="160"/>
       </w:pPr>
       <w:r>
-        <w:t xml:space="preserve">The significance panel confirms that the 5-fold event and the 3-fold excess are most significant at tight windows, exactly as expected for a genuine </w:t>
-      </w:r>
-      <w:proofErr w:type="spellStart"/>
-      <w:r>
-        <w:t>localised</w:t>
-      </w:r>
-      <w:proofErr w:type="spellEnd"/>
-      <w:r>
-        <w:t xml:space="preserve"> signal. At the 5 </w:t>
-      </w:r>
-      <w:proofErr w:type="spellStart"/>
-      <w:r>
-        <w:t>ms</w:t>
-      </w:r>
-      <w:proofErr w:type="spellEnd"/>
-      <w:r>
-        <w:t xml:space="preserve"> and larger windows, accidentals dominate and the significance falls, reinforcing the interpretation that these are real time-coincident events rather than statistical fluctuations in a large background.</w:t>
+        <w:t>The significance panel confirms that the 5-fold event and the 3-fold excess are most significant at tight windows, exactly as expected for a genuine localised signal. At the 5 ms and larger windows, accidentals dominate and the significance falls, reinforcing the interpretation that these are real time-coincident events rather than statistical fluctuations in a large background.</w:t>
       </w:r>
     </w:p>
     <w:p>
@@ -7249,15 +4729,7 @@
         <w:spacing w:after="160"/>
       </w:pPr>
       <w:r>
-        <w:t xml:space="preserve">Coincidences are identified by a greedy, earliest-first sliding-window algorithm that prevents any single pulse from contributing to more than one cluster. For each unused event (sorted by calibrated time </w:t>
-      </w:r>
-      <w:proofErr w:type="spellStart"/>
-      <w:r>
-        <w:t>t_corr</w:t>
-      </w:r>
-      <w:proofErr w:type="spellEnd"/>
-      <w:r>
-        <w:t>), a window of width 2τ is opened. All unused events within the window are examined; at most one event per Nano is admitted (the earliest occurrence), preventing a single detector from contributing multiple hits to one cluster. If the resulting cluster has multiplicity ≥ 2, all member events are marked as used and the cluster is recorded.</w:t>
+        <w:t>Coincidences are identified by a greedy, earliest-first sliding-window algorithm that prevents any single pulse from contributing to more than one cluster. For each unused event (sorted by calibrated time t_corr), a window of width 2τ is opened. All unused events within the window are examined; at most one event per Nano is admitted (the earliest occurrence), preventing a single detector from contributing multiple hits to one cluster. If the resulting cluster has multiplicity ≥ 2, all member events are marked as used and the cluster is recorded.</w:t>
       </w:r>
     </w:p>
     <w:p>
@@ -7281,15 +4753,7 @@
         <w:spacing w:after="160"/>
       </w:pPr>
       <w:r>
-        <w:t xml:space="preserve">The key results of this analysis are </w:t>
-      </w:r>
-      <w:proofErr w:type="spellStart"/>
-      <w:r>
-        <w:t>summarised</w:t>
-      </w:r>
-      <w:proofErr w:type="spellEnd"/>
-      <w:r>
-        <w:t xml:space="preserve"> below.</w:t>
+        <w:t>The key results of this analysis are summarised below.</w:t>
       </w:r>
     </w:p>
     <w:p>
@@ -7309,20 +4773,7 @@
         <w:t xml:space="preserve">Jitter in the master–Nano comparison has two main sources: </w:t>
       </w:r>
       <w:r>
-        <w:t xml:space="preserve">(a) the master's recorded sync time precedes the actual rising edge by a few microseconds of function-call overhead; and (b) the PT-priority logic in the Nano's </w:t>
-      </w:r>
-      <w:proofErr w:type="spellStart"/>
-      <w:proofErr w:type="gramStart"/>
-      <w:r>
-        <w:t>sendData</w:t>
-      </w:r>
-      <w:proofErr w:type="spellEnd"/>
-      <w:r>
-        <w:t>(</w:t>
-      </w:r>
-      <w:proofErr w:type="gramEnd"/>
-      <w:r>
-        <w:t>) function can delay ST delivery by one full polling cycle, creating discrete jumps in index-based pairings that appear as large artefact spikes in the timing residuals.</w:t>
+        <w:t>(a) the master's recorded sync time precedes the actual rising edge by a few microseconds of function-call overhead; and (b) the PT-priority logic in the Nano's sendData() function can delay ST delivery by one full polling cycle, creating discrete jumps in index-based pairings that appear as large artefact spikes in the timing residuals.</w:t>
       </w:r>
     </w:p>
     <w:p>
@@ -7342,25 +4793,7 @@
         <w:t xml:space="preserve">Nano-to-Nano calibration eliminates the master entirely: </w:t>
       </w:r>
       <w:r>
-        <w:t>because all Nanos see the same physical sync edge, the difference ST[</w:t>
-      </w:r>
-      <w:proofErr w:type="spellStart"/>
-      <w:proofErr w:type="gramStart"/>
-      <w:r>
-        <w:t>k,i</w:t>
-      </w:r>
-      <w:proofErr w:type="spellEnd"/>
-      <w:proofErr w:type="gramEnd"/>
-      <w:r>
-        <w:t xml:space="preserve">] − ST[k,1] gives the true clock offset with uncertainty limited only to ISR + </w:t>
-      </w:r>
-      <w:proofErr w:type="spellStart"/>
-      <w:r>
-        <w:t>quantisation</w:t>
-      </w:r>
-      <w:proofErr w:type="spellEnd"/>
-      <w:r>
-        <w:t xml:space="preserve"> jitter (~4–8 µs), not the master's software timing chain.</w:t>
+        <w:t>because all Nanos see the same physical sync edge, the difference ST[k,i] − ST[k,1] gives the true clock offset with uncertainty limited only to ISR + quantisation jitter (~4–8 µs), not the master's software timing chain.</w:t>
       </w:r>
     </w:p>
     <w:p>
@@ -7380,7 +4813,7 @@
         <w:t xml:space="preserve">Piecewise interpolation outperforms global linear calibration: </w:t>
       </w:r>
       <w:r>
-        <w:t>by calibrating each 10-second sync interval independently, nonlinear thermal drift in the early portion of the run is correctly removed. The residual timing floor is σ ≈ 1 500–2 000 µs.</w:t>
+        <w:t>by calibrating each 10-second sync interval independently, nonlinear thermal drift in the early portion of the run is correctly removed. The RMS of the per-interval offset change is σ ≈ 1,500–2,000 µs across all intervals, but this is dominated by firmware timing artifacts affecting ~1.4% of intervals. Excluding those intervals, the true timing floor is ≈ 75 µs (combined RMS across all Nanos), making the 1 ms coincidence window well-justified.</w:t>
       </w:r>
     </w:p>
     <w:p>
@@ -7400,53 +4833,8 @@
         <w:lastRenderedPageBreak/>
         <w:t xml:space="preserve">The accidental-rate formula is derived from first principles: </w:t>
       </w:r>
-      <w:proofErr w:type="spellStart"/>
-      <w:r>
-        <w:t>for k</w:t>
-      </w:r>
-      <w:proofErr w:type="spellEnd"/>
-      <w:r>
-        <w:t xml:space="preserve"> independent Poisson detectors with rates </w:t>
-      </w:r>
-      <w:proofErr w:type="spellStart"/>
-      <w:r>
-        <w:t>r_i</w:t>
-      </w:r>
-      <w:proofErr w:type="spellEnd"/>
-      <w:r>
-        <w:t xml:space="preserve"> and window 2τ, </w:t>
-      </w:r>
-      <w:proofErr w:type="spellStart"/>
-      <w:r>
-        <w:t>E_k</w:t>
-      </w:r>
-      <w:proofErr w:type="spellEnd"/>
-      <w:r>
-        <w:t xml:space="preserve"> = </w:t>
-      </w:r>
-      <w:proofErr w:type="spellStart"/>
-      <w:r>
-        <w:t>T_eff</w:t>
-      </w:r>
-      <w:proofErr w:type="spellEnd"/>
-      <w:r>
-        <w:t xml:space="preserve"> (2</w:t>
-      </w:r>
-      <w:proofErr w:type="gramStart"/>
-      <w:r>
-        <w:t>τ)^</w:t>
-      </w:r>
-      <w:proofErr w:type="gramEnd"/>
-      <w:r>
-        <w:t xml:space="preserve">{k−1} Σ_{C(8,k)} Π </w:t>
-      </w:r>
-      <w:proofErr w:type="spellStart"/>
-      <w:r>
-        <w:t>r_i</w:t>
-      </w:r>
-      <w:proofErr w:type="spellEnd"/>
-      <w:r>
-        <w:t>, valid when r × 2τ ≪ 1.</w:t>
+      <w:r>
+        <w:t>for k independent Poisson detectors with rates r_i and window 2τ, E_k = T_eff (2τ)^{k−1} Σ_{C(8,k)} Π r_i, valid when r × 2τ ≪ 1.</w:t>
       </w:r>
     </w:p>
     <w:p>
@@ -7466,23 +4854,7 @@
         <w:t xml:space="preserve">Significance is a one-sided Poisson-to-Gaussian conversion: </w:t>
       </w:r>
       <w:r>
-        <w:t>σ = Φ⁻</w:t>
-      </w:r>
-      <w:proofErr w:type="gramStart"/>
-      <w:r>
-        <w:t>¹(</w:t>
-      </w:r>
-      <w:proofErr w:type="gramEnd"/>
-      <w:r>
-        <w:t xml:space="preserve">1 − p) where p = P(X ≥ O | Poisson(E)). At the 1 </w:t>
-      </w:r>
-      <w:proofErr w:type="spellStart"/>
-      <w:r>
-        <w:t>ms</w:t>
-      </w:r>
-      <w:proofErr w:type="spellEnd"/>
-      <w:r>
-        <w:t xml:space="preserve"> window, 2-fold (+4.8σ), 3-fold (+4.1σ), and 5-fold (+4.5σ) excesses all exceed 4σ. The 5-fold event at 49.97 min — spanning only 3.6 µs across five detectors — is the primary shower candidate and is extremely unlikely to be an accidental coincidence.</w:t>
+        <w:t>σ = Φ⁻¹(1 − p) where p = P(X ≥ O | Poisson(E)). At the 1 ms window, 2-fold (+4.8σ), 3-fold (+4.1σ), and 5-fold (+4.5σ) excesses all exceed 4σ. The 5-fold event at 49.97 min — spanning only 3.6 µs across five detectors — is the primary shower candidate and is extremely unlikely to be an accidental coincidence.</w:t>
       </w:r>
     </w:p>
     <w:p>
@@ -7661,41 +5033,13 @@
             </w:tcMar>
           </w:tcPr>
           <w:p>
-            <w:proofErr w:type="spellStart"/>
             <w:r>
               <w:rPr>
                 <w:rFonts w:ascii="Courier New" w:eastAsia="Courier New" w:hAnsi="Courier New" w:cs="Courier New"/>
                 <w:sz w:val="20"/>
                 <w:szCs w:val="20"/>
               </w:rPr>
-              <w:t>build_sync_</w:t>
-            </w:r>
-            <w:proofErr w:type="gramStart"/>
-            <w:r>
-              <w:rPr>
-                <w:rFonts w:ascii="Courier New" w:eastAsia="Courier New" w:hAnsi="Courier New" w:cs="Courier New"/>
-                <w:sz w:val="20"/>
-                <w:szCs w:val="20"/>
-              </w:rPr>
-              <w:t>table</w:t>
-            </w:r>
-            <w:proofErr w:type="spellEnd"/>
-            <w:r>
-              <w:rPr>
-                <w:rFonts w:ascii="Courier New" w:eastAsia="Courier New" w:hAnsi="Courier New" w:cs="Courier New"/>
-                <w:sz w:val="20"/>
-                <w:szCs w:val="20"/>
-              </w:rPr>
-              <w:t>(</w:t>
-            </w:r>
-            <w:proofErr w:type="gramEnd"/>
-            <w:r>
-              <w:rPr>
-                <w:rFonts w:ascii="Courier New" w:eastAsia="Courier New" w:hAnsi="Courier New" w:cs="Courier New"/>
-                <w:sz w:val="20"/>
-                <w:szCs w:val="20"/>
-              </w:rPr>
-              <w:t>)</w:t>
+              <w:t>build_sync_table()</w:t>
             </w:r>
           </w:p>
         </w:tc>
@@ -7779,41 +5123,13 @@
             </w:tcMar>
           </w:tcPr>
           <w:p>
-            <w:proofErr w:type="spellStart"/>
             <w:r>
               <w:rPr>
                 <w:rFonts w:ascii="Courier New" w:eastAsia="Courier New" w:hAnsi="Courier New" w:cs="Courier New"/>
                 <w:sz w:val="20"/>
                 <w:szCs w:val="20"/>
               </w:rPr>
-              <w:t>build_offset_</w:t>
-            </w:r>
-            <w:proofErr w:type="gramStart"/>
-            <w:r>
-              <w:rPr>
-                <w:rFonts w:ascii="Courier New" w:eastAsia="Courier New" w:hAnsi="Courier New" w:cs="Courier New"/>
-                <w:sz w:val="20"/>
-                <w:szCs w:val="20"/>
-              </w:rPr>
-              <w:t>table</w:t>
-            </w:r>
-            <w:proofErr w:type="spellEnd"/>
-            <w:r>
-              <w:rPr>
-                <w:rFonts w:ascii="Courier New" w:eastAsia="Courier New" w:hAnsi="Courier New" w:cs="Courier New"/>
-                <w:sz w:val="20"/>
-                <w:szCs w:val="20"/>
-              </w:rPr>
-              <w:t>(</w:t>
-            </w:r>
-            <w:proofErr w:type="gramEnd"/>
-            <w:r>
-              <w:rPr>
-                <w:rFonts w:ascii="Courier New" w:eastAsia="Courier New" w:hAnsi="Courier New" w:cs="Courier New"/>
-                <w:sz w:val="20"/>
-                <w:szCs w:val="20"/>
-              </w:rPr>
-              <w:t>)</w:t>
+              <w:t>build_offset_table()</w:t>
             </w:r>
           </w:p>
         </w:tc>
@@ -7840,41 +5156,7 @@
                 <w:sz w:val="20"/>
                 <w:szCs w:val="20"/>
               </w:rPr>
-              <w:t>Compute Δ[</w:t>
-            </w:r>
-            <w:proofErr w:type="spellStart"/>
-            <w:proofErr w:type="gramStart"/>
-            <w:r>
-              <w:rPr>
-                <w:sz w:val="20"/>
-                <w:szCs w:val="20"/>
-              </w:rPr>
-              <w:t>k,i</w:t>
-            </w:r>
-            <w:proofErr w:type="spellEnd"/>
-            <w:proofErr w:type="gramEnd"/>
-            <w:r>
-              <w:rPr>
-                <w:sz w:val="20"/>
-                <w:szCs w:val="20"/>
-              </w:rPr>
-              <w:t>] = ST[</w:t>
-            </w:r>
-            <w:proofErr w:type="spellStart"/>
-            <w:r>
-              <w:rPr>
-                <w:sz w:val="20"/>
-                <w:szCs w:val="20"/>
-              </w:rPr>
-              <w:t>k,i</w:t>
-            </w:r>
-            <w:proofErr w:type="spellEnd"/>
-            <w:r>
-              <w:rPr>
-                <w:sz w:val="20"/>
-                <w:szCs w:val="20"/>
-              </w:rPr>
-              <w:t>] − ST[k,0]</w:t>
+              <w:t>Compute Δ[k,i] = ST[k,i] − ST[k,0]</w:t>
             </w:r>
           </w:p>
         </w:tc>
@@ -7931,41 +5213,13 @@
             </w:tcMar>
           </w:tcPr>
           <w:p>
-            <w:proofErr w:type="spellStart"/>
             <w:r>
               <w:rPr>
                 <w:rFonts w:ascii="Courier New" w:eastAsia="Courier New" w:hAnsi="Courier New" w:cs="Courier New"/>
                 <w:sz w:val="20"/>
                 <w:szCs w:val="20"/>
               </w:rPr>
-              <w:t>calibrate_</w:t>
-            </w:r>
-            <w:proofErr w:type="gramStart"/>
-            <w:r>
-              <w:rPr>
-                <w:rFonts w:ascii="Courier New" w:eastAsia="Courier New" w:hAnsi="Courier New" w:cs="Courier New"/>
-                <w:sz w:val="20"/>
-                <w:szCs w:val="20"/>
-              </w:rPr>
-              <w:t>timestamp</w:t>
-            </w:r>
-            <w:proofErr w:type="spellEnd"/>
-            <w:r>
-              <w:rPr>
-                <w:rFonts w:ascii="Courier New" w:eastAsia="Courier New" w:hAnsi="Courier New" w:cs="Courier New"/>
-                <w:sz w:val="20"/>
-                <w:szCs w:val="20"/>
-              </w:rPr>
-              <w:t>(</w:t>
-            </w:r>
-            <w:proofErr w:type="gramEnd"/>
-            <w:r>
-              <w:rPr>
-                <w:rFonts w:ascii="Courier New" w:eastAsia="Courier New" w:hAnsi="Courier New" w:cs="Courier New"/>
-                <w:sz w:val="20"/>
-                <w:szCs w:val="20"/>
-              </w:rPr>
-              <w:t>)</w:t>
+              <w:t>calibrate_timestamp()</w:t>
             </w:r>
           </w:p>
         </w:tc>
@@ -8014,21 +5268,12 @@
             </w:tcMar>
           </w:tcPr>
           <w:p>
-            <w:proofErr w:type="spellStart"/>
-            <w:r>
-              <w:rPr>
-                <w:sz w:val="20"/>
-                <w:szCs w:val="20"/>
-              </w:rPr>
-              <w:t>Eqs</w:t>
-            </w:r>
-            <w:proofErr w:type="spellEnd"/>
-            <w:r>
-              <w:rPr>
-                <w:sz w:val="20"/>
-                <w:szCs w:val="20"/>
-              </w:rPr>
-              <w:t>. (4.2) – (4.4)</w:t>
+            <w:r>
+              <w:rPr>
+                <w:sz w:val="20"/>
+                <w:szCs w:val="20"/>
+              </w:rPr>
+              <w:t>Eqs. (4.2) – (4.4)</w:t>
             </w:r>
           </w:p>
         </w:tc>
@@ -8058,41 +5303,13 @@
             </w:tcMar>
           </w:tcPr>
           <w:p>
-            <w:proofErr w:type="spellStart"/>
             <w:r>
               <w:rPr>
                 <w:rFonts w:ascii="Courier New" w:eastAsia="Courier New" w:hAnsi="Courier New" w:cs="Courier New"/>
                 <w:sz w:val="20"/>
                 <w:szCs w:val="20"/>
               </w:rPr>
-              <w:t>apply_sync_</w:t>
-            </w:r>
-            <w:proofErr w:type="gramStart"/>
-            <w:r>
-              <w:rPr>
-                <w:rFonts w:ascii="Courier New" w:eastAsia="Courier New" w:hAnsi="Courier New" w:cs="Courier New"/>
-                <w:sz w:val="20"/>
-                <w:szCs w:val="20"/>
-              </w:rPr>
-              <w:t>veto</w:t>
-            </w:r>
-            <w:proofErr w:type="spellEnd"/>
-            <w:r>
-              <w:rPr>
-                <w:rFonts w:ascii="Courier New" w:eastAsia="Courier New" w:hAnsi="Courier New" w:cs="Courier New"/>
-                <w:sz w:val="20"/>
-                <w:szCs w:val="20"/>
-              </w:rPr>
-              <w:t>(</w:t>
-            </w:r>
-            <w:proofErr w:type="gramEnd"/>
-            <w:r>
-              <w:rPr>
-                <w:rFonts w:ascii="Courier New" w:eastAsia="Courier New" w:hAnsi="Courier New" w:cs="Courier New"/>
-                <w:sz w:val="20"/>
-                <w:szCs w:val="20"/>
-              </w:rPr>
-              <w:t>)</w:t>
+              <w:t>apply_sync_veto()</w:t>
             </w:r>
           </w:p>
         </w:tc>
@@ -8176,41 +5393,13 @@
             </w:tcMar>
           </w:tcPr>
           <w:p>
-            <w:proofErr w:type="spellStart"/>
             <w:r>
               <w:rPr>
                 <w:rFonts w:ascii="Courier New" w:eastAsia="Courier New" w:hAnsi="Courier New" w:cs="Courier New"/>
                 <w:sz w:val="20"/>
                 <w:szCs w:val="20"/>
               </w:rPr>
-              <w:t>find_</w:t>
-            </w:r>
-            <w:proofErr w:type="gramStart"/>
-            <w:r>
-              <w:rPr>
-                <w:rFonts w:ascii="Courier New" w:eastAsia="Courier New" w:hAnsi="Courier New" w:cs="Courier New"/>
-                <w:sz w:val="20"/>
-                <w:szCs w:val="20"/>
-              </w:rPr>
-              <w:t>coincidences</w:t>
-            </w:r>
-            <w:proofErr w:type="spellEnd"/>
-            <w:r>
-              <w:rPr>
-                <w:rFonts w:ascii="Courier New" w:eastAsia="Courier New" w:hAnsi="Courier New" w:cs="Courier New"/>
-                <w:sz w:val="20"/>
-                <w:szCs w:val="20"/>
-              </w:rPr>
-              <w:t>(</w:t>
-            </w:r>
-            <w:proofErr w:type="gramEnd"/>
-            <w:r>
-              <w:rPr>
-                <w:rFonts w:ascii="Courier New" w:eastAsia="Courier New" w:hAnsi="Courier New" w:cs="Courier New"/>
-                <w:sz w:val="20"/>
-                <w:szCs w:val="20"/>
-              </w:rPr>
-              <w:t>)</w:t>
+              <w:t>find_coincidences()</w:t>
             </w:r>
           </w:p>
         </w:tc>
@@ -8294,41 +5483,13 @@
             </w:tcMar>
           </w:tcPr>
           <w:p>
-            <w:proofErr w:type="spellStart"/>
             <w:r>
               <w:rPr>
                 <w:rFonts w:ascii="Courier New" w:eastAsia="Courier New" w:hAnsi="Courier New" w:cs="Courier New"/>
                 <w:sz w:val="20"/>
                 <w:szCs w:val="20"/>
               </w:rPr>
-              <w:t>expected_</w:t>
-            </w:r>
-            <w:proofErr w:type="gramStart"/>
-            <w:r>
-              <w:rPr>
-                <w:rFonts w:ascii="Courier New" w:eastAsia="Courier New" w:hAnsi="Courier New" w:cs="Courier New"/>
-                <w:sz w:val="20"/>
-                <w:szCs w:val="20"/>
-              </w:rPr>
-              <w:t>accidentals</w:t>
-            </w:r>
-            <w:proofErr w:type="spellEnd"/>
-            <w:r>
-              <w:rPr>
-                <w:rFonts w:ascii="Courier New" w:eastAsia="Courier New" w:hAnsi="Courier New" w:cs="Courier New"/>
-                <w:sz w:val="20"/>
-                <w:szCs w:val="20"/>
-              </w:rPr>
-              <w:t>(</w:t>
-            </w:r>
-            <w:proofErr w:type="gramEnd"/>
-            <w:r>
-              <w:rPr>
-                <w:rFonts w:ascii="Courier New" w:eastAsia="Courier New" w:hAnsi="Courier New" w:cs="Courier New"/>
-                <w:sz w:val="20"/>
-                <w:szCs w:val="20"/>
-              </w:rPr>
-              <w:t>)</w:t>
+              <w:t>expected_accidentals()</w:t>
             </w:r>
           </w:p>
         </w:tc>
@@ -8355,23 +5516,7 @@
                 <w:sz w:val="20"/>
                 <w:szCs w:val="20"/>
               </w:rPr>
-              <w:t>Sum over all C(</w:t>
-            </w:r>
-            <w:proofErr w:type="gramStart"/>
-            <w:r>
-              <w:rPr>
-                <w:sz w:val="20"/>
-                <w:szCs w:val="20"/>
-              </w:rPr>
-              <w:t>8,k</w:t>
-            </w:r>
-            <w:proofErr w:type="gramEnd"/>
-            <w:r>
-              <w:rPr>
-                <w:sz w:val="20"/>
-                <w:szCs w:val="20"/>
-              </w:rPr>
-              <w:t>) subsets</w:t>
+              <w:t>Sum over all C(8,k) subsets</w:t>
             </w:r>
           </w:p>
         </w:tc>
@@ -8428,23 +5573,13 @@
             </w:tcMar>
           </w:tcPr>
           <w:p>
-            <w:proofErr w:type="gramStart"/>
             <w:r>
               <w:rPr>
                 <w:rFonts w:ascii="Courier New" w:eastAsia="Courier New" w:hAnsi="Courier New" w:cs="Courier New"/>
                 <w:sz w:val="20"/>
                 <w:szCs w:val="20"/>
               </w:rPr>
-              <w:t>significance(</w:t>
-            </w:r>
-            <w:proofErr w:type="gramEnd"/>
-            <w:r>
-              <w:rPr>
-                <w:rFonts w:ascii="Courier New" w:eastAsia="Courier New" w:hAnsi="Courier New" w:cs="Courier New"/>
-                <w:sz w:val="20"/>
-                <w:szCs w:val="20"/>
-              </w:rPr>
-              <w:t>)</w:t>
+              <w:t>significance()</w:t>
             </w:r>
           </w:p>
         </w:tc>
@@ -8493,21 +5628,12 @@
             </w:tcMar>
           </w:tcPr>
           <w:p>
-            <w:proofErr w:type="spellStart"/>
-            <w:r>
-              <w:rPr>
-                <w:sz w:val="20"/>
-                <w:szCs w:val="20"/>
-              </w:rPr>
-              <w:t>Eqs</w:t>
-            </w:r>
-            <w:proofErr w:type="spellEnd"/>
-            <w:r>
-              <w:rPr>
-                <w:sz w:val="20"/>
-                <w:szCs w:val="20"/>
-              </w:rPr>
-              <w:t>. (7.1) – (7.3)</w:t>
+            <w:r>
+              <w:rPr>
+                <w:sz w:val="20"/>
+                <w:szCs w:val="20"/>
+              </w:rPr>
+              <w:t>Eqs. (7.1) – (7.3)</w:t>
             </w:r>
           </w:p>
         </w:tc>

</xml_diff>